<commit_message>
chore: add .gitignore and commit current changes
</commit_message>
<xml_diff>
--- a/templates/MD_Feedback.docx
+++ b/templates/MD_Feedback.docx
@@ -160,7 +160,6 @@
             <w15:appearance w15:val="hidden"/>
             <w:text/>
           </w:sdtPr>
-          <w:sdtEndPr/>
           <w:sdtContent>
             <w:tc>
               <w:tcPr>
@@ -247,7 +246,6 @@
             <w:showingPlcHdr/>
             <w15:appearance w15:val="hidden"/>
           </w:sdtPr>
-          <w:sdtEndPr/>
           <w:sdtContent>
             <w:tc>
               <w:tcPr>
@@ -334,7 +332,6 @@
             <w15:appearance w15:val="hidden"/>
             <w:text/>
           </w:sdtPr>
-          <w:sdtEndPr/>
           <w:sdtContent>
             <w:tc>
               <w:tcPr>
@@ -458,7 +455,6 @@
                   <w:calendar w:val="gregorian"/>
                 </w:date>
               </w:sdtPr>
-              <w:sdtEndPr/>
               <w:sdtContent>
                 <w:r>
                   <w:rPr>
@@ -667,7 +663,6 @@
               <w:showingPlcHdr/>
               <w15:appearance w15:val="hidden"/>
             </w:sdtPr>
-            <w:sdtEndPr/>
             <w:sdtContent>
               <w:p>
                 <w:pPr>
@@ -1167,7 +1162,6 @@
               <w15:color w:val="FF0000"/>
               <w15:appearance w15:val="hidden"/>
             </w:sdtPr>
-            <w:sdtEndPr/>
             <w:sdtContent>
               <w:p>
                 <w:pPr>
@@ -1309,7 +1303,6 @@
                 <w:showingPlcHdr/>
                 <w15:appearance w15:val="hidden"/>
               </w:sdtPr>
-              <w:sdtEndPr/>
               <w:sdtContent>
                 <w:r>
                   <w:rPr>
@@ -1495,7 +1488,6 @@
                 <w:showingPlcHdr/>
                 <w15:appearance w15:val="hidden"/>
               </w:sdtPr>
-              <w:sdtEndPr/>
               <w:sdtContent>
                 <w:r>
                   <w:rPr>
@@ -1667,23 +1659,7 @@
                 <w:color w:val="003B5E" w:themeColor="accent1" w:themeShade="80"/>
                 <w:szCs w:val="18"/>
               </w:rPr>
-              <w:t xml:space="preserve"> «Wir kennen uns aus und wissen </w:t>
-            </w:r>
-            <w:proofErr w:type="spellStart"/>
-            <w:r>
-              <w:rPr>
-                <w:color w:val="003B5E" w:themeColor="accent1" w:themeShade="80"/>
-                <w:szCs w:val="18"/>
-              </w:rPr>
-              <w:t>wie</w:t>
-            </w:r>
-            <w:proofErr w:type="spellEnd"/>
-            <w:r>
-              <w:rPr>
-                <w:color w:val="003B5E" w:themeColor="accent1" w:themeShade="80"/>
-                <w:szCs w:val="18"/>
-              </w:rPr>
-              <w:t>.»</w:t>
+              <w:t xml:space="preserve"> «Wir kennen uns aus und wissen wie.»</w:t>
             </w:r>
           </w:p>
         </w:tc>
@@ -1861,7 +1837,6 @@
                 <w:showingPlcHdr/>
                 <w15:appearance w15:val="hidden"/>
               </w:sdtPr>
-              <w:sdtEndPr/>
               <w:sdtContent>
                 <w:r>
                   <w:rPr>
@@ -2055,7 +2030,6 @@
                 <w:showingPlcHdr/>
                 <w15:appearance w15:val="hidden"/>
               </w:sdtPr>
-              <w:sdtEndPr/>
               <w:sdtContent>
                 <w:r>
                   <w:rPr>
@@ -2183,7 +2157,6 @@
                 <w:showingPlcHdr/>
                 <w15:appearance w15:val="hidden"/>
               </w:sdtPr>
-              <w:sdtEndPr/>
               <w:sdtContent>
                 <w:r>
                   <w:rPr>
@@ -3370,7 +3343,6 @@
               <w:showingPlcHdr/>
               <w15:appearance w15:val="hidden"/>
             </w:sdtPr>
-            <w:sdtEndPr/>
             <w:sdtContent>
               <w:p>
                 <w:pPr>
@@ -3571,7 +3543,6 @@
               <w:showingPlcHdr/>
               <w15:appearance w15:val="hidden"/>
             </w:sdtPr>
-            <w:sdtEndPr/>
             <w:sdtContent>
               <w:p>
                 <w:pPr>
@@ -3720,7 +3691,6 @@
               <w:showingPlcHdr/>
               <w15:appearance w15:val="hidden"/>
             </w:sdtPr>
-            <w:sdtEndPr/>
             <w:sdtContent>
               <w:p>
                 <w:pPr>
@@ -3851,7 +3821,6 @@
               <w:showingPlcHdr/>
               <w15:appearance w15:val="hidden"/>
             </w:sdtPr>
-            <w:sdtEndPr/>
             <w:sdtContent>
               <w:p>
                 <w:pPr>
@@ -4200,7 +4169,6 @@
               <w:showingPlcHdr/>
               <w15:appearance w15:val="hidden"/>
             </w:sdtPr>
-            <w:sdtEndPr/>
             <w:sdtContent>
               <w:p>
                 <w:pPr>
@@ -4331,7 +4299,6 @@
               <w:showingPlcHdr/>
               <w15:appearance w15:val="hidden"/>
             </w:sdtPr>
-            <w:sdtEndPr/>
             <w:sdtContent>
               <w:p>
                 <w:pPr>
@@ -4514,7 +4481,6 @@
               <w:showingPlcHdr/>
               <w15:appearance w15:val="hidden"/>
             </w:sdtPr>
-            <w:sdtEndPr/>
             <w:sdtContent>
               <w:p>
                 <w:pPr>
@@ -4658,7 +4624,6 @@
               <w:showingPlcHdr/>
               <w15:appearance w15:val="hidden"/>
             </w:sdtPr>
-            <w:sdtEndPr/>
             <w:sdtContent>
               <w:p>
                 <w:pPr>
@@ -4786,7 +4751,6 @@
               <w:showingPlcHdr/>
               <w15:appearance w15:val="hidden"/>
             </w:sdtPr>
-            <w:sdtEndPr/>
             <w:sdtContent>
               <w:p>
                 <w:pPr>
@@ -4914,7 +4878,6 @@
               <w:showingPlcHdr/>
               <w15:appearance w15:val="hidden"/>
             </w:sdtPr>
-            <w:sdtEndPr/>
             <w:sdtContent>
               <w:p>
                 <w:pPr>
@@ -5398,11 +5361,6 @@
       <w:dataBinding w:xpath="//Text[@id='CustomElements.Footer.Line']" w:storeItemID="{00000000-0000-0000-0000-000000000000}"/>
       <w:text w:multiLine="1"/>
     </w:sdtPr>
-    <w:sdtEndPr>
-      <w:rPr>
-        <w:rStyle w:val="FuzeileZchn"/>
-      </w:rPr>
-    </w:sdtEndPr>
     <w:sdtContent>
       <w:p>
         <w:pPr>
@@ -5946,7 +5904,7 @@
                                   <pic:cNvPicPr/>
                                 </pic:nvPicPr>
                                 <pic:blipFill>
-                                  <a:blip r:embed="rId1"/>
+                                  <a:blip r:embed="rId2"/>
                                   <a:stretch>
                                     <a:fillRect/>
                                   </a:stretch>
@@ -6221,7 +6179,6 @@
                                 <w:dataBinding w:xpath="//Text[@id='CustomElements.Header.Script1']" w:storeItemID="{00000000-0000-0000-0000-000000000000}"/>
                                 <w:text w:multiLine="1"/>
                               </w:sdtPr>
-                              <w:sdtEndPr/>
                               <w:sdtContent>
                                 <w:tc>
                                   <w:tcPr>
@@ -6257,7 +6214,6 @@
                                 <w:dataBinding w:xpath="//Text[@id='CustomElements.Header.Script2']" w:storeItemID="{00000000-0000-0000-0000-000000000000}"/>
                                 <w:text w:multiLine="1"/>
                               </w:sdtPr>
-                              <w:sdtEndPr/>
                               <w:sdtContent>
                                 <w:tc>
                                   <w:tcPr>
@@ -6390,7 +6346,6 @@
                           <w:dataBinding w:xpath="//Text[@id='CustomElements.Header.Script1']" w:storeItemID="{00000000-0000-0000-0000-000000000000}"/>
                           <w:text w:multiLine="1"/>
                         </w:sdtPr>
-                        <w:sdtEndPr/>
                         <w:sdtContent>
                           <w:tc>
                             <w:tcPr>
@@ -6426,7 +6381,6 @@
                           <w:dataBinding w:xpath="//Text[@id='CustomElements.Header.Script2']" w:storeItemID="{00000000-0000-0000-0000-000000000000}"/>
                           <w:text w:multiLine="1"/>
                         </w:sdtPr>
-                        <w:sdtEndPr/>
                         <w:sdtContent>
                           <w:tc>
                             <w:tcPr>
@@ -6791,7 +6745,6 @@
                                   <w:calendar w:val="gregorian"/>
                                 </w:date>
                               </w:sdtPr>
-                              <w:sdtEndPr/>
                               <w:sdtContent>
                                 <w:tc>
                                   <w:tcPr>
@@ -6895,7 +6848,6 @@
                             <w:calendar w:val="gregorian"/>
                           </w:date>
                         </w:sdtPr>
-                        <w:sdtEndPr/>
                         <w:sdtContent>
                           <w:tc>
                             <w:tcPr>
@@ -7158,7 +7110,7 @@
                                   <pic:cNvPicPr/>
                                 </pic:nvPicPr>
                                 <pic:blipFill>
-                                  <a:blip r:embed="rId1"/>
+                                  <a:blip r:embed="rId2"/>
                                   <a:stretch>
                                     <a:fillRect/>
                                   </a:stretch>
@@ -14729,12 +14681,15 @@
   <w:rsids>
     <w:rsidRoot w:val="00722FB7"/>
     <w:rsid w:val="001931F3"/>
+    <w:rsid w:val="001A7F0F"/>
     <w:rsid w:val="00266B31"/>
     <w:rsid w:val="00274968"/>
     <w:rsid w:val="004F2D91"/>
     <w:rsid w:val="00722FB7"/>
     <w:rsid w:val="00782CB9"/>
+    <w:rsid w:val="00B0611C"/>
     <w:rsid w:val="00B64354"/>
+    <w:rsid w:val="00CA05F3"/>
     <w:rsid w:val="00DA75F3"/>
   </w:rsids>
   <m:mathPr>
@@ -15839,462 +15794,7 @@
 </FormTemplates>
 </file>
 
-<file path=customXml/item2.xml>��< ? x m l   v e r s i o n = " 1 . 0 "   e n c o d i n g = " u t f - 1 6 " ? > < O n e O f f i x x D o c u m e n t P a r t   x m l n s : x s d = " h t t p : / / w w w . w 3 . o r g / 2 0 0 1 / X M L S c h e m a "   x m l n s : x s i = " h t t p : / / w w w . w 3 . o r g / 2 0 0 1 / X M L S c h e m a - i n s t a n c e "   i d = " 8 8 7 e d 9 d 7 - 7 7 b 6 - 4 9 e f - 9 b f 1 - 8 5 4 e 6 a 4 a a 3 4 1 "   t I d = " 7 c d 7 f b 1 d - 6 0 8 5 - 4 8 a 8 - b 5 8 7 - f 9 3 7 7 9 4 4 d 4 1 e "   m t I d = " 2 7 5 a f 3 2 e - b c 4 0 - 4 5 c 2 - 8 5 b 7 - a f b 1 c 0 3 8 2 6 5 3 "   t n a m e = " N e u t r a l   A 4   h o c h "   r e v i s i o n = " 3 "   c r e a t e d m a j o r v e r s i o n = " 2 "   c r e a t e d m i n o r v e r s i o n = " 0 "   c r e a t e d = " 2 0 1 5 - 1 2 - 0 3 T 1 7 : 3 7 : 0 2 . 8 5 6 1 3 1 7 + 0 1 : 0 0 "   m o d i f i e d m a j o r v e r s i o n = " 2 "   m o d i f i e d m i n o r v e r s i o n = " 3 "   m o d i f i e d = " 2 0 1 7 - 0 2 - 0 1 T 1 8 : 4 9 : 5 3 . 7 0 9 9 7 6 8 + 0 1 : 0 0 "   p r o f i l e = " a 1 4 4 4 5 a b - 1 f 9 9 - 4 4 6 9 - 8 b 5 a - 1 d a 7 1 0 b 9 8 2 b 0 "   m o d e = " S a v e d D o c u m e n t "   c o l o r m o d e = " C o l o r "   l c i d = " 2 0 5 5 "   x m l n s = " h t t p : / / s c h e m a . o n e o f f i x x . c o m / O n e O f f i x x D o c u m e n t P a r t / 1 " > - 
-     < C o n t e n t > - 
-         < D a t a M o d e l   x m l n s = " h t t p : / / s c h e m a . o n e o f f i x x . c o m / O n e O f f i x x D o c u m e n t P a r t / 1 / F i n a l i z e d " > - 
-             < P r o f i l e   w i n d o w w i d t h = " 0 "   w i n d o w h e i g h t = " 0 "   m i n w i n d o w w i d t h = " 0 "   m a x w i n d o w w i d t h = " 0 "   m i n w i n d o w h e i g h t = " 0 "   m a x w i n d o w h e i g h t = " 0 " > - 
-                 < T e x t   i d = " P r o f i l e . I d "   r o w = " 0 "   c o l u m n = " 0 "   c o l u m n s p a n = " 0 "   m u l t i l i n e = " F a l s e "   m u l t i l i n e r o w s = " 3 "   l o c k e d = " F a l s e "   l a b e l = " P r o f i l e . I d "   r e a d o n l y = " F a l s e "   v i s i b l e = " T r u e "   r e q u i r e d = " F a l s e "   r e g e x = " "   v a l i d a t i o n m e s s a g e = " "   t o o l t i p = " "   t r a c k e d = " F a l s e " > < ! [ C D A T A [ a 1 4 4 4 5 a b - 1 f 9 9 - 4 4 6 9 - 8 b 5 a - 1 d a 7 1 0 b 9 8 2 b 0 ] ] > < / T e x t > - 
-                 < T e x t   i d = " P r o f i l e . O r g a n i z a t i o n U n i t I d "   r o w = " 0 "   c o l u m n = " 0 "   c o l u m n s p a n = " 0 "   m u l t i l i n e = " F a l s e "   m u l t i l i n e r o w s = " 3 "   l o c k e d = " F a l s e "   l a b e l = " P r o f i l e . O r g a n i z a t i o n U n i t I d "   r e a d o n l y = " F a l s e "   v i s i b l e = " T r u e "   r e q u i r e d = " F a l s e "   r e g e x = " "   v a l i d a t i o n m e s s a g e = " "   t o o l t i p = " "   t r a c k e d = " F a l s e " > < ! [ C D A T A [ 5 f 9 8 4 b 2 6 - 4 c e 2 - 4 6 f d - 8 4 a a - 1 f 7 d b 5 4 8 a f e 8 ] ] > < / T e x t > - 
-                 < T e x t   i d = " P r o f i l e . O r g . P o s t a l . C o u n t r y "   r o w = " 0 "   c o l u m n = " 0 "   c o l u m n s p a n = " 0 "   m u l t i l i n e = " F a l s e "   m u l t i l i n e r o w s = " 3 "   l o c k e d = " F a l s e "   l a b e l = " P r o f i l e . O r g . P o s t a l . C o u n t r y "   r e a d o n l y = " F a l s e "   v i s i b l e = " T r u e "   r e q u i r e d = " F a l s e "   r e g e x = " "   v a l i d a t i o n m e s s a g e = " "   t o o l t i p = " "   t r a c k e d = " F a l s e " > < ! [ C D A T A [ S c h w e i z ] ] > < / T e x t > - 
-                 < T e x t   i d = " P r o f i l e . O r g . P o s t a l . L Z i p "   r o w = " 0 "   c o l u m n = " 0 "   c o l u m n s p a n = " 0 "   m u l t i l i n e = " F a l s e "   m u l t i l i n e r o w s = " 3 "   l o c k e d = " F a l s e "   l a b e l = " P r o f i l e . O r g . P o s t a l . L Z i p "   r e a d o n l y = " F a l s e "   v i s i b l e = " T r u e "   r e q u i r e d = " F a l s e "   r e g e x = " "   v a l i d a t i o n m e s s a g e = " "   t o o l t i p = " "   t r a c k e d = " F a l s e " > < ! [ C D A T A [ C H ] ] > < / T e x t > - 
-                 < T e x t   i d = " P r o f i l e . O r g . T i t l e "   r o w = " 0 "   c o l u m n = " 0 "   c o l u m n s p a n = " 0 "   m u l t i l i n e = " F a l s e "   m u l t i l i n e r o w s = " 3 "   l o c k e d = " F a l s e "   l a b e l = " P r o f i l e . O r g . T i t l e "   r e a d o n l y = " F a l s e "   v i s i b l e = " T r u e "   r e q u i r e d = " F a l s e "   r e g e x = " "   v a l i d a t i o n m e s s a g e = " "   t o o l t i p = " "   t r a c k e d = " F a l s e " > < ! [ C D A T A [ K a n t o n   Z � r i c h ] ] > < / T e x t > - 
-                 < T e x t   i d = " P r o f i l e . U s e r . A l i a s "   r o w = " 0 "   c o l u m n = " 0 "   c o l u m n s p a n = " 0 "   m u l t i l i n e = " F a l s e "   m u l t i l i n e r o w s = " 3 "   l o c k e d = " F a l s e "   l a b e l = " P r o f i l e . U s e r . A l i a s "   r e a d o n l y = " F a l s e "   v i s i b l e = " T r u e "   r e q u i r e d = " F a l s e "   r e g e x = " "   v a l i d a t i o n m e s s a g e = " "   t o o l t i p = " "   t r a c k e d = " F a l s e " > < ! [ C D A T A [   ] ] > < / T e x t > - 
-                 < T e x t   i d = " P r o f i l e . U s e r . E m a i l "   r o w = " 0 "   c o l u m n = " 0 "   c o l u m n s p a n = " 0 "   m u l t i l i n e = " F a l s e "   m u l t i l i n e r o w s = " 3 "   l o c k e d = " F a l s e "   l a b e l = " P r o f i l e . U s e r . E m a i l "   r e a d o n l y = " F a l s e "   v i s i b l e = " T r u e "   r e q u i r e d = " F a l s e "   r e g e x = " "   v a l i d a t i o n m e s s a g e = " "   t o o l t i p = " "   t r a c k e d = " F a l s e " > < ! [ C D A T A [ a n d r e a . l u e b b e r s t e d t @ s a . z h . c h ] ] > < / T e x t > - 
-                 < T e x t   i d = " P r o f i l e . U s e r . F a x "   r o w = " 0 "   c o l u m n = " 0 "   c o l u m n s p a n = " 0 "   m u l t i l i n e = " F a l s e "   m u l t i l i n e r o w s = " 3 "   l o c k e d = " F a l s e "   l a b e l = " P r o f i l e . U s e r . F a x "   r e a d o n l y = " F a l s e "   v i s i b l e = " T r u e "   r e q u i r e d = " F a l s e "   r e g e x = " "   v a l i d a t i o n m e s s a g e = " "   t o o l t i p = " "   t r a c k e d = " F a l s e " > < ! [ C D A T A [ + 4 1   4 3   2 5 9   5 1   0 7 ] ] > < / T e x t > - 
-                 < T e x t   i d = " P r o f i l e . U s e r . F i r s t N a m e "   r o w = " 0 "   c o l u m n = " 0 "   c o l u m n s p a n = " 0 "   m u l t i l i n e = " F a l s e "   m u l t i l i n e r o w s = " 3 "   l o c k e d = " F a l s e "   l a b e l = " P r o f i l e . U s e r . F i r s t N a m e "   r e a d o n l y = " F a l s e "   v i s i b l e = " T r u e "   r e q u i r e d = " F a l s e "   r e g e x = " "   v a l i d a t i o n m e s s a g e = " "   t o o l t i p = " "   t r a c k e d = " F a l s e " > < ! [ C D A T A [ A n d r e a ] ] > < / T e x t > - 
-                 < T e x t   i d = " P r o f i l e . U s e r . F u n c t i o n "   r o w = " 0 "   c o l u m n = " 0 "   c o l u m n s p a n = " 0 "   m u l t i l i n e = " F a l s e "   m u l t i l i n e r o w s = " 3 "   l o c k e d = " F a l s e "   l a b e l = " P r o f i l e . U s e r . F u n c t i o n "   r e a d o n l y = " F a l s e "   v i s i b l e = " T r u e "   r e q u i r e d = " F a l s e "   r e g e x = " "   v a l i d a t i o n m e s s a g e = " "   t o o l t i p = " "   t r a c k e d = " F a l s e " > < ! [ C D A T A [ A m t s c h e f i n ] ] > < / T e x t > - 
-                 < T e x t   i d = " P r o f i l e . U s e r . J o b D e s c r i p t i o n "   r o w = " 0 "   c o l u m n = " 0 "   c o l u m n s p a n = " 0 "   m u l t i l i n e = " F a l s e "   m u l t i l i n e r o w s = " 3 "   l o c k e d = " F a l s e "   l a b e l = " P r o f i l e . U s e r . J o b D e s c r i p t i o n "   r e a d o n l y = " F a l s e "   v i s i b l e = " T r u e "   r e q u i r e d = " F a l s e "   r e g e x = " "   v a l i d a t i o n m e s s a g e = " "   t o o l t i p = " "   t r a c k e d = " F a l s e " > < ! [ C D A T A [   ] ] > < / T e x t > - 
-                 < T e x t   i d = " P r o f i l e . U s e r . L a s t N a m e "   r o w = " 0 "   c o l u m n = " 0 "   c o l u m n s p a n = " 0 "   m u l t i l i n e = " F a l s e "   m u l t i l i n e r o w s = " 3 "   l o c k e d = " F a l s e "   l a b e l = " P r o f i l e . U s e r . L a s t N a m e "   r e a d o n l y = " F a l s e "   v i s i b l e = " T r u e "   r e q u i r e d = " F a l s e "   r e g e x = " "   v a l i d a t i o n m e s s a g e = " "   t o o l t i p = " "   t r a c k e d = " F a l s e " > < ! [ C D A T A [ L � b b e r s t e d t ] ] > < / T e x t > - 
-                 < T e x t   i d = " P r o f i l e . U s e r . O u L e v 1 "   r o w = " 0 "   c o l u m n = " 0 "   c o l u m n s p a n = " 0 "   m u l t i l i n e = " F a l s e "   m u l t i l i n e r o w s = " 3 "   l o c k e d = " F a l s e "   l a b e l = " P r o f i l e . U s e r . O u L e v 1 "   r e a d o n l y = " F a l s e "   v i s i b l e = " T r u e "   r e q u i r e d = " F a l s e "   r e g e x = " "   v a l i d a t i o n m e s s a g e = " "   t o o l t i p = " "   t r a c k e d = " F a l s e " > < ! [ C D A T A [ K a n t o n   Z � r i c h ] ] > < / T e x t > - 
-                 < T e x t   i d = " P r o f i l e . U s e r . O u L e v 2 "   r o w = " 0 "   c o l u m n = " 0 "   c o l u m n s p a n = " 0 "   m u l t i l i n e = " F a l s e "   m u l t i l i n e r o w s = " 3 "   l o c k e d = " F a l s e "   l a b e l = " P r o f i l e . U s e r . O u L e v 2 "   r e a d o n l y = " F a l s e "   v i s i b l e = " T r u e "   r e q u i r e d = " F a l s e "   r e g e x = " "   v a l i d a t i o n m e s s a g e = " "   t o o l t i p = " "   t r a c k e d = " F a l s e " > < ! [ C D A T A [ S i c h e r h e i t s d i r e k t i o n ] ] > < / T e x t > - 
-                 < T e x t   i d = " P r o f i l e . U s e r . O u L e v 3 "   r o w = " 0 "   c o l u m n = " 0 "   c o l u m n s p a n = " 0 "   m u l t i l i n e = " F a l s e "   m u l t i l i n e r o w s = " 3 "   l o c k e d = " F a l s e "   l a b e l = " P r o f i l e . U s e r . O u L e v 3 "   r e a d o n l y = " F a l s e "   v i s i b l e = " T r u e "   r e q u i r e d = " F a l s e "   r e g e x = " "   v a l i d a t i o n m e s s a g e = " "   t o o l t i p = " "   t r a c k e d = " F a l s e " > < ! [ C D A T A [ K a n t o n a l e s   S o z i a l a m t ] ] > < / T e x t > - 
-                 < T e x t   i d = " P r o f i l e . U s e r . O u L e v 4 "   r o w = " 0 "   c o l u m n = " 0 "   c o l u m n s p a n = " 0 "   m u l t i l i n e = " F a l s e "   m u l t i l i n e r o w s = " 3 "   l o c k e d = " F a l s e "   l a b e l = " P r o f i l e . U s e r . O u L e v 4 "   r e a d o n l y = " F a l s e "   v i s i b l e = " T r u e "   r e q u i r e d = " F a l s e "   r e g e x = " "   v a l i d a t i o n m e s s a g e = " "   t o o l t i p = " "   t r a c k e d = " F a l s e " > < ! [ C D A T A [   ] ] > < / T e x t > - 
-                 < T e x t   i d = " P r o f i l e . U s e r . O u L e v 5 "   r o w = " 0 "   c o l u m n = " 0 "   c o l u m n s p a n = " 0 "   m u l t i l i n e = " F a l s e "   m u l t i l i n e r o w s = " 3 "   l o c k e d = " F a l s e "   l a b e l = " P r o f i l e . U s e r . O u L e v 5 "   r e a d o n l y = " F a l s e "   v i s i b l e = " T r u e "   r e q u i r e d = " F a l s e "   r e g e x = " "   v a l i d a t i o n m e s s a g e = " "   t o o l t i p = " "   t r a c k e d = " F a l s e " > < ! [ C D A T A [   ] ] > < / T e x t > - 
-                 < T e x t   i d = " P r o f i l e . U s e r . O u L e v 6 "   r o w = " 0 "   c o l u m n = " 0 "   c o l u m n s p a n = " 0 "   m u l t i l i n e = " F a l s e "   m u l t i l i n e r o w s = " 3 "   l o c k e d = " F a l s e "   l a b e l = " P r o f i l e . U s e r . O u L e v 6 "   r e a d o n l y = " F a l s e "   v i s i b l e = " T r u e "   r e q u i r e d = " F a l s e "   r e g e x = " "   v a l i d a t i o n m e s s a g e = " "   t o o l t i p = " "   t r a c k e d = " F a l s e " > < ! [ C D A T A [   ] ] > < / T e x t > - 
-                 < T e x t   i d = " P r o f i l e . U s e r . O u L e v 7 "   r o w = " 0 "   c o l u m n = " 0 "   c o l u m n s p a n = " 0 "   m u l t i l i n e = " F a l s e "   m u l t i l i n e r o w s = " 3 "   l o c k e d = " F a l s e "   l a b e l = " P r o f i l e . U s e r . O u L e v 7 "   r e a d o n l y = " F a l s e "   v i s i b l e = " T r u e "   r e q u i r e d = " F a l s e "   r e g e x = " "   v a l i d a t i o n m e s s a g e = " "   t o o l t i p = " "   t r a c k e d = " F a l s e " > < ! [ C D A T A [   ] ] > < / T e x t > - 
-                 < T e x t   i d = " P r o f i l e . U s e r . O u M a i l "   r o w = " 0 "   c o l u m n = " 0 "   c o l u m n s p a n = " 0 "   m u l t i l i n e = " F a l s e "   m u l t i l i n e r o w s = " 3 "   l o c k e d = " F a l s e "   l a b e l = " P r o f i l e . U s e r . O u M a i l "   r e a d o n l y = " F a l s e "   v i s i b l e = " T r u e "   r e q u i r e d = " F a l s e "   r e g e x = " "   v a l i d a t i o n m e s s a g e = " "   t o o l t i p = " "   t r a c k e d = " F a l s e " > < ! [ C D A T A [ i n f o @ s a . z h . c h ] ] > < / T e x t > - 
-                 < T e x t   i d = " P r o f i l e . U s e r . O u P h o n e "   r o w = " 0 "   c o l u m n = " 0 "   c o l u m n s p a n = " 0 "   m u l t i l i n e = " F a l s e "   m u l t i l i n e r o w s = " 3 "   l o c k e d = " F a l s e "   l a b e l = " P r o f i l e . U s e r . O u P h o n e "   r e a d o n l y = " F a l s e "   v i s i b l e = " T r u e "   r e q u i r e d = " F a l s e "   r e g e x = " "   v a l i d a t i o n m e s s a g e = " "   t o o l t i p = " "   t r a c k e d = " F a l s e " > < ! [ C D A T A [ + 4 1   4 3   2 5 9   2 4   5 1 ] ] > < / T e x t > - 
-                 < T e x t   i d = " P r o f i l e . U s e r . P h o n e "   r o w = " 0 "   c o l u m n = " 0 "   c o l u m n s p a n = " 0 "   m u l t i l i n e = " F a l s e "   m u l t i l i n e r o w s = " 3 "   l o c k e d = " F a l s e "   l a b e l = " P r o f i l e . U s e r . P h o n e "   r e a d o n l y = " F a l s e "   v i s i b l e = " T r u e "   r e q u i r e d = " F a l s e "   r e g e x = " "   v a l i d a t i o n m e s s a g e = " "   t o o l t i p = " "   t r a c k e d = " F a l s e " > < ! [ C D A T A [ + 4 1   4 3   2 5 9   2 4   5 0 ] ] > < / T e x t > - 
-                 < T e x t   i d = " P r o f i l e . U s e r . P o s t a l . C i t y "   r o w = " 0 "   c o l u m n = " 0 "   c o l u m n s p a n = " 0 "   m u l t i l i n e = " F a l s e "   m u l t i l i n e r o w s = " 3 "   l o c k e d = " F a l s e "   l a b e l = " P r o f i l e . U s e r . P o s t a l . C i t y "   r e a d o n l y = " F a l s e "   v i s i b l e = " T r u e "   r e q u i r e d = " F a l s e "   r e g e x = " "   v a l i d a t i o n m e s s a g e = " "   t o o l t i p = " "   t r a c k e d = " F a l s e " > < ! [ C D A T A [ Z � r i c h ] ] > < / T e x t > - 
-                 < T e x t   i d = " P r o f i l e . U s e r . P o s t a l . O f f i c e N a m e "   r o w = " 0 "   c o l u m n = " 0 "   c o l u m n s p a n = " 0 "   m u l t i l i n e = " F a l s e "   m u l t i l i n e r o w s = " 3 "   l o c k e d = " F a l s e "   l a b e l = " P r o f i l e . U s e r . P o s t a l . O f f i c e N a m e "   r e a d o n l y = " F a l s e "   v i s i b l e = " T r u e "   r e q u i r e d = " F a l s e "   r e g e x = " "   v a l i d a t i o n m e s s a g e = " "   t o o l t i p = " "   t r a c k e d = " F a l s e " > < ! [ C D A T A [ 5 0 5 ] ] > < / T e x t > - 
-                 < T e x t   i d = " P r o f i l e . U s e r . P o s t a l . P O B o x "   r o w = " 0 "   c o l u m n = " 0 "   c o l u m n s p a n = " 0 "   m u l t i l i n e = " F a l s e "   m u l t i l i n e r o w s = " 3 "   l o c k e d = " F a l s e "   l a b e l = " P r o f i l e . U s e r . P o s t a l . P O B o x "   r e a d o n l y = " F a l s e "   v i s i b l e = " T r u e "   r e q u i r e d = " F a l s e "   r e g e x = " "   v a l i d a t i o n m e s s a g e = " "   t o o l t i p = " "   t r a c k e d = " F a l s e " > < ! [ C D A T A [ P o s t f a c h ] ] > < / T e x t > - 
-                 < T e x t   i d = " P r o f i l e . U s e r . P o s t a l . S t r e e t "   r o w = " 0 "   c o l u m n = " 0 "   c o l u m n s p a n = " 0 "   m u l t i l i n e = " F a l s e "   m u l t i l i n e r o w s = " 3 "   l o c k e d = " F a l s e "   l a b e l = " P r o f i l e . U s e r . P o s t a l . S t r e e t "   r e a d o n l y = " F a l s e "   v i s i b l e = " T r u e "   r e q u i r e d = " F a l s e "   r e g e x = " "   v a l i d a t i o n m e s s a g e = " "   t o o l t i p = " "   t r a c k e d = " F a l s e " > < ! [ C D A T A [ S c h a f f h a u s e r s t r a s s e   7 8 ] ] > < / T e x t > - 
-                 < T e x t   i d = " P r o f i l e . U s e r . P o s t a l . Z i p "   r o w = " 0 "   c o l u m n = " 0 "   c o l u m n s p a n = " 0 "   m u l t i l i n e = " F a l s e "   m u l t i l i n e r o w s = " 3 "   l o c k e d = " F a l s e "   l a b e l = " P r o f i l e . U s e r . P o s t a l . Z i p "   r e a d o n l y = " F a l s e "   v i s i b l e = " T r u e "   r e q u i r e d = " F a l s e "   r e g e x = " "   v a l i d a t i o n m e s s a g e = " "   t o o l t i p = " "   t r a c k e d = " F a l s e " > < ! [ C D A T A [ 8 0 9 0 ] ] > < / T e x t > - 
-                 < T e x t   i d = " P r o f i l e . U s e r . S a l u t a t i o n "   r o w = " 0 "   c o l u m n = " 0 "   c o l u m n s p a n = " 0 "   m u l t i l i n e = " F a l s e "   m u l t i l i n e r o w s = " 3 "   l o c k e d = " F a l s e "   l a b e l = " P r o f i l e . U s e r . S a l u t a t i o n "   r e a d o n l y = " F a l s e "   v i s i b l e = " T r u e "   r e q u i r e d = " F a l s e "   r e g e x = " "   v a l i d a t i o n m e s s a g e = " "   t o o l t i p = " "   t r a c k e d = " F a l s e " > < ! [ C D A T A [ F r a u ] ] > < / T e x t > - 
-                 < T e x t   i d = " P r o f i l e . U s e r . T i t l e "   r o w = " 0 "   c o l u m n = " 0 "   c o l u m n s p a n = " 0 "   m u l t i l i n e = " F a l s e "   m u l t i l i n e r o w s = " 3 "   l o c k e d = " F a l s e "   l a b e l = " P r o f i l e . U s e r . T i t l e "   r e a d o n l y = " F a l s e "   v i s i b l e = " T r u e "   r e q u i r e d = " F a l s e "   r e g e x = " "   v a l i d a t i o n m e s s a g e = " "   t o o l t i p = " "   t r a c k e d = " F a l s e " > < ! [ C D A T A [   ] ] > < / T e x t > - 
-                 < T e x t   i d = " P r o f i l e . U s e r . U r l "   r o w = " 0 "   c o l u m n = " 0 "   c o l u m n s p a n = " 0 "   m u l t i l i n e = " F a l s e "   m u l t i l i n e r o w s = " 3 "   l o c k e d = " F a l s e "   l a b e l = " P r o f i l e . U s e r . U r l "   r e a d o n l y = " F a l s e "   v i s i b l e = " T r u e "   r e q u i r e d = " F a l s e "   r e g e x = " "   v a l i d a t i o n m e s s a g e = " "   t o o l t i p = " "   t r a c k e d = " F a l s e " > < ! [ C D A T A [ w w w . s o z i a l a m t . z h . c h ] ] > < / T e x t > - 
-             < / P r o f i l e > - 
-             < A u t h o r   w i n d o w w i d t h = " 0 "   w i n d o w h e i g h t = " 0 "   m i n w i n d o w w i d t h = " 0 "   m a x w i n d o w w i d t h = " 0 "   m i n w i n d o w h e i g h t = " 0 "   m a x w i n d o w h e i g h t = " 0 " > - 
-                 < T e x t   i d = " A u t h o r . U s e r . A l i a s "   r o w = " 0 "   c o l u m n = " 0 "   c o l u m n s p a n = " 0 "   m u l t i l i n e = " F a l s e "   m u l t i l i n e r o w s = " 3 "   l o c k e d = " F a l s e "   l a b e l = " A u t h o r . U s e r . A l i a s "   r e a d o n l y = " F a l s e "   v i s i b l e = " T r u e "   r e q u i r e d = " F a l s e "   r e g e x = " "   v a l i d a t i o n m e s s a g e = " "   t o o l t i p = " "   t r a c k e d = " F a l s e " > < ! [ C D A T A [   ] ] > < / T e x t > - 
-                 < T e x t   i d = " A u t h o r . U s e r . E m a i l "   r o w = " 0 "   c o l u m n = " 0 "   c o l u m n s p a n = " 0 "   m u l t i l i n e = " F a l s e "   m u l t i l i n e r o w s = " 3 "   l o c k e d = " F a l s e "   l a b e l = " A u t h o r . U s e r . E m a i l "   r e a d o n l y = " F a l s e "   v i s i b l e = " T r u e "   r e q u i r e d = " F a l s e "   r e g e x = " "   v a l i d a t i o n m e s s a g e = " "   t o o l t i p = " "   t r a c k e d = " F a l s e " > < ! [ C D A T A [ a n d r e a . l u e b b e r s t e d t @ s a . z h . c h ] ] > < / T e x t > - 
-                 < T e x t   i d = " A u t h o r . U s e r . F a x "   r o w = " 0 "   c o l u m n = " 0 "   c o l u m n s p a n = " 0 "   m u l t i l i n e = " F a l s e "   m u l t i l i n e r o w s = " 3 "   l o c k e d = " F a l s e "   l a b e l = " A u t h o r . U s e r . F a x "   r e a d o n l y = " F a l s e "   v i s i b l e = " T r u e "   r e q u i r e d = " F a l s e "   r e g e x = " "   v a l i d a t i o n m e s s a g e = " "   t o o l t i p = " "   t r a c k e d = " F a l s e " > < ! [ C D A T A [ + 4 1   4 3   2 5 9   5 1   0 7 ] ] > < / T e x t > - 
-                 < T e x t   i d = " A u t h o r . U s e r . F i r s t N a m e "   r o w = " 0 "   c o l u m n = " 0 "   c o l u m n s p a n = " 0 "   m u l t i l i n e = " F a l s e "   m u l t i l i n e r o w s = " 3 "   l o c k e d = " F a l s e "   l a b e l = " A u t h o r . U s e r . F i r s t N a m e "   r e a d o n l y = " F a l s e "   v i s i b l e = " T r u e "   r e q u i r e d = " F a l s e "   r e g e x = " "   v a l i d a t i o n m e s s a g e = " "   t o o l t i p = " "   t r a c k e d = " F a l s e " > < ! [ C D A T A [ A n d r e a ] ] > < / T e x t > - 
-                 < T e x t   i d = " A u t h o r . U s e r . F u n c t i o n "   r o w = " 0 "   c o l u m n = " 0 "   c o l u m n s p a n = " 0 "   m u l t i l i n e = " F a l s e "   m u l t i l i n e r o w s = " 3 "   l o c k e d = " F a l s e "   l a b e l = " A u t h o r . U s e r . F u n c t i o n "   r e a d o n l y = " F a l s e "   v i s i b l e = " T r u e "   r e q u i r e d = " F a l s e "   r e g e x = " "   v a l i d a t i o n m e s s a g e = " "   t o o l t i p = " "   t r a c k e d = " F a l s e " > < ! [ C D A T A [ A m t s c h e f i n ] ] > < / T e x t > - 
-                 < T e x t   i d = " A u t h o r . U s e r . J o b D e s c r i p t i o n "   r o w = " 0 "   c o l u m n = " 0 "   c o l u m n s p a n = " 0 "   m u l t i l i n e = " F a l s e "   m u l t i l i n e r o w s = " 3 "   l o c k e d = " F a l s e "   l a b e l = " A u t h o r . U s e r . J o b D e s c r i p t i o n "   r e a d o n l y = " F a l s e "   v i s i b l e = " T r u e "   r e q u i r e d = " F a l s e "   r e g e x = " "   v a l i d a t i o n m e s s a g e = " "   t o o l t i p = " "   t r a c k e d = " F a l s e " > < ! [ C D A T A [   ] ] > < / T e x t > - 
-                 < T e x t   i d = " A u t h o r . U s e r . L a s t N a m e "   r o w = " 0 "   c o l u m n = " 0 "   c o l u m n s p a n = " 0 "   m u l t i l i n e = " F a l s e "   m u l t i l i n e r o w s = " 3 "   l o c k e d = " F a l s e "   l a b e l = " A u t h o r . U s e r . L a s t N a m e "   r e a d o n l y = " F a l s e "   v i s i b l e = " T r u e "   r e q u i r e d = " F a l s e "   r e g e x = " "   v a l i d a t i o n m e s s a g e = " "   t o o l t i p = " "   t r a c k e d = " F a l s e " > < ! [ C D A T A [ L � b b e r s t e d t ] ] > < / T e x t > - 
-                 < T e x t   i d = " A u t h o r . U s e r . O u L e v 1 "   r o w = " 0 "   c o l u m n = " 0 "   c o l u m n s p a n = " 0 "   m u l t i l i n e = " F a l s e "   m u l t i l i n e r o w s = " 3 "   l o c k e d = " F a l s e "   l a b e l = " A u t h o r . U s e r . O u L e v 1 "   r e a d o n l y = " F a l s e "   v i s i b l e = " T r u e "   r e q u i r e d = " F a l s e "   r e g e x = " "   v a l i d a t i o n m e s s a g e = " "   t o o l t i p = " "   t r a c k e d = " F a l s e " > < ! [ C D A T A [ K a n t o n   Z � r i c h ] ] > < / T e x t > - 
-                 < T e x t   i d = " A u t h o r . U s e r . O u L e v 2 "   r o w = " 0 "   c o l u m n = " 0 "   c o l u m n s p a n = " 0 "   m u l t i l i n e = " F a l s e "   m u l t i l i n e r o w s = " 3 "   l o c k e d = " F a l s e "   l a b e l = " A u t h o r . U s e r . O u L e v 2 "   r e a d o n l y = " F a l s e "   v i s i b l e = " T r u e "   r e q u i r e d = " F a l s e "   r e g e x = " "   v a l i d a t i o n m e s s a g e = " "   t o o l t i p = " "   t r a c k e d = " F a l s e " > < ! [ C D A T A [ S i c h e r h e i t s d i r e k t i o n ] ] > < / T e x t > - 
-                 < T e x t   i d = " A u t h o r . U s e r . O u L e v 3 "   r o w = " 0 "   c o l u m n = " 0 "   c o l u m n s p a n = " 0 "   m u l t i l i n e = " F a l s e "   m u l t i l i n e r o w s = " 3 "   l o c k e d = " F a l s e "   l a b e l = " A u t h o r . U s e r . O u L e v 3 "   r e a d o n l y = " F a l s e "   v i s i b l e = " T r u e "   r e q u i r e d = " F a l s e "   r e g e x = " "   v a l i d a t i o n m e s s a g e = " "   t o o l t i p = " "   t r a c k e d = " F a l s e " > < ! [ C D A T A [ K a n t o n a l e s   S o z i a l a m t ] ] > < / T e x t > - 
-                 < T e x t   i d = " A u t h o r . U s e r . O u L e v 4 "   r o w = " 0 "   c o l u m n = " 0 "   c o l u m n s p a n = " 0 "   m u l t i l i n e = " F a l s e "   m u l t i l i n e r o w s = " 3 "   l o c k e d = " F a l s e "   l a b e l = " A u t h o r . U s e r . O u L e v 4 "   r e a d o n l y = " F a l s e "   v i s i b l e = " T r u e "   r e q u i r e d = " F a l s e "   r e g e x = " "   v a l i d a t i o n m e s s a g e = " "   t o o l t i p = " "   t r a c k e d = " F a l s e " > < ! [ C D A T A [   ] ] > < / T e x t > - 
-                 < T e x t   i d = " A u t h o r . U s e r . O u L e v 5 "   r o w = " 0 "   c o l u m n = " 0 "   c o l u m n s p a n = " 0 "   m u l t i l i n e = " F a l s e "   m u l t i l i n e r o w s = " 3 "   l o c k e d = " F a l s e "   l a b e l = " A u t h o r . U s e r . O u L e v 5 "   r e a d o n l y = " F a l s e "   v i s i b l e = " T r u e "   r e q u i r e d = " F a l s e "   r e g e x = " "   v a l i d a t i o n m e s s a g e = " "   t o o l t i p = " "   t r a c k e d = " F a l s e " > < ! [ C D A T A [   ] ] > < / T e x t > - 
-                 < T e x t   i d = " A u t h o r . U s e r . O u L e v 6 "   r o w = " 0 "   c o l u m n = " 0 "   c o l u m n s p a n = " 0 "   m u l t i l i n e = " F a l s e "   m u l t i l i n e r o w s = " 3 "   l o c k e d = " F a l s e "   l a b e l = " A u t h o r . U s e r . O u L e v 6 "   r e a d o n l y = " F a l s e "   v i s i b l e = " T r u e "   r e q u i r e d = " F a l s e "   r e g e x = " "   v a l i d a t i o n m e s s a g e = " "   t o o l t i p = " "   t r a c k e d = " F a l s e " > < ! [ C D A T A [   ] ] > < / T e x t > - 
-                 < T e x t   i d = " A u t h o r . U s e r . O u L e v 7 "   r o w = " 0 "   c o l u m n = " 0 "   c o l u m n s p a n = " 0 "   m u l t i l i n e = " F a l s e "   m u l t i l i n e r o w s = " 3 "   l o c k e d = " F a l s e "   l a b e l = " A u t h o r . U s e r . O u L e v 7 "   r e a d o n l y = " F a l s e "   v i s i b l e = " T r u e "   r e q u i r e d = " F a l s e "   r e g e x = " "   v a l i d a t i o n m e s s a g e = " "   t o o l t i p = " "   t r a c k e d = " F a l s e " > < ! [ C D A T A [   ] ] > < / T e x t > - 
-                 < T e x t   i d = " A u t h o r . U s e r . O u M a i l "   r o w = " 0 "   c o l u m n = " 0 "   c o l u m n s p a n = " 0 "   m u l t i l i n e = " F a l s e "   m u l t i l i n e r o w s = " 3 "   l o c k e d = " F a l s e "   l a b e l = " A u t h o r . U s e r . O u M a i l "   r e a d o n l y = " F a l s e "   v i s i b l e = " T r u e "   r e q u i r e d = " F a l s e "   r e g e x = " "   v a l i d a t i o n m e s s a g e = " "   t o o l t i p = " "   t r a c k e d = " F a l s e " > < ! [ C D A T A [ i n f o @ s a . z h . c h ] ] > < / T e x t > - 
-                 < T e x t   i d = " A u t h o r . U s e r . O u P h o n e "   r o w = " 0 "   c o l u m n = " 0 "   c o l u m n s p a n = " 0 "   m u l t i l i n e = " F a l s e "   m u l t i l i n e r o w s = " 3 "   l o c k e d = " F a l s e "   l a b e l = " A u t h o r . U s e r . O u P h o n e "   r e a d o n l y = " F a l s e "   v i s i b l e = " T r u e "   r e q u i r e d = " F a l s e "   r e g e x = " "   v a l i d a t i o n m e s s a g e = " "   t o o l t i p = " "   t r a c k e d = " F a l s e " > < ! [ C D A T A [ + 4 1   4 3   2 5 9   2 4   5 1 ] ] > < / T e x t > - 
-                 < T e x t   i d = " A u t h o r . U s e r . P h o n e "   r o w = " 0 "   c o l u m n = " 0 "   c o l u m n s p a n = " 0 "   m u l t i l i n e = " F a l s e "   m u l t i l i n e r o w s = " 3 "   l o c k e d = " F a l s e "   l a b e l = " A u t h o r . U s e r . P h o n e "   r e a d o n l y = " F a l s e "   v i s i b l e = " T r u e "   r e q u i r e d = " F a l s e "   r e g e x = " "   v a l i d a t i o n m e s s a g e = " "   t o o l t i p = " "   t r a c k e d = " F a l s e " > < ! [ C D A T A [ + 4 1   4 3   2 5 9   2 4   5 0 ] ] > < / T e x t > - 
-                 < T e x t   i d = " A u t h o r . U s e r . P o s t a l . C i t y "   r o w = " 0 "   c o l u m n = " 0 "   c o l u m n s p a n = " 0 "   m u l t i l i n e = " F a l s e "   m u l t i l i n e r o w s = " 3 "   l o c k e d = " F a l s e "   l a b e l = " A u t h o r . U s e r . P o s t a l . C i t y "   r e a d o n l y = " F a l s e "   v i s i b l e = " T r u e "   r e q u i r e d = " F a l s e "   r e g e x = " "   v a l i d a t i o n m e s s a g e = " "   t o o l t i p = " "   t r a c k e d = " F a l s e " > < ! [ C D A T A [ Z � r i c h ] ] > < / T e x t > - 
-                 < T e x t   i d = " A u t h o r . U s e r . P o s t a l . O f f i c e N a m e "   r o w = " 0 "   c o l u m n = " 0 "   c o l u m n s p a n = " 0 "   m u l t i l i n e = " F a l s e "   m u l t i l i n e r o w s = " 3 "   l o c k e d = " F a l s e "   l a b e l = " A u t h o r . U s e r . P o s t a l . O f f i c e N a m e "   r e a d o n l y = " F a l s e "   v i s i b l e = " T r u e "   r e q u i r e d = " F a l s e "   r e g e x = " "   v a l i d a t i o n m e s s a g e = " "   t o o l t i p = " "   t r a c k e d = " F a l s e " > < ! [ C D A T A [ 5 0 5 ] ] > < / T e x t > - 
-                 < T e x t   i d = " A u t h o r . U s e r . P o s t a l . P O B o x "   r o w = " 0 "   c o l u m n = " 0 "   c o l u m n s p a n = " 0 "   m u l t i l i n e = " F a l s e "   m u l t i l i n e r o w s = " 3 "   l o c k e d = " F a l s e "   l a b e l = " A u t h o r . U s e r . P o s t a l . P O B o x "   r e a d o n l y = " F a l s e "   v i s i b l e = " T r u e "   r e q u i r e d = " F a l s e "   r e g e x = " "   v a l i d a t i o n m e s s a g e = " "   t o o l t i p = " "   t r a c k e d = " F a l s e " > < ! [ C D A T A [ P o s t f a c h ] ] > < / T e x t > - 
-                 < T e x t   i d = " A u t h o r . U s e r . P o s t a l . S t r e e t "   r o w = " 0 "   c o l u m n = " 0 "   c o l u m n s p a n = " 0 "   m u l t i l i n e = " F a l s e "   m u l t i l i n e r o w s = " 3 "   l o c k e d = " F a l s e "   l a b e l = " A u t h o r . U s e r . P o s t a l . S t r e e t "   r e a d o n l y = " F a l s e "   v i s i b l e = " T r u e "   r e q u i r e d = " F a l s e "   r e g e x = " "   v a l i d a t i o n m e s s a g e = " "   t o o l t i p = " "   t r a c k e d = " F a l s e " > < ! [ C D A T A [ S c h a f f h a u s e r s t r a s s e   7 8 ] ] > < / T e x t > - 
-                 < T e x t   i d = " A u t h o r . U s e r . P o s t a l . Z i p "   r o w = " 0 "   c o l u m n = " 0 "   c o l u m n s p a n = " 0 "   m u l t i l i n e = " F a l s e "   m u l t i l i n e r o w s = " 3 "   l o c k e d = " F a l s e "   l a b e l = " A u t h o r . U s e r . P o s t a l . Z i p "   r e a d o n l y = " F a l s e "   v i s i b l e = " T r u e "   r e q u i r e d = " F a l s e "   r e g e x = " "   v a l i d a t i o n m e s s a g e = " "   t o o l t i p = " "   t r a c k e d = " F a l s e " > < ! [ C D A T A [ 8 0 9 0 ] ] > < / T e x t > - 
-                 < T e x t   i d = " A u t h o r . U s e r . S a l u t a t i o n "   r o w = " 0 "   c o l u m n = " 0 "   c o l u m n s p a n = " 0 "   m u l t i l i n e = " F a l s e "   m u l t i l i n e r o w s = " 3 "   l o c k e d = " F a l s e "   l a b e l = " A u t h o r . U s e r . S a l u t a t i o n "   r e a d o n l y = " F a l s e "   v i s i b l e = " T r u e "   r e q u i r e d = " F a l s e "   r e g e x = " "   v a l i d a t i o n m e s s a g e = " "   t o o l t i p = " "   t r a c k e d = " F a l s e " > < ! [ C D A T A [ F r a u ] ] > < / T e x t > - 
-                 < T e x t   i d = " A u t h o r . U s e r . T i t l e "   r o w = " 0 "   c o l u m n = " 0 "   c o l u m n s p a n = " 0 "   m u l t i l i n e = " F a l s e "   m u l t i l i n e r o w s = " 3 "   l o c k e d = " F a l s e "   l a b e l = " A u t h o r . U s e r . T i t l e "   r e a d o n l y = " F a l s e "   v i s i b l e = " T r u e "   r e q u i r e d = " F a l s e "   r e g e x = " "   v a l i d a t i o n m e s s a g e = " "   t o o l t i p = " "   t r a c k e d = " F a l s e " > < ! [ C D A T A [   ] ] > < / T e x t > - 
-                 < T e x t   i d = " A u t h o r . U s e r . U r l "   r o w = " 0 "   c o l u m n = " 0 "   c o l u m n s p a n = " 0 "   m u l t i l i n e = " F a l s e "   m u l t i l i n e r o w s = " 3 "   l o c k e d = " F a l s e "   l a b e l = " A u t h o r . U s e r . U r l "   r e a d o n l y = " F a l s e "   v i s i b l e = " T r u e "   r e q u i r e d = " F a l s e "   r e g e x = " "   v a l i d a t i o n m e s s a g e = " "   t o o l t i p = " "   t r a c k e d = " F a l s e " > < ! [ C D A T A [ w w w . s o z i a l a m t . z h . c h ] ] > < / T e x t > - 
-             < / A u t h o r > - 
-             < S i g n e r _ 0   w i n d o w w i d t h = " 0 "   w i n d o w h e i g h t = " 0 "   m i n w i n d o w w i d t h = " 0 "   m a x w i n d o w w i d t h = " 0 "   m i n w i n d o w h e i g h t = " 0 "   m a x w i n d o w h e i g h t = " 0 " > - 
-                 < T e x t   i d = " S i g n e r _ 0 . I d "   r o w = " 0 "   c o l u m n = " 0 "   c o l u m n s p a n = " 0 "   m u l t i l i n e = " F a l s e "   m u l t i l i n e r o w s = " 3 "   l o c k e d = " F a l s e "   l a b e l = " S i g n e r _ 0 . I d "   r e a d o n l y = " F a l s e "   v i s i b l e = " T r u e "   r e q u i r e d = " F a l s e "   r e g e x = " "   v a l i d a t i o n m e s s a g e = " "   t o o l t i p = " "   t r a c k e d = " F a l s e " > < ! [ C D A T A [ a 1 4 4 4 5 a b - 1 f 9 9 - 4 4 6 9 - 8 b 5 a - 1 d a 7 1 0 b 9 8 2 b 0 ] ] > < / T e x t > - 
-                 < T e x t   i d = " S i g n e r _ 0 . O r g a n i z a t i o n U n i t I d "   r o w = " 0 "   c o l u m n = " 0 "   c o l u m n s p a n = " 0 "   m u l t i l i n e = " F a l s e "   m u l t i l i n e r o w s = " 3 "   l o c k e d = " F a l s e "   l a b e l = " S i g n e r _ 0 . O r g a n i z a t i o n U n i t I d "   r e a d o n l y = " F a l s e "   v i s i b l e = " T r u e "   r e q u i r e d = " F a l s e "   r e g e x = " "   v a l i d a t i o n m e s s a g e = " "   t o o l t i p = " "   t r a c k e d = " F a l s e " > < ! [ C D A T A [ 5 f 9 8 4 b 2 6 - 4 c e 2 - 4 6 f d - 8 4 a a - 1 f 7 d b 5 4 8 a f e 8 ] ] > < / T e x t > - 
-                 < T e x t   i d = " S i g n e r _ 0 . O r g . P o s t a l . C o u n t r y "   r o w = " 0 "   c o l u m n = " 0 "   c o l u m n s p a n = " 0 "   m u l t i l i n e = " F a l s e "   m u l t i l i n e r o w s = " 3 "   l o c k e d = " F a l s e "   l a b e l = " S i g n e r _ 0 . O r g . P o s t a l . C o u n t r y "   r e a d o n l y = " F a l s e "   v i s i b l e = " T r u e "   r e q u i r e d = " F a l s e "   r e g e x = " "   v a l i d a t i o n m e s s a g e = " "   t o o l t i p = " "   t r a c k e d = " F a l s e " > < ! [ C D A T A [ S c h w e i z ] ] > < / T e x t > - 
-                 < T e x t   i d = " S i g n e r _ 0 . O r g . P o s t a l . L Z i p "   r o w = " 0 "   c o l u m n = " 0 "   c o l u m n s p a n = " 0 "   m u l t i l i n e = " F a l s e "   m u l t i l i n e r o w s = " 3 "   l o c k e d = " F a l s e "   l a b e l = " S i g n e r _ 0 . O r g . P o s t a l . L Z i p "   r e a d o n l y = " F a l s e "   v i s i b l e = " T r u e "   r e q u i r e d = " F a l s e "   r e g e x = " "   v a l i d a t i o n m e s s a g e = " "   t o o l t i p = " "   t r a c k e d = " F a l s e " > < ! [ C D A T A [ C H ] ] > < / T e x t > - 
-                 < T e x t   i d = " S i g n e r _ 0 . O r g . T i t l e "   r o w = " 0 "   c o l u m n = " 0 "   c o l u m n s p a n = " 0 "   m u l t i l i n e = " F a l s e "   m u l t i l i n e r o w s = " 3 "   l o c k e d = " F a l s e "   l a b e l = " S i g n e r _ 0 . O r g . T i t l e "   r e a d o n l y = " F a l s e "   v i s i b l e = " T r u e "   r e q u i r e d = " F a l s e "   r e g e x = " "   v a l i d a t i o n m e s s a g e = " "   t o o l t i p = " "   t r a c k e d = " F a l s e " > < ! [ C D A T A [ K a n t o n   Z � r i c h ] ] > < / T e x t > - 
-                 < T e x t   i d = " S i g n e r _ 0 . U s e r . A l i a s "   r o w = " 0 "   c o l u m n = " 0 "   c o l u m n s p a n = " 0 "   m u l t i l i n e = " F a l s e "   m u l t i l i n e r o w s = " 3 "   l o c k e d = " F a l s e "   l a b e l = " S i g n e r _ 0 . U s e r . A l i a s "   r e a d o n l y = " F a l s e "   v i s i b l e = " T r u e "   r e q u i r e d = " F a l s e "   r e g e x = " "   v a l i d a t i o n m e s s a g e = " "   t o o l t i p = " "   t r a c k e d = " F a l s e " > < ! [ C D A T A [   ] ] > < / T e x t > - 
-                 < T e x t   i d = " S i g n e r _ 0 . U s e r . E m a i l "   r o w = " 0 "   c o l u m n = " 0 "   c o l u m n s p a n = " 0 "   m u l t i l i n e = " F a l s e "   m u l t i l i n e r o w s = " 3 "   l o c k e d = " F a l s e "   l a b e l = " S i g n e r _ 0 . U s e r . E m a i l "   r e a d o n l y = " F a l s e "   v i s i b l e = " T r u e "   r e q u i r e d = " F a l s e "   r e g e x = " "   v a l i d a t i o n m e s s a g e = " "   t o o l t i p = " "   t r a c k e d = " F a l s e " > < ! [ C D A T A [ a n d r e a . l u e b b e r s t e d t @ s a . z h . c h ] ] > < / T e x t > - 
-                 < T e x t   i d = " S i g n e r _ 0 . U s e r . F a x "   r o w = " 0 "   c o l u m n = " 0 "   c o l u m n s p a n = " 0 "   m u l t i l i n e = " F a l s e "   m u l t i l i n e r o w s = " 3 "   l o c k e d = " F a l s e "   l a b e l = " S i g n e r _ 0 . U s e r . F a x "   r e a d o n l y = " F a l s e "   v i s i b l e = " T r u e "   r e q u i r e d = " F a l s e "   r e g e x = " "   v a l i d a t i o n m e s s a g e = " "   t o o l t i p = " "   t r a c k e d = " F a l s e " > < ! [ C D A T A [ + 4 1   4 3   2 5 9   5 1   0 7 ] ] > < / T e x t > - 
-                 < T e x t   i d = " S i g n e r _ 0 . U s e r . F i r s t N a m e "   r o w = " 0 "   c o l u m n = " 0 "   c o l u m n s p a n = " 0 "   m u l t i l i n e = " F a l s e "   m u l t i l i n e r o w s = " 3 "   l o c k e d = " F a l s e "   l a b e l = " S i g n e r _ 0 . U s e r . F i r s t N a m e "   r e a d o n l y = " F a l s e "   v i s i b l e = " T r u e "   r e q u i r e d = " F a l s e "   r e g e x = " "   v a l i d a t i o n m e s s a g e = " "   t o o l t i p = " "   t r a c k e d = " F a l s e " > < ! [ C D A T A [ A n d r e a ] ] > < / T e x t > - 
-                 < T e x t   i d = " S i g n e r _ 0 . U s e r . F u n c t i o n "   r o w = " 0 "   c o l u m n = " 0 "   c o l u m n s p a n = " 0 "   m u l t i l i n e = " F a l s e "   m u l t i l i n e r o w s = " 3 "   l o c k e d = " F a l s e "   l a b e l = " S i g n e r _ 0 . U s e r . F u n c t i o n "   r e a d o n l y = " F a l s e "   v i s i b l e = " T r u e "   r e q u i r e d = " F a l s e "   r e g e x = " "   v a l i d a t i o n m e s s a g e = " "   t o o l t i p = " "   t r a c k e d = " F a l s e " > < ! [ C D A T A [ A m t s c h e f i n ] ] > < / T e x t > - 
-                 < T e x t   i d = " S i g n e r _ 0 . U s e r . J o b D e s c r i p t i o n "   r o w = " 0 "   c o l u m n = " 0 "   c o l u m n s p a n = " 0 "   m u l t i l i n e = " F a l s e "   m u l t i l i n e r o w s = " 3 "   l o c k e d = " F a l s e "   l a b e l = " S i g n e r _ 0 . U s e r . J o b D e s c r i p t i o n "   r e a d o n l y = " F a l s e "   v i s i b l e = " T r u e "   r e q u i r e d = " F a l s e "   r e g e x = " "   v a l i d a t i o n m e s s a g e = " "   t o o l t i p = " "   t r a c k e d = " F a l s e " > < ! [ C D A T A [   ] ] > < / T e x t > - 
-                 < T e x t   i d = " S i g n e r _ 0 . U s e r . L a s t N a m e "   r o w = " 0 "   c o l u m n = " 0 "   c o l u m n s p a n = " 0 "   m u l t i l i n e = " F a l s e "   m u l t i l i n e r o w s = " 3 "   l o c k e d = " F a l s e "   l a b e l = " S i g n e r _ 0 . U s e r . L a s t N a m e "   r e a d o n l y = " F a l s e "   v i s i b l e = " T r u e "   r e q u i r e d = " F a l s e "   r e g e x = " "   v a l i d a t i o n m e s s a g e = " "   t o o l t i p = " "   t r a c k e d = " F a l s e " > < ! [ C D A T A [ L � b b e r s t e d t ] ] > < / T e x t > - 
-                 < T e x t   i d = " S i g n e r _ 0 . U s e r . O u L e v 1 "   r o w = " 0 "   c o l u m n = " 0 "   c o l u m n s p a n = " 0 "   m u l t i l i n e = " F a l s e "   m u l t i l i n e r o w s = " 3 "   l o c k e d = " F a l s e "   l a b e l = " S i g n e r _ 0 . U s e r . O u L e v 1 "   r e a d o n l y = " F a l s e "   v i s i b l e = " T r u e "   r e q u i r e d = " F a l s e "   r e g e x = " "   v a l i d a t i o n m e s s a g e = " "   t o o l t i p = " "   t r a c k e d = " F a l s e " > < ! [ C D A T A [ K a n t o n   Z � r i c h ] ] > < / T e x t > - 
-                 < T e x t   i d = " S i g n e r _ 0 . U s e r . O u L e v 2 "   r o w = " 0 "   c o l u m n = " 0 "   c o l u m n s p a n = " 0 "   m u l t i l i n e = " F a l s e "   m u l t i l i n e r o w s = " 3 "   l o c k e d = " F a l s e "   l a b e l = " S i g n e r _ 0 . U s e r . O u L e v 2 "   r e a d o n l y = " F a l s e "   v i s i b l e = " T r u e "   r e q u i r e d = " F a l s e "   r e g e x = " "   v a l i d a t i o n m e s s a g e = " "   t o o l t i p = " "   t r a c k e d = " F a l s e " > < ! [ C D A T A [ S i c h e r h e i t s d i r e k t i o n ] ] > < / T e x t > - 
-                 < T e x t   i d = " S i g n e r _ 0 . U s e r . O u L e v 3 "   r o w = " 0 "   c o l u m n = " 0 "   c o l u m n s p a n = " 0 "   m u l t i l i n e = " F a l s e "   m u l t i l i n e r o w s = " 3 "   l o c k e d = " F a l s e "   l a b e l = " S i g n e r _ 0 . U s e r . O u L e v 3 "   r e a d o n l y = " F a l s e "   v i s i b l e = " T r u e "   r e q u i r e d = " F a l s e "   r e g e x = " "   v a l i d a t i o n m e s s a g e = " "   t o o l t i p = " "   t r a c k e d = " F a l s e " > < ! [ C D A T A [ K a n t o n a l e s   S o z i a l a m t ] ] > < / T e x t > - 
-                 < T e x t   i d = " S i g n e r _ 0 . U s e r . O u L e v 4 "   r o w = " 0 "   c o l u m n = " 0 "   c o l u m n s p a n = " 0 "   m u l t i l i n e = " F a l s e "   m u l t i l i n e r o w s = " 3 "   l o c k e d = " F a l s e "   l a b e l = " S i g n e r _ 0 . U s e r . O u L e v 4 "   r e a d o n l y = " F a l s e "   v i s i b l e = " T r u e "   r e q u i r e d = " F a l s e "   r e g e x = " "   v a l i d a t i o n m e s s a g e = " "   t o o l t i p = " "   t r a c k e d = " F a l s e " > < ! [ C D A T A [   ] ] > < / T e x t > - 
-                 < T e x t   i d = " S i g n e r _ 0 . U s e r . O u L e v 5 "   r o w = " 0 "   c o l u m n = " 0 "   c o l u m n s p a n = " 0 "   m u l t i l i n e = " F a l s e "   m u l t i l i n e r o w s = " 3 "   l o c k e d = " F a l s e "   l a b e l = " S i g n e r _ 0 . U s e r . O u L e v 5 "   r e a d o n l y = " F a l s e "   v i s i b l e = " T r u e "   r e q u i r e d = " F a l s e "   r e g e x = " "   v a l i d a t i o n m e s s a g e = " "   t o o l t i p = " "   t r a c k e d = " F a l s e " > < ! [ C D A T A [   ] ] > < / T e x t > - 
-                 < T e x t   i d = " S i g n e r _ 0 . U s e r . O u L e v 6 "   r o w = " 0 "   c o l u m n = " 0 "   c o l u m n s p a n = " 0 "   m u l t i l i n e = " F a l s e "   m u l t i l i n e r o w s = " 3 "   l o c k e d = " F a l s e "   l a b e l = " S i g n e r _ 0 . U s e r . O u L e v 6 "   r e a d o n l y = " F a l s e "   v i s i b l e = " T r u e "   r e q u i r e d = " F a l s e "   r e g e x = " "   v a l i d a t i o n m e s s a g e = " "   t o o l t i p = " "   t r a c k e d = " F a l s e " > < ! [ C D A T A [   ] ] > < / T e x t > - 
-                 < T e x t   i d = " S i g n e r _ 0 . U s e r . O u L e v 7 "   r o w = " 0 "   c o l u m n = " 0 "   c o l u m n s p a n = " 0 "   m u l t i l i n e = " F a l s e "   m u l t i l i n e r o w s = " 3 "   l o c k e d = " F a l s e "   l a b e l = " S i g n e r _ 0 . U s e r . O u L e v 7 "   r e a d o n l y = " F a l s e "   v i s i b l e = " T r u e "   r e q u i r e d = " F a l s e "   r e g e x = " "   v a l i d a t i o n m e s s a g e = " "   t o o l t i p = " "   t r a c k e d = " F a l s e " > < ! [ C D A T A [   ] ] > < / T e x t > - 
-                 < T e x t   i d = " S i g n e r _ 0 . U s e r . O u M a i l "   r o w = " 0 "   c o l u m n = " 0 "   c o l u m n s p a n = " 0 "   m u l t i l i n e = " F a l s e "   m u l t i l i n e r o w s = " 3 "   l o c k e d = " F a l s e "   l a b e l = " S i g n e r _ 0 . U s e r . O u M a i l "   r e a d o n l y = " F a l s e "   v i s i b l e = " T r u e "   r e q u i r e d = " F a l s e "   r e g e x = " "   v a l i d a t i o n m e s s a g e = " "   t o o l t i p = " "   t r a c k e d = " F a l s e " > < ! [ C D A T A [ i n f o @ s a . z h . c h ] ] > < / T e x t > - 
-                 < T e x t   i d = " S i g n e r _ 0 . U s e r . O u P h o n e "   r o w = " 0 "   c o l u m n = " 0 "   c o l u m n s p a n = " 0 "   m u l t i l i n e = " F a l s e "   m u l t i l i n e r o w s = " 3 "   l o c k e d = " F a l s e "   l a b e l = " S i g n e r _ 0 . U s e r . O u P h o n e "   r e a d o n l y = " F a l s e "   v i s i b l e = " T r u e "   r e q u i r e d = " F a l s e "   r e g e x = " "   v a l i d a t i o n m e s s a g e = " "   t o o l t i p = " "   t r a c k e d = " F a l s e " > < ! [ C D A T A [ + 4 1   4 3   2 5 9   2 4   5 1 ] ] > < / T e x t > - 
-                 < T e x t   i d = " S i g n e r _ 0 . U s e r . P h o n e "   r o w = " 0 "   c o l u m n = " 0 "   c o l u m n s p a n = " 0 "   m u l t i l i n e = " F a l s e "   m u l t i l i n e r o w s = " 3 "   l o c k e d = " F a l s e "   l a b e l = " S i g n e r _ 0 . U s e r . P h o n e "   r e a d o n l y = " F a l s e "   v i s i b l e = " T r u e "   r e q u i r e d = " F a l s e "   r e g e x = " "   v a l i d a t i o n m e s s a g e = " "   t o o l t i p = " "   t r a c k e d = " F a l s e " > < ! [ C D A T A [ + 4 1   4 3   2 5 9   2 4   5 0 ] ] > < / T e x t > - 
-                 < T e x t   i d = " S i g n e r _ 0 . U s e r . P o s t a l . C i t y "   r o w = " 0 "   c o l u m n = " 0 "   c o l u m n s p a n = " 0 "   m u l t i l i n e = " F a l s e "   m u l t i l i n e r o w s = " 3 "   l o c k e d = " F a l s e "   l a b e l = " S i g n e r _ 0 . U s e r . P o s t a l . C i t y "   r e a d o n l y = " F a l s e "   v i s i b l e = " T r u e "   r e q u i r e d = " F a l s e "   r e g e x = " "   v a l i d a t i o n m e s s a g e = " "   t o o l t i p = " "   t r a c k e d = " F a l s e " > < ! [ C D A T A [ Z � r i c h ] ] > < / T e x t > - 
-                 < T e x t   i d = " S i g n e r _ 0 . U s e r . P o s t a l . O f f i c e N a m e "   r o w = " 0 "   c o l u m n = " 0 "   c o l u m n s p a n = " 0 "   m u l t i l i n e = " F a l s e "   m u l t i l i n e r o w s = " 3 "   l o c k e d = " F a l s e "   l a b e l = " S i g n e r _ 0 . U s e r . P o s t a l . O f f i c e N a m e "   r e a d o n l y = " F a l s e "   v i s i b l e = " T r u e "   r e q u i r e d = " F a l s e "   r e g e x = " "   v a l i d a t i o n m e s s a g e = " "   t o o l t i p = " "   t r a c k e d = " F a l s e " > < ! [ C D A T A [ 5 0 5 ] ] > < / T e x t > - 
-                 < T e x t   i d = " S i g n e r _ 0 . U s e r . P o s t a l . P O B o x "   r o w = " 0 "   c o l u m n = " 0 "   c o l u m n s p a n = " 0 "   m u l t i l i n e = " F a l s e "   m u l t i l i n e r o w s = " 3 "   l o c k e d = " F a l s e "   l a b e l = " S i g n e r _ 0 . U s e r . P o s t a l . P O B o x "   r e a d o n l y = " F a l s e "   v i s i b l e = " T r u e "   r e q u i r e d = " F a l s e "   r e g e x = " "   v a l i d a t i o n m e s s a g e = " "   t o o l t i p = " "   t r a c k e d = " F a l s e " > < ! [ C D A T A [ P o s t f a c h ] ] > < / T e x t > - 
-                 < T e x t   i d = " S i g n e r _ 0 . U s e r . P o s t a l . S t r e e t "   r o w = " 0 "   c o l u m n = " 0 "   c o l u m n s p a n = " 0 "   m u l t i l i n e = " F a l s e "   m u l t i l i n e r o w s = " 3 "   l o c k e d = " F a l s e "   l a b e l = " S i g n e r _ 0 . U s e r . P o s t a l . S t r e e t "   r e a d o n l y = " F a l s e "   v i s i b l e = " T r u e "   r e q u i r e d = " F a l s e "   r e g e x = " "   v a l i d a t i o n m e s s a g e = " "   t o o l t i p = " "   t r a c k e d = " F a l s e " > < ! [ C D A T A [ S c h a f f h a u s e r s t r a s s e   7 8 ] ] > < / T e x t > - 
-                 < T e x t   i d = " S i g n e r _ 0 . U s e r . P o s t a l . Z i p "   r o w = " 0 "   c o l u m n = " 0 "   c o l u m n s p a n = " 0 "   m u l t i l i n e = " F a l s e "   m u l t i l i n e r o w s = " 3 "   l o c k e d = " F a l s e "   l a b e l = " S i g n e r _ 0 . U s e r . P o s t a l . Z i p "   r e a d o n l y = " F a l s e "   v i s i b l e = " T r u e "   r e q u i r e d = " F a l s e "   r e g e x = " "   v a l i d a t i o n m e s s a g e = " "   t o o l t i p = " "   t r a c k e d = " F a l s e " > < ! [ C D A T A [ 8 0 9 0 ] ] > < / T e x t > - 
-                 < T e x t   i d = " S i g n e r _ 0 . U s e r . S a l u t a t i o n "   r o w = " 0 "   c o l u m n = " 0 "   c o l u m n s p a n = " 0 "   m u l t i l i n e = " F a l s e "   m u l t i l i n e r o w s = " 3 "   l o c k e d = " F a l s e "   l a b e l = " S i g n e r _ 0 . U s e r . S a l u t a t i o n "   r e a d o n l y = " F a l s e "   v i s i b l e = " T r u e "   r e q u i r e d = " F a l s e "   r e g e x = " "   v a l i d a t i o n m e s s a g e = " "   t o o l t i p = " "   t r a c k e d = " F a l s e " > < ! [ C D A T A [ F r a u ] ] > < / T e x t > - 
-                 < T e x t   i d = " S i g n e r _ 0 . U s e r . T i t l e "   r o w = " 0 "   c o l u m n = " 0 "   c o l u m n s p a n = " 0 "   m u l t i l i n e = " F a l s e "   m u l t i l i n e r o w s = " 3 "   l o c k e d = " F a l s e "   l a b e l = " S i g n e r _ 0 . U s e r . T i t l e "   r e a d o n l y = " F a l s e "   v i s i b l e = " T r u e "   r e q u i r e d = " F a l s e "   r e g e x = " "   v a l i d a t i o n m e s s a g e = " "   t o o l t i p = " "   t r a c k e d = " F a l s e " > < ! [ C D A T A [   ] ] > < / T e x t > - 
-                 < T e x t   i d = " S i g n e r _ 0 . U s e r . U r l "   r o w = " 0 "   c o l u m n = " 0 "   c o l u m n s p a n = " 0 "   m u l t i l i n e = " F a l s e "   m u l t i l i n e r o w s = " 3 "   l o c k e d = " F a l s e "   l a b e l = " S i g n e r _ 0 . U s e r . U r l "   r e a d o n l y = " F a l s e "   v i s i b l e = " T r u e "   r e q u i r e d = " F a l s e "   r e g e x = " "   v a l i d a t i o n m e s s a g e = " "   t o o l t i p = " "   t r a c k e d = " F a l s e " > < ! [ C D A T A [ w w w . s o z i a l a m t . z h . c h ] ] > < / T e x t > - 
-             < / S i g n e r _ 0 > - 
-             < S i g n e r _ 1   w i n d o w w i d t h = " 0 "   w i n d o w h e i g h t = " 0 "   m i n w i n d o w w i d t h = " 0 "   m a x w i n d o w w i d t h = " 0 "   m i n w i n d o w h e i g h t = " 0 "   m a x w i n d o w h e i g h t = " 0 " > - 
-                 < T e x t   i d = " S i g n e r _ 1 . I d "   r o w = " 0 "   c o l u m n = " 0 "   c o l u m n s p a n = " 0 "   m u l t i l i n e = " F a l s e "   m u l t i l i n e r o w s = " 3 "   l o c k e d = " F a l s e "   l a b e l = " S i g n e r _ 1 . I d "   r e a d o n l y = " F a l s e "   v i s i b l e = " T r u e "   r e q u i r e d = " F a l s e "   r e g e x = " "   v a l i d a t i o n m e s s a g e = " "   t o o l t i p = " "   t r a c k e d = " F a l s e " > < ! [ C D A T A [ 0 0 0 0 0 0 0 0 - 0 0 0 0 - 0 0 0 0 - 0 0 0 0 - 0 0 0 0 0 0 0 0 0 0 0 0 ] ] > < / T e x t > - 
-                 < T e x t   i d = " S i g n e r _ 1 . O r g a n i z a t i o n U n i t I d "   r o w = " 0 "   c o l u m n = " 0 "   c o l u m n s p a n = " 0 "   m u l t i l i n e = " F a l s e "   m u l t i l i n e r o w s = " 3 "   l o c k e d = " F a l s e "   l a b e l = " S i g n e r _ 1 . O r g a n i z a t i o n U n i t I d "   r e a d o n l y = " F a l s e "   v i s i b l e = " T r u e "   r e q u i r e d = " F a l s e "   r e g e x = " "   v a l i d a t i o n m e s s a g e = " "   t o o l t i p = " "   t r a c k e d = " F a l s e " > < ! [ C D A T A [   ] ] > < / T e x t > - 
-                 < T e x t   i d = " S i g n e r _ 1 . O r g . P o s t a l . C o u n t r y "   r o w = " 0 "   c o l u m n = " 0 "   c o l u m n s p a n = " 0 "   m u l t i l i n e = " F a l s e "   m u l t i l i n e r o w s = " 3 "   l o c k e d = " F a l s e "   l a b e l = " S i g n e r _ 1 . O r g . P o s t a l . C o u n t r y "   r e a d o n l y = " F a l s e "   v i s i b l e = " T r u e "   r e q u i r e d = " F a l s e "   r e g e x = " "   v a l i d a t i o n m e s s a g e = " "   t o o l t i p = " "   t r a c k e d = " F a l s e " > < ! [ C D A T A [   ] ] > < / T e x t > - 
-                 < T e x t   i d = " S i g n e r _ 1 . O r g . P o s t a l . L Z i p "   r o w = " 0 "   c o l u m n = " 0 "   c o l u m n s p a n = " 0 "   m u l t i l i n e = " F a l s e "   m u l t i l i n e r o w s = " 3 "   l o c k e d = " F a l s e "   l a b e l = " S i g n e r _ 1 . O r g . P o s t a l . L Z i p "   r e a d o n l y = " F a l s e "   v i s i b l e = " T r u e "   r e q u i r e d = " F a l s e "   r e g e x = " "   v a l i d a t i o n m e s s a g e = " "   t o o l t i p = " "   t r a c k e d = " F a l s e " > < ! [ C D A T A [   ] ] > < / T e x t > - 
-                 < T e x t   i d = " S i g n e r _ 1 . O r g . T i t l e "   r o w = " 0 "   c o l u m n = " 0 "   c o l u m n s p a n = " 0 "   m u l t i l i n e = " F a l s e "   m u l t i l i n e r o w s = " 3 "   l o c k e d = " F a l s e "   l a b e l = " S i g n e r _ 1 . O r g . T i t l e "   r e a d o n l y = " F a l s e "   v i s i b l e = " T r u e "   r e q u i r e d = " F a l s e "   r e g e x = " "   v a l i d a t i o n m e s s a g e = " "   t o o l t i p = " "   t r a c k e d = " F a l s e " > < ! [ C D A T A [   ] ] > < / T e x t > - 
-                 < T e x t   i d = " S i g n e r _ 1 . U s e r . A l i a s "   r o w = " 0 "   c o l u m n = " 0 "   c o l u m n s p a n = " 0 "   m u l t i l i n e = " F a l s e "   m u l t i l i n e r o w s = " 3 "   l o c k e d = " F a l s e "   l a b e l = " S i g n e r _ 1 . U s e r . A l i a s "   r e a d o n l y = " F a l s e "   v i s i b l e = " T r u e "   r e q u i r e d = " F a l s e "   r e g e x = " "   v a l i d a t i o n m e s s a g e = " "   t o o l t i p = " "   t r a c k e d = " F a l s e " > < ! [ C D A T A [   ] ] > < / T e x t > - 
-                 < T e x t   i d = " S i g n e r _ 1 . U s e r . E m a i l "   r o w = " 0 "   c o l u m n = " 0 "   c o l u m n s p a n = " 0 "   m u l t i l i n e = " F a l s e "   m u l t i l i n e r o w s = " 3 "   l o c k e d = " F a l s e "   l a b e l = " S i g n e r _ 1 . U s e r . E m a i l "   r e a d o n l y = " F a l s e "   v i s i b l e = " T r u e "   r e q u i r e d = " F a l s e "   r e g e x = " "   v a l i d a t i o n m e s s a g e = " "   t o o l t i p = " "   t r a c k e d = " F a l s e " > < ! [ C D A T A [   ] ] > < / T e x t > - 
-                 < T e x t   i d = " S i g n e r _ 1 . U s e r . F a x "   r o w = " 0 "   c o l u m n = " 0 "   c o l u m n s p a n = " 0 "   m u l t i l i n e = " F a l s e "   m u l t i l i n e r o w s = " 3 "   l o c k e d = " F a l s e "   l a b e l = " S i g n e r _ 1 . U s e r . F a x "   r e a d o n l y = " F a l s e "   v i s i b l e = " T r u e "   r e q u i r e d = " F a l s e "   r e g e x = " "   v a l i d a t i o n m e s s a g e = " "   t o o l t i p = " "   t r a c k e d = " F a l s e " > < ! [ C D A T A [   ] ] > < / T e x t > - 
-                 < T e x t   i d = " S i g n e r _ 1 . U s e r . F i r s t N a m e "   r o w = " 0 "   c o l u m n = " 0 "   c o l u m n s p a n = " 0 "   m u l t i l i n e = " F a l s e "   m u l t i l i n e r o w s = " 3 "   l o c k e d = " F a l s e "   l a b e l = " S i g n e r _ 1 . U s e r . F i r s t N a m e "   r e a d o n l y = " F a l s e "   v i s i b l e = " T r u e "   r e q u i r e d = " F a l s e "   r e g e x = " "   v a l i d a t i o n m e s s a g e = " "   t o o l t i p = " "   t r a c k e d = " F a l s e " > < ! [ C D A T A [   ] ] > < / T e x t > - 
-                 < T e x t   i d = " S i g n e r _ 1 . U s e r . F u n c t i o n "   r o w = " 0 "   c o l u m n = " 0 "   c o l u m n s p a n = " 0 "   m u l t i l i n e = " F a l s e "   m u l t i l i n e r o w s = " 3 "   l o c k e d = " F a l s e "   l a b e l = " S i g n e r _ 1 . U s e r . F u n c t i o n "   r e a d o n l y = " F a l s e "   v i s i b l e = " T r u e "   r e q u i r e d = " F a l s e "   r e g e x = " "   v a l i d a t i o n m e s s a g e = " "   t o o l t i p = " "   t r a c k e d = " F a l s e " > < ! [ C D A T A [   ] ] > < / T e x t > - 
-                 < T e x t   i d = " S i g n e r _ 1 . U s e r . J o b D e s c r i p t i o n "   r o w = " 0 "   c o l u m n = " 0 "   c o l u m n s p a n = " 0 "   m u l t i l i n e = " F a l s e "   m u l t i l i n e r o w s = " 3 "   l o c k e d = " F a l s e "   l a b e l = " S i g n e r _ 1 . U s e r . J o b D e s c r i p t i o n "   r e a d o n l y = " F a l s e "   v i s i b l e = " T r u e "   r e q u i r e d = " F a l s e "   r e g e x = " "   v a l i d a t i o n m e s s a g e = " "   t o o l t i p = " "   t r a c k e d = " F a l s e " > < ! [ C D A T A [   ] ] > < / T e x t > - 
-                 < T e x t   i d = " S i g n e r _ 1 . U s e r . L a s t N a m e "   r o w = " 0 "   c o l u m n = " 0 "   c o l u m n s p a n = " 0 "   m u l t i l i n e = " F a l s e "   m u l t i l i n e r o w s = " 3 "   l o c k e d = " F a l s e "   l a b e l = " S i g n e r _ 1 . U s e r . L a s t N a m e "   r e a d o n l y = " F a l s e "   v i s i b l e = " T r u e "   r e q u i r e d = " F a l s e "   r e g e x = " "   v a l i d a t i o n m e s s a g e = " "   t o o l t i p = " "   t r a c k e d = " F a l s e " > < ! [ C D A T A [   ] ] > < / T e x t > - 
-                 < T e x t   i d = " S i g n e r _ 1 . U s e r . O u L e v 1 "   r o w = " 0 "   c o l u m n = " 0 "   c o l u m n s p a n = " 0 "   m u l t i l i n e = " F a l s e "   m u l t i l i n e r o w s = " 3 "   l o c k e d = " F a l s e "   l a b e l = " S i g n e r _ 1 . U s e r . O u L e v 1 "   r e a d o n l y = " F a l s e "   v i s i b l e = " T r u e "   r e q u i r e d = " F a l s e "   r e g e x = " "   v a l i d a t i o n m e s s a g e = " "   t o o l t i p = " "   t r a c k e d = " F a l s e " > < ! [ C D A T A [   ] ] > < / T e x t > - 
-                 < T e x t   i d = " S i g n e r _ 1 . U s e r . O u L e v 2 "   r o w = " 0 "   c o l u m n = " 0 "   c o l u m n s p a n = " 0 "   m u l t i l i n e = " F a l s e "   m u l t i l i n e r o w s = " 3 "   l o c k e d = " F a l s e "   l a b e l = " S i g n e r _ 1 . U s e r . O u L e v 2 "   r e a d o n l y = " F a l s e "   v i s i b l e = " T r u e "   r e q u i r e d = " F a l s e "   r e g e x = " "   v a l i d a t i o n m e s s a g e = " "   t o o l t i p = " "   t r a c k e d = " F a l s e " > < ! [ C D A T A [   ] ] > < / T e x t > - 
-                 < T e x t   i d = " S i g n e r _ 1 . U s e r . O u L e v 3 "   r o w = " 0 "   c o l u m n = " 0 "   c o l u m n s p a n = " 0 "   m u l t i l i n e = " F a l s e "   m u l t i l i n e r o w s = " 3 "   l o c k e d = " F a l s e "   l a b e l = " S i g n e r _ 1 . U s e r . O u L e v 3 "   r e a d o n l y = " F a l s e "   v i s i b l e = " T r u e "   r e q u i r e d = " F a l s e "   r e g e x = " "   v a l i d a t i o n m e s s a g e = " "   t o o l t i p = " "   t r a c k e d = " F a l s e " > < ! [ C D A T A [   ] ] > < / T e x t > - 
-                 < T e x t   i d = " S i g n e r _ 1 . U s e r . O u L e v 4 "   r o w = " 0 "   c o l u m n = " 0 "   c o l u m n s p a n = " 0 "   m u l t i l i n e = " F a l s e "   m u l t i l i n e r o w s = " 3 "   l o c k e d = " F a l s e "   l a b e l = " S i g n e r _ 1 . U s e r . O u L e v 4 "   r e a d o n l y = " F a l s e "   v i s i b l e = " T r u e "   r e q u i r e d = " F a l s e "   r e g e x = " "   v a l i d a t i o n m e s s a g e = " "   t o o l t i p = " "   t r a c k e d = " F a l s e " > < ! [ C D A T A [   ] ] > < / T e x t > - 
-                 < T e x t   i d = " S i g n e r _ 1 . U s e r . O u L e v 5 "   r o w = " 0 "   c o l u m n = " 0 "   c o l u m n s p a n = " 0 "   m u l t i l i n e = " F a l s e "   m u l t i l i n e r o w s = " 3 "   l o c k e d = " F a l s e "   l a b e l = " S i g n e r _ 1 . U s e r . O u L e v 5 "   r e a d o n l y = " F a l s e "   v i s i b l e = " T r u e "   r e q u i r e d = " F a l s e "   r e g e x = " "   v a l i d a t i o n m e s s a g e = " "   t o o l t i p = " "   t r a c k e d = " F a l s e " > < ! [ C D A T A [   ] ] > < / T e x t > - 
-                 < T e x t   i d = " S i g n e r _ 1 . U s e r . O u L e v 6 "   r o w = " 0 "   c o l u m n = " 0 "   c o l u m n s p a n = " 0 "   m u l t i l i n e = " F a l s e "   m u l t i l i n e r o w s = " 3 "   l o c k e d = " F a l s e "   l a b e l = " S i g n e r _ 1 . U s e r . O u L e v 6 "   r e a d o n l y = " F a l s e "   v i s i b l e = " T r u e "   r e q u i r e d = " F a l s e "   r e g e x = " "   v a l i d a t i o n m e s s a g e = " "   t o o l t i p = " "   t r a c k e d = " F a l s e " > < ! [ C D A T A [   ] ] > < / T e x t > - 
-                 < T e x t   i d = " S i g n e r _ 1 . U s e r . O u L e v 7 "   r o w = " 0 "   c o l u m n = " 0 "   c o l u m n s p a n = " 0 "   m u l t i l i n e = " F a l s e "   m u l t i l i n e r o w s = " 3 "   l o c k e d = " F a l s e "   l a b e l = " S i g n e r _ 1 . U s e r . O u L e v 7 "   r e a d o n l y = " F a l s e "   v i s i b l e = " T r u e "   r e q u i r e d = " F a l s e "   r e g e x = " "   v a l i d a t i o n m e s s a g e = " "   t o o l t i p = " "   t r a c k e d = " F a l s e " > < ! [ C D A T A [   ] ] > < / T e x t > - 
-                 < T e x t   i d = " S i g n e r _ 1 . U s e r . O u M a i l "   r o w = " 0 "   c o l u m n = " 0 "   c o l u m n s p a n = " 0 "   m u l t i l i n e = " F a l s e "   m u l t i l i n e r o w s = " 3 "   l o c k e d = " F a l s e "   l a b e l = " S i g n e r _ 1 . U s e r . O u M a i l "   r e a d o n l y = " F a l s e "   v i s i b l e = " T r u e "   r e q u i r e d = " F a l s e "   r e g e x = " "   v a l i d a t i o n m e s s a g e = " "   t o o l t i p = " "   t r a c k e d = " F a l s e " > < ! [ C D A T A [   ] ] > < / T e x t > - 
-                 < T e x t   i d = " S i g n e r _ 1 . U s e r . O u P h o n e "   r o w = " 0 "   c o l u m n = " 0 "   c o l u m n s p a n = " 0 "   m u l t i l i n e = " F a l s e "   m u l t i l i n e r o w s = " 3 "   l o c k e d = " F a l s e "   l a b e l = " S i g n e r _ 1 . U s e r . O u P h o n e "   r e a d o n l y = " F a l s e "   v i s i b l e = " T r u e "   r e q u i r e d = " F a l s e "   r e g e x = " "   v a l i d a t i o n m e s s a g e = " "   t o o l t i p = " "   t r a c k e d = " F a l s e " > < ! [ C D A T A [   ] ] > < / T e x t > - 
-                 < T e x t   i d = " S i g n e r _ 1 . U s e r . P h o n e "   r o w = " 0 "   c o l u m n = " 0 "   c o l u m n s p a n = " 0 "   m u l t i l i n e = " F a l s e "   m u l t i l i n e r o w s = " 3 "   l o c k e d = " F a l s e "   l a b e l = " S i g n e r _ 1 . U s e r . P h o n e "   r e a d o n l y = " F a l s e "   v i s i b l e = " T r u e "   r e q u i r e d = " F a l s e "   r e g e x = " "   v a l i d a t i o n m e s s a g e = " "   t o o l t i p = " "   t r a c k e d = " F a l s e " > < ! [ C D A T A [   ] ] > < / T e x t > - 
-                 < T e x t   i d = " S i g n e r _ 1 . U s e r . P o s t a l . C i t y "   r o w = " 0 "   c o l u m n = " 0 "   c o l u m n s p a n = " 0 "   m u l t i l i n e = " F a l s e "   m u l t i l i n e r o w s = " 3 "   l o c k e d = " F a l s e "   l a b e l = " S i g n e r _ 1 . U s e r . P o s t a l . C i t y "   r e a d o n l y = " F a l s e "   v i s i b l e = " T r u e "   r e q u i r e d = " F a l s e "   r e g e x = " "   v a l i d a t i o n m e s s a g e = " "   t o o l t i p = " "   t r a c k e d = " F a l s e " > < ! [ C D A T A [   ] ] > < / T e x t > - 
-                 < T e x t   i d = " S i g n e r _ 1 . U s e r . P o s t a l . O f f i c e N a m e "   r o w = " 0 "   c o l u m n = " 0 "   c o l u m n s p a n = " 0 "   m u l t i l i n e = " F a l s e "   m u l t i l i n e r o w s = " 3 "   l o c k e d = " F a l s e "   l a b e l = " S i g n e r _ 1 . U s e r . P o s t a l . O f f i c e N a m e "   r e a d o n l y = " F a l s e "   v i s i b l e = " T r u e "   r e q u i r e d = " F a l s e "   r e g e x = " "   v a l i d a t i o n m e s s a g e = " "   t o o l t i p = " "   t r a c k e d = " F a l s e " > < ! [ C D A T A [   ] ] > < / T e x t > - 
-                 < T e x t   i d = " S i g n e r _ 1 . U s e r . P o s t a l . P O B o x "   r o w = " 0 "   c o l u m n = " 0 "   c o l u m n s p a n = " 0 "   m u l t i l i n e = " F a l s e "   m u l t i l i n e r o w s = " 3 "   l o c k e d = " F a l s e "   l a b e l = " S i g n e r _ 1 . U s e r . P o s t a l . P O B o x "   r e a d o n l y = " F a l s e "   v i s i b l e = " T r u e "   r e q u i r e d = " F a l s e "   r e g e x = " "   v a l i d a t i o n m e s s a g e = " "   t o o l t i p = " "   t r a c k e d = " F a l s e " > < ! [ C D A T A [   ] ] > < / T e x t > - 
-                 < T e x t   i d = " S i g n e r _ 1 . U s e r . P o s t a l . S t r e e t "   r o w = " 0 "   c o l u m n = " 0 "   c o l u m n s p a n = " 0 "   m u l t i l i n e = " F a l s e "   m u l t i l i n e r o w s = " 3 "   l o c k e d = " F a l s e "   l a b e l = " S i g n e r _ 1 . U s e r . P o s t a l . S t r e e t "   r e a d o n l y = " F a l s e "   v i s i b l e = " T r u e "   r e q u i r e d = " F a l s e "   r e g e x = " "   v a l i d a t i o n m e s s a g e = " "   t o o l t i p = " "   t r a c k e d = " F a l s e " > < ! [ C D A T A [   ] ] > < / T e x t > - 
-                 < T e x t   i d = " S i g n e r _ 1 . U s e r . P o s t a l . Z i p "   r o w = " 0 "   c o l u m n = " 0 "   c o l u m n s p a n = " 0 "   m u l t i l i n e = " F a l s e "   m u l t i l i n e r o w s = " 3 "   l o c k e d = " F a l s e "   l a b e l = " S i g n e r _ 1 . U s e r . P o s t a l . Z i p "   r e a d o n l y = " F a l s e "   v i s i b l e = " T r u e "   r e q u i r e d = " F a l s e "   r e g e x = " "   v a l i d a t i o n m e s s a g e = " "   t o o l t i p = " "   t r a c k e d = " F a l s e " > < ! [ C D A T A [   ] ] > < / T e x t > - 
-                 < T e x t   i d = " S i g n e r _ 1 . U s e r . S a l u t a t i o n "   r o w = " 0 "   c o l u m n = " 0 "   c o l u m n s p a n = " 0 "   m u l t i l i n e = " F a l s e "   m u l t i l i n e r o w s = " 3 "   l o c k e d = " F a l s e "   l a b e l = " S i g n e r _ 1 . U s e r . S a l u t a t i o n "   r e a d o n l y = " F a l s e "   v i s i b l e = " T r u e "   r e q u i r e d = " F a l s e "   r e g e x = " "   v a l i d a t i o n m e s s a g e = " "   t o o l t i p = " "   t r a c k e d = " F a l s e " > < ! [ C D A T A [   ] ] > < / T e x t > - 
-                 < T e x t   i d = " S i g n e r _ 1 . U s e r . T i t l e "   r o w = " 0 "   c o l u m n = " 0 "   c o l u m n s p a n = " 0 "   m u l t i l i n e = " F a l s e "   m u l t i l i n e r o w s = " 3 "   l o c k e d = " F a l s e "   l a b e l = " S i g n e r _ 1 . U s e r . T i t l e "   r e a d o n l y = " F a l s e "   v i s i b l e = " T r u e "   r e q u i r e d = " F a l s e "   r e g e x = " "   v a l i d a t i o n m e s s a g e = " "   t o o l t i p = " "   t r a c k e d = " F a l s e " > < ! [ C D A T A [   ] ] > < / T e x t > - 
-                 < T e x t   i d = " S i g n e r _ 1 . U s e r . U r l "   r o w = " 0 "   c o l u m n = " 0 "   c o l u m n s p a n = " 0 "   m u l t i l i n e = " F a l s e "   m u l t i l i n e r o w s = " 3 "   l o c k e d = " F a l s e "   l a b e l = " S i g n e r _ 1 . U s e r . U r l "   r e a d o n l y = " F a l s e "   v i s i b l e = " T r u e "   r e q u i r e d = " F a l s e "   r e g e x = " "   v a l i d a t i o n m e s s a g e = " "   t o o l t i p = " "   t r a c k e d = " F a l s e " > < ! [ C D A T A [   ] ] > < / T e x t > - 
-             < / S i g n e r _ 1 > - 
-             < S i g n e r _ 2   w i n d o w w i d t h = " 0 "   w i n d o w h e i g h t = " 0 "   m i n w i n d o w w i d t h = " 0 "   m a x w i n d o w w i d t h = " 0 "   m i n w i n d o w h e i g h t = " 0 "   m a x w i n d o w h e i g h t = " 0 " > - 
-                 < T e x t   i d = " S i g n e r _ 2 . I d "   r o w = " 0 "   c o l u m n = " 0 "   c o l u m n s p a n = " 0 "   m u l t i l i n e = " F a l s e "   m u l t i l i n e r o w s = " 3 "   l o c k e d = " F a l s e "   l a b e l = " S i g n e r _ 2 . I d "   r e a d o n l y = " F a l s e "   v i s i b l e = " T r u e "   r e q u i r e d = " F a l s e "   r e g e x = " "   v a l i d a t i o n m e s s a g e = " "   t o o l t i p = " "   t r a c k e d = " F a l s e " > < ! [ C D A T A [ 0 0 0 0 0 0 0 0 - 0 0 0 0 - 0 0 0 0 - 0 0 0 0 - 0 0 0 0 0 0 0 0 0 0 0 0 ] ] > < / T e x t > - 
-                 < T e x t   i d = " S i g n e r _ 2 . O r g a n i z a t i o n U n i t I d "   r o w = " 0 "   c o l u m n = " 0 "   c o l u m n s p a n = " 0 "   m u l t i l i n e = " F a l s e "   m u l t i l i n e r o w s = " 3 "   l o c k e d = " F a l s e "   l a b e l = " S i g n e r _ 2 . O r g a n i z a t i o n U n i t I d "   r e a d o n l y = " F a l s e "   v i s i b l e = " T r u e "   r e q u i r e d = " F a l s e "   r e g e x = " "   v a l i d a t i o n m e s s a g e = " "   t o o l t i p = " "   t r a c k e d = " F a l s e " > < ! [ C D A T A [   ] ] > < / T e x t > - 
-                 < T e x t   i d = " S i g n e r _ 2 . O r g . P o s t a l . C o u n t r y "   r o w = " 0 "   c o l u m n = " 0 "   c o l u m n s p a n = " 0 "   m u l t i l i n e = " F a l s e "   m u l t i l i n e r o w s = " 3 "   l o c k e d = " F a l s e "   l a b e l = " S i g n e r _ 2 . O r g . P o s t a l . C o u n t r y "   r e a d o n l y = " F a l s e "   v i s i b l e = " T r u e "   r e q u i r e d = " F a l s e "   r e g e x = " "   v a l i d a t i o n m e s s a g e = " "   t o o l t i p = " "   t r a c k e d = " F a l s e " > < ! [ C D A T A [   ] ] > < / T e x t > - 
-                 < T e x t   i d = " S i g n e r _ 2 . O r g . P o s t a l . L Z i p "   r o w = " 0 "   c o l u m n = " 0 "   c o l u m n s p a n = " 0 "   m u l t i l i n e = " F a l s e "   m u l t i l i n e r o w s = " 3 "   l o c k e d = " F a l s e "   l a b e l = " S i g n e r _ 2 . O r g . P o s t a l . L Z i p "   r e a d o n l y = " F a l s e "   v i s i b l e = " T r u e "   r e q u i r e d = " F a l s e "   r e g e x = " "   v a l i d a t i o n m e s s a g e = " "   t o o l t i p = " "   t r a c k e d = " F a l s e " > < ! [ C D A T A [   ] ] > < / T e x t > - 
-                 < T e x t   i d = " S i g n e r _ 2 . O r g . T i t l e "   r o w = " 0 "   c o l u m n = " 0 "   c o l u m n s p a n = " 0 "   m u l t i l i n e = " F a l s e "   m u l t i l i n e r o w s = " 3 "   l o c k e d = " F a l s e "   l a b e l = " S i g n e r _ 2 . O r g . T i t l e "   r e a d o n l y = " F a l s e "   v i s i b l e = " T r u e "   r e q u i r e d = " F a l s e "   r e g e x = " "   v a l i d a t i o n m e s s a g e = " "   t o o l t i p = " "   t r a c k e d = " F a l s e " > < ! [ C D A T A [   ] ] > < / T e x t > - 
-                 < T e x t   i d = " S i g n e r _ 2 . U s e r . A l i a s "   r o w = " 0 "   c o l u m n = " 0 "   c o l u m n s p a n = " 0 "   m u l t i l i n e = " F a l s e "   m u l t i l i n e r o w s = " 3 "   l o c k e d = " F a l s e "   l a b e l = " S i g n e r _ 2 . U s e r . A l i a s "   r e a d o n l y = " F a l s e "   v i s i b l e = " T r u e "   r e q u i r e d = " F a l s e "   r e g e x = " "   v a l i d a t i o n m e s s a g e = " "   t o o l t i p = " "   t r a c k e d = " F a l s e " > < ! [ C D A T A [   ] ] > < / T e x t > - 
-                 < T e x t   i d = " S i g n e r _ 2 . U s e r . E m a i l "   r o w = " 0 "   c o l u m n = " 0 "   c o l u m n s p a n = " 0 "   m u l t i l i n e = " F a l s e "   m u l t i l i n e r o w s = " 3 "   l o c k e d = " F a l s e "   l a b e l = " S i g n e r _ 2 . U s e r . E m a i l "   r e a d o n l y = " F a l s e "   v i s i b l e = " T r u e "   r e q u i r e d = " F a l s e "   r e g e x = " "   v a l i d a t i o n m e s s a g e = " "   t o o l t i p = " "   t r a c k e d = " F a l s e " > < ! [ C D A T A [   ] ] > < / T e x t > - 
-                 < T e x t   i d = " S i g n e r _ 2 . U s e r . F a x "   r o w = " 0 "   c o l u m n = " 0 "   c o l u m n s p a n = " 0 "   m u l t i l i n e = " F a l s e "   m u l t i l i n e r o w s = " 3 "   l o c k e d = " F a l s e "   l a b e l = " S i g n e r _ 2 . U s e r . F a x "   r e a d o n l y = " F a l s e "   v i s i b l e = " T r u e "   r e q u i r e d = " F a l s e "   r e g e x = " "   v a l i d a t i o n m e s s a g e = " "   t o o l t i p = " "   t r a c k e d = " F a l s e " > < ! [ C D A T A [   ] ] > < / T e x t > - 
-                 < T e x t   i d = " S i g n e r _ 2 . U s e r . F i r s t N a m e "   r o w = " 0 "   c o l u m n = " 0 "   c o l u m n s p a n = " 0 "   m u l t i l i n e = " F a l s e "   m u l t i l i n e r o w s = " 3 "   l o c k e d = " F a l s e "   l a b e l = " S i g n e r _ 2 . U s e r . F i r s t N a m e "   r e a d o n l y = " F a l s e "   v i s i b l e = " T r u e "   r e q u i r e d = " F a l s e "   r e g e x = " "   v a l i d a t i o n m e s s a g e = " "   t o o l t i p = " "   t r a c k e d = " F a l s e " > < ! [ C D A T A [   ] ] > < / T e x t > - 
-                 < T e x t   i d = " S i g n e r _ 2 . U s e r . F u n c t i o n "   r o w = " 0 "   c o l u m n = " 0 "   c o l u m n s p a n = " 0 "   m u l t i l i n e = " F a l s e "   m u l t i l i n e r o w s = " 3 "   l o c k e d = " F a l s e "   l a b e l = " S i g n e r _ 2 . U s e r . F u n c t i o n "   r e a d o n l y = " F a l s e "   v i s i b l e = " T r u e "   r e q u i r e d = " F a l s e "   r e g e x = " "   v a l i d a t i o n m e s s a g e = " "   t o o l t i p = " "   t r a c k e d = " F a l s e " > < ! [ C D A T A [   ] ] > < / T e x t > - 
-                 < T e x t   i d = " S i g n e r _ 2 . U s e r . J o b D e s c r i p t i o n "   r o w = " 0 "   c o l u m n = " 0 "   c o l u m n s p a n = " 0 "   m u l t i l i n e = " F a l s e "   m u l t i l i n e r o w s = " 3 "   l o c k e d = " F a l s e "   l a b e l = " S i g n e r _ 2 . U s e r . J o b D e s c r i p t i o n "   r e a d o n l y = " F a l s e "   v i s i b l e = " T r u e "   r e q u i r e d = " F a l s e "   r e g e x = " "   v a l i d a t i o n m e s s a g e = " "   t o o l t i p = " "   t r a c k e d = " F a l s e " > < ! [ C D A T A [   ] ] > < / T e x t > - 
-                 < T e x t   i d = " S i g n e r _ 2 . U s e r . L a s t N a m e "   r o w = " 0 "   c o l u m n = " 0 "   c o l u m n s p a n = " 0 "   m u l t i l i n e = " F a l s e "   m u l t i l i n e r o w s = " 3 "   l o c k e d = " F a l s e "   l a b e l = " S i g n e r _ 2 . U s e r . L a s t N a m e "   r e a d o n l y = " F a l s e "   v i s i b l e = " T r u e "   r e q u i r e d = " F a l s e "   r e g e x = " "   v a l i d a t i o n m e s s a g e = " "   t o o l t i p = " "   t r a c k e d = " F a l s e " > < ! [ C D A T A [   ] ] > < / T e x t > - 
-                 < T e x t   i d = " S i g n e r _ 2 . U s e r . O u L e v 1 "   r o w = " 0 "   c o l u m n = " 0 "   c o l u m n s p a n = " 0 "   m u l t i l i n e = " F a l s e "   m u l t i l i n e r o w s = " 3 "   l o c k e d = " F a l s e "   l a b e l = " S i g n e r _ 2 . U s e r . O u L e v 1 "   r e a d o n l y = " F a l s e "   v i s i b l e = " T r u e "   r e q u i r e d = " F a l s e "   r e g e x = " "   v a l i d a t i o n m e s s a g e = " "   t o o l t i p = " "   t r a c k e d = " F a l s e " > < ! [ C D A T A [   ] ] > < / T e x t > - 
-                 < T e x t   i d = " S i g n e r _ 2 . U s e r . O u L e v 2 "   r o w = " 0 "   c o l u m n = " 0 "   c o l u m n s p a n = " 0 "   m u l t i l i n e = " F a l s e "   m u l t i l i n e r o w s = " 3 "   l o c k e d = " F a l s e "   l a b e l = " S i g n e r _ 2 . U s e r . O u L e v 2 "   r e a d o n l y = " F a l s e "   v i s i b l e = " T r u e "   r e q u i r e d = " F a l s e "   r e g e x = " "   v a l i d a t i o n m e s s a g e = " "   t o o l t i p = " "   t r a c k e d = " F a l s e " > < ! [ C D A T A [   ] ] > < / T e x t > - 
-                 < T e x t   i d = " S i g n e r _ 2 . U s e r . O u L e v 3 "   r o w = " 0 "   c o l u m n = " 0 "   c o l u m n s p a n = " 0 "   m u l t i l i n e = " F a l s e "   m u l t i l i n e r o w s = " 3 "   l o c k e d = " F a l s e "   l a b e l = " S i g n e r _ 2 . U s e r . O u L e v 3 "   r e a d o n l y = " F a l s e "   v i s i b l e = " T r u e "   r e q u i r e d = " F a l s e "   r e g e x = " "   v a l i d a t i o n m e s s a g e = " "   t o o l t i p = " "   t r a c k e d = " F a l s e " > < ! [ C D A T A [   ] ] > < / T e x t > - 
-                 < T e x t   i d = " S i g n e r _ 2 . U s e r . O u L e v 4 "   r o w = " 0 "   c o l u m n = " 0 "   c o l u m n s p a n = " 0 "   m u l t i l i n e = " F a l s e "   m u l t i l i n e r o w s = " 3 "   l o c k e d = " F a l s e "   l a b e l = " S i g n e r _ 2 . U s e r . O u L e v 4 "   r e a d o n l y = " F a l s e "   v i s i b l e = " T r u e "   r e q u i r e d = " F a l s e "   r e g e x = " "   v a l i d a t i o n m e s s a g e = " "   t o o l t i p = " "   t r a c k e d = " F a l s e " > < ! [ C D A T A [   ] ] > < / T e x t > - 
-                 < T e x t   i d = " S i g n e r _ 2 . U s e r . O u L e v 5 "   r o w = " 0 "   c o l u m n = " 0 "   c o l u m n s p a n = " 0 "   m u l t i l i n e = " F a l s e "   m u l t i l i n e r o w s = " 3 "   l o c k e d = " F a l s e "   l a b e l = " S i g n e r _ 2 . U s e r . O u L e v 5 "   r e a d o n l y = " F a l s e "   v i s i b l e = " T r u e "   r e q u i r e d = " F a l s e "   r e g e x = " "   v a l i d a t i o n m e s s a g e = " "   t o o l t i p = " "   t r a c k e d = " F a l s e " > < ! [ C D A T A [   ] ] > < / T e x t > - 
-                 < T e x t   i d = " S i g n e r _ 2 . U s e r . O u L e v 6 "   r o w = " 0 "   c o l u m n = " 0 "   c o l u m n s p a n = " 0 "   m u l t i l i n e = " F a l s e "   m u l t i l i n e r o w s = " 3 "   l o c k e d = " F a l s e "   l a b e l = " S i g n e r _ 2 . U s e r . O u L e v 6 "   r e a d o n l y = " F a l s e "   v i s i b l e = " T r u e "   r e q u i r e d = " F a l s e "   r e g e x = " "   v a l i d a t i o n m e s s a g e = " "   t o o l t i p = " "   t r a c k e d = " F a l s e " > < ! [ C D A T A [   ] ] > < / T e x t > - 
-                 < T e x t   i d = " S i g n e r _ 2 . U s e r . O u L e v 7 "   r o w = " 0 "   c o l u m n = " 0 "   c o l u m n s p a n = " 0 "   m u l t i l i n e = " F a l s e "   m u l t i l i n e r o w s = " 3 "   l o c k e d = " F a l s e "   l a b e l = " S i g n e r _ 2 . U s e r . O u L e v 7 "   r e a d o n l y = " F a l s e "   v i s i b l e = " T r u e "   r e q u i r e d = " F a l s e "   r e g e x = " "   v a l i d a t i o n m e s s a g e = " "   t o o l t i p = " "   t r a c k e d = " F a l s e " > < ! [ C D A T A [   ] ] > < / T e x t > - 
-                 < T e x t   i d = " S i g n e r _ 2 . U s e r . O u M a i l "   r o w = " 0 "   c o l u m n = " 0 "   c o l u m n s p a n = " 0 "   m u l t i l i n e = " F a l s e "   m u l t i l i n e r o w s = " 3 "   l o c k e d = " F a l s e "   l a b e l = " S i g n e r _ 2 . U s e r . O u M a i l "   r e a d o n l y = " F a l s e "   v i s i b l e = " T r u e "   r e q u i r e d = " F a l s e "   r e g e x = " "   v a l i d a t i o n m e s s a g e = " "   t o o l t i p = " "   t r a c k e d = " F a l s e " > < ! [ C D A T A [   ] ] > < / T e x t > - 
-                 < T e x t   i d = " S i g n e r _ 2 . U s e r . O u P h o n e "   r o w = " 0 "   c o l u m n = " 0 "   c o l u m n s p a n = " 0 "   m u l t i l i n e = " F a l s e "   m u l t i l i n e r o w s = " 3 "   l o c k e d = " F a l s e "   l a b e l = " S i g n e r _ 2 . U s e r . O u P h o n e "   r e a d o n l y = " F a l s e "   v i s i b l e = " T r u e "   r e q u i r e d = " F a l s e "   r e g e x = " "   v a l i d a t i o n m e s s a g e = " "   t o o l t i p = " "   t r a c k e d = " F a l s e " > < ! [ C D A T A [   ] ] > < / T e x t > - 
-                 < T e x t   i d = " S i g n e r _ 2 . U s e r . P h o n e "   r o w = " 0 "   c o l u m n = " 0 "   c o l u m n s p a n = " 0 "   m u l t i l i n e = " F a l s e "   m u l t i l i n e r o w s = " 3 "   l o c k e d = " F a l s e "   l a b e l = " S i g n e r _ 2 . U s e r . P h o n e "   r e a d o n l y = " F a l s e "   v i s i b l e = " T r u e "   r e q u i r e d = " F a l s e "   r e g e x = " "   v a l i d a t i o n m e s s a g e = " "   t o o l t i p = " "   t r a c k e d = " F a l s e " > < ! [ C D A T A [   ] ] > < / T e x t > - 
-                 < T e x t   i d = " S i g n e r _ 2 . U s e r . P o s t a l . C i t y "   r o w = " 0 "   c o l u m n = " 0 "   c o l u m n s p a n = " 0 "   m u l t i l i n e = " F a l s e "   m u l t i l i n e r o w s = " 3 "   l o c k e d = " F a l s e "   l a b e l = " S i g n e r _ 2 . U s e r . P o s t a l . C i t y "   r e a d o n l y = " F a l s e "   v i s i b l e = " T r u e "   r e q u i r e d = " F a l s e "   r e g e x = " "   v a l i d a t i o n m e s s a g e = " "   t o o l t i p = " "   t r a c k e d = " F a l s e " > < ! [ C D A T A [   ] ] > < / T e x t > - 
-                 < T e x t   i d = " S i g n e r _ 2 . U s e r . P o s t a l . O f f i c e N a m e "   r o w = " 0 "   c o l u m n = " 0 "   c o l u m n s p a n = " 0 "   m u l t i l i n e = " F a l s e "   m u l t i l i n e r o w s = " 3 "   l o c k e d = " F a l s e "   l a b e l = " S i g n e r _ 2 . U s e r . P o s t a l . O f f i c e N a m e "   r e a d o n l y = " F a l s e "   v i s i b l e = " T r u e "   r e q u i r e d = " F a l s e "   r e g e x = " "   v a l i d a t i o n m e s s a g e = " "   t o o l t i p = " "   t r a c k e d = " F a l s e " > < ! [ C D A T A [   ] ] > < / T e x t > - 
-                 < T e x t   i d = " S i g n e r _ 2 . U s e r . P o s t a l . P O B o x "   r o w = " 0 "   c o l u m n = " 0 "   c o l u m n s p a n = " 0 "   m u l t i l i n e = " F a l s e "   m u l t i l i n e r o w s = " 3 "   l o c k e d = " F a l s e "   l a b e l = " S i g n e r _ 2 . U s e r . P o s t a l . P O B o x "   r e a d o n l y = " F a l s e "   v i s i b l e = " T r u e "   r e q u i r e d = " F a l s e "   r e g e x = " "   v a l i d a t i o n m e s s a g e = " "   t o o l t i p = " "   t r a c k e d = " F a l s e " > < ! [ C D A T A [   ] ] > < / T e x t > - 
-                 < T e x t   i d = " S i g n e r _ 2 . U s e r . P o s t a l . S t r e e t "   r o w = " 0 "   c o l u m n = " 0 "   c o l u m n s p a n = " 0 "   m u l t i l i n e = " F a l s e "   m u l t i l i n e r o w s = " 3 "   l o c k e d = " F a l s e "   l a b e l = " S i g n e r _ 2 . U s e r . P o s t a l . S t r e e t "   r e a d o n l y = " F a l s e "   v i s i b l e = " T r u e "   r e q u i r e d = " F a l s e "   r e g e x = " "   v a l i d a t i o n m e s s a g e = " "   t o o l t i p = " "   t r a c k e d = " F a l s e " > < ! [ C D A T A [   ] ] > < / T e x t > - 
-                 < T e x t   i d = " S i g n e r _ 2 . U s e r . P o s t a l . Z i p "   r o w = " 0 "   c o l u m n = " 0 "   c o l u m n s p a n = " 0 "   m u l t i l i n e = " F a l s e "   m u l t i l i n e r o w s = " 3 "   l o c k e d = " F a l s e "   l a b e l = " S i g n e r _ 2 . U s e r . P o s t a l . Z i p "   r e a d o n l y = " F a l s e "   v i s i b l e = " T r u e "   r e q u i r e d = " F a l s e "   r e g e x = " "   v a l i d a t i o n m e s s a g e = " "   t o o l t i p = " "   t r a c k e d = " F a l s e " > < ! [ C D A T A [   ] ] > < / T e x t > - 
-                 < T e x t   i d = " S i g n e r _ 2 . U s e r . S a l u t a t i o n "   r o w = " 0 "   c o l u m n = " 0 "   c o l u m n s p a n = " 0 "   m u l t i l i n e = " F a l s e "   m u l t i l i n e r o w s = " 3 "   l o c k e d = " F a l s e "   l a b e l = " S i g n e r _ 2 . U s e r . S a l u t a t i o n "   r e a d o n l y = " F a l s e "   v i s i b l e = " T r u e "   r e q u i r e d = " F a l s e "   r e g e x = " "   v a l i d a t i o n m e s s a g e = " "   t o o l t i p = " "   t r a c k e d = " F a l s e " > < ! [ C D A T A [   ] ] > < / T e x t > - 
-                 < T e x t   i d = " S i g n e r _ 2 . U s e r . T i t l e "   r o w = " 0 "   c o l u m n = " 0 "   c o l u m n s p a n = " 0 "   m u l t i l i n e = " F a l s e "   m u l t i l i n e r o w s = " 3 "   l o c k e d = " F a l s e "   l a b e l = " S i g n e r _ 2 . U s e r . T i t l e "   r e a d o n l y = " F a l s e "   v i s i b l e = " T r u e "   r e q u i r e d = " F a l s e "   r e g e x = " "   v a l i d a t i o n m e s s a g e = " "   t o o l t i p = " "   t r a c k e d = " F a l s e " > < ! [ C D A T A [   ] ] > < / T e x t > - 
-                 < T e x t   i d = " S i g n e r _ 2 . U s e r . U r l "   r o w = " 0 "   c o l u m n = " 0 "   c o l u m n s p a n = " 0 "   m u l t i l i n e = " F a l s e "   m u l t i l i n e r o w s = " 3 "   l o c k e d = " F a l s e "   l a b e l = " S i g n e r _ 2 . U s e r . U r l "   r e a d o n l y = " F a l s e "   v i s i b l e = " T r u e "   r e q u i r e d = " F a l s e "   r e g e x = " "   v a l i d a t i o n m e s s a g e = " "   t o o l t i p = " "   t r a c k e d = " F a l s e " > < ! [ C D A T A [   ] ] > < / T e x t > - 
-             < / S i g n e r _ 2 > - 
-             < P a r a m e t e r   w i n d o w w i d t h = " 7 5 0 "   w i n d o w h e i g h t = " 0 "   m i n w i n d o w w i d t h = " 0 "   m a x w i n d o w w i d t h = " 0 "   m i n w i n d o w h e i g h t = " 0 "   m a x w i n d o w h e i g h t = " 0 " > - 
-                 < D a t e T i m e   i d = " D o c P a r a m . D a t e "   l i d = " D e u t s c h   ( D e u t s c h l a n d ) "   f o r m a t = " d .   M M M M   y y y y "   c a l e n d e r = " G r e g o r "   r o w = " 0 "   c o l u m n = " 1 "   c o l u m n s p a n = " 1 "   l o c k e d = " F a l s e "   l a b e l = " D a t u m "   r e a d o n l y = " F a l s e "   v i s i b l e = " T r u e "   t o o l t i p = " "   t r a c k e d = " F a l s e " > 2 0 1 9 - 0 7 - 1 8 T 0 0 : 0 0 : 0 0 Z < / D a t e T i m e > - 
-                 < C h e c k B o x   i d = " D o c P a r a m . D a t e H i d e D a y "   r o w = " 0 "   c o l u m n = " 2 "   c o l u m n s p a n = " 1 "   i s i n p u t e n a b l e d = " F a l s e "   l o c k e d = " F a l s e "   l a b e l = " T a g   v e r b e r g e n "   r e a d o n l y = " F a l s e "   v i s i b l e = " T r u e "   t o o l t i p = " "   t r a c k e d = " F a l s e " > f a l s e < / C h e c k B o x > - 
-                 < T e x t   i d = " T e x t D o c P a r a m . D a t e H i d e D a y "   r o w = " 0 "   c o l u m n = " 0 "   c o l u m n s p a n = " 0 "   m u l t i l i n e = " F a l s e "   m u l t i l i n e r o w s = " 3 "   l o c k e d = " F a l s e "   l a b e l = " T a g   v e r b e r g e n t e x t "   r e a d o n l y = " F a l s e "   v i s i b l e = " F a l s e "   r e q u i r e d = " F a l s e "   r e g e x = " "   v a l i d a t i o n m e s s a g e = " "   t o o l t i p = " "   t r a c k e d = " F a l s e " > < ! [ C D A T A [ T a g   v e r b e r g e n ] ] > < / T e x t > - 
-                 < T e x t   i d = " D o c P a r a m . F o o t e r N r "   r o w = " 2 "   c o l u m n = " 1 "   c o l u m n s p a n = " 1 "   m u l t i l i n e = " F a l s e "   m u l t i l i n e r o w s = " 3 "   l o c k e d = " F a l s e "   l a b e l = " N r   ( F u s s z e i l e ) "   r e a d o n l y = " F a l s e "   v i s i b l e = " F a l s e "   r e q u i r e d = " F a l s e "   r e g e x = " "   v a l i d a t i o n m e s s a g e = " "   t o o l t i p = " "   t r a c k e d = " F a l s e " > < ! [ C D A T A [   ] ] > < / T e x t > - 
-                 < T e x t   i d = " D o c P a r a m . H e a d e r S u b j e c t "   r o w = " 1 "   c o l u m n = " 1 "   c o l u m n s p a n = " 2 "   m u l t i l i n e = " T r u e "   m u l t i l i n e r o w s = " 1 . 5 "   l o c k e d = " F a l s e "   l a b e l = " T e x t   F o l g e s e i t e n "   r e a d o n l y = " F a l s e "   v i s i b l e = " T r u e "   r e q u i r e d = " F a l s e "   r e g e x = " "   v a l i d a t i o n m e s s a g e = " "   t o o l t i p = " "   t r a c k e d = " F a l s e " > < ! [ C D A T A [   ] ] > < / T e x t > - 
-                 < D a t e T i m e   i d = " D o c P a r a m . H i d d e n . C r e a t i o n T i m e "   l i d = " D e u t s c h   ( D e u t s c h l a n d ) "   f o r m a t = " d .   M M M M   y y y y "   c a l e n d e r = " G r e g o r "   r o w = " 0 "   c o l u m n = " 5 "   c o l u m n s p a n = " 0 "   l o c k e d = " F a l s e "   l a b e l = " "   r e a d o n l y = " F a l s e "   v i s i b l e = " F a l s e "   t o o l t i p = " "   t r a c k e d = " F a l s e " > 2 0 1 9 - 0 7 - 1 8 T 0 7 : 1 1 : 0 7 . 5 1 4 1 6 2 7 Z < / D a t e T i m e > - 
-                 < C h e c k B o x   i d = " D o c P a r a m . S h o w F o o t e r "   r o w = " 2 "   c o l u m n = " 2 "   c o l u m n s p a n = " 1 "   i s i n p u t e n a b l e d = " F a l s e "   l o c k e d = " F a l s e "   l a b e l = " a n z e i g e n "   r e a d o n l y = " F a l s e "   v i s i b l e = " F a l s e "   t o o l t i p = " "   t r a c k e d = " F a l s e " > f a l s e < / C h e c k B o x > - 
-                 < T e x t   i d = " T e x t D o c P a r a m . S h o w F o o t e r "   r o w = " 0 "   c o l u m n = " 0 "   c o l u m n s p a n = " 0 "   m u l t i l i n e = " F a l s e "   m u l t i l i n e r o w s = " 3 "   l o c k e d = " F a l s e "   l a b e l = " a n z e i g e n t e x t "   r e a d o n l y = " F a l s e "   v i s i b l e = " F a l s e "   r e q u i r e d = " F a l s e "   r e g e x = " "   v a l i d a t i o n m e s s a g e = " "   t o o l t i p = " "   t r a c k e d = " F a l s e " > < ! [ C D A T A [ a n z e i g e n ] ] > < / T e x t > - 
-                 < C h e c k B o x   i d = " D o c P a r a m . S h o w H e a d e r S u b j e c t "   r o w = " 1 "   c o l u m n = " 3 "   c o l u m n s p a n = " 1 "   i s i n p u t e n a b l e d = " F a l s e "   l o c k e d = " F a l s e "   l a b e l = " a n z e i g e n "   r e a d o n l y = " F a l s e "   v i s i b l e = " F a l s e "   t o o l t i p = " "   t r a c k e d = " F a l s e " > t r u e < / C h e c k B o x > - 
-                 < T e x t   i d = " T e x t D o c P a r a m . S h o w H e a d e r S u b j e c t "   r o w = " 0 "   c o l u m n = " 0 "   c o l u m n s p a n = " 0 "   m u l t i l i n e = " F a l s e "   m u l t i l i n e r o w s = " 3 "   l o c k e d = " F a l s e "   l a b e l = " a n z e i g e n t e x t "   r e a d o n l y = " F a l s e "   v i s i b l e = " F a l s e "   r e q u i r e d = " F a l s e "   r e g e x = " "   v a l i d a t i o n m e s s a g e = " "   t o o l t i p = " "   t r a c k e d = " F a l s e " > < ! [ C D A T A [ a n z e i g e n ] ] > < / T e x t > - 
-                 < T e x t   i d = " S p e c i a l . C h e c k b o x G r o u p V i e w L i s t "   r o w = " 0 "   c o l u m n = " 0 "   c o l u m n s p a n = " 0 "   m u l t i l i n e = " F a l s e "   m u l t i l i n e r o w s = " 3 "   l o c k e d = " F a l s e "   l a b e l = " S p e c i a l . C h e c k b o x G r o u p V i e w L i s t "   r e a d o n l y = " F a l s e "   v i s i b l e = " F a l s e "   r e q u i r e d = " F a l s e "   r e g e x = " "   v a l i d a t i o n m e s s a g e = " "   t o o l t i p = " "   t r a c k e d = " F a l s e " > < ! [ C D A T A [ �%� a n z e i g e n ] ] > < / T e x t > - 
-                 < T e x t   i d = " S p e c i a l . C h e c k b o x G r o u p V i e w B o x "   r o w = " 0 "   c o l u m n = " 0 "   c o l u m n s p a n = " 0 "   m u l t i l i n e = " F a l s e "   m u l t i l i n e r o w s = " 3 "   l o c k e d = " F a l s e "   l a b e l = " S p e c i a l . C h e c k b o x G r o u p V i e w B o x "   r e a d o n l y = " F a l s e "   v i s i b l e = " F a l s e "   r e q u i r e d = " F a l s e "   r e g e x = " "   v a l i d a t i o n m e s s a g e = " "   t o o l t i p = " "   t r a c k e d = " F a l s e " > < ! [ C D A T A [ �"] ] > < / T e x t > - 
-                 < T e x t   i d = " S p e c i a l . C h e c k b o x G r o u p V i e w T e x t "   r o w = " 0 "   c o l u m n = " 0 "   c o l u m n s p a n = " 0 "   m u l t i l i n e = " F a l s e "   m u l t i l i n e r o w s = " 3 "   l o c k e d = " F a l s e "   l a b e l = " S p e c i a l . C h e c k b o x G r o u p V i e w T e x t "   r e a d o n l y = " F a l s e "   v i s i b l e = " F a l s e "   r e q u i r e d = " F a l s e "   r e g e x = " "   v a l i d a t i o n m e s s a g e = " "   t o o l t i p = " "   t r a c k e d = " F a l s e " > < ! [ C D A T A [ a n z e i g e n ] ] > < / T e x t > - 
-                 < T e x t   i d = " S p e c i a l . C h e c k b o x G r o u p V i e w B o x A n d T e x t "   r o w = " 0 "   c o l u m n = " 0 "   c o l u m n s p a n = " 0 "   m u l t i l i n e = " F a l s e "   m u l t i l i n e r o w s = " 3 "   l o c k e d = " F a l s e "   l a b e l = " S p e c i a l . C h e c k b o x G r o u p V i e w B o x A n d T e x t "   r e a d o n l y = " F a l s e "   v i s i b l e = " F a l s e "   r e q u i r e d = " F a l s e "   r e g e x = " "   v a l i d a t i o n m e s s a g e = " "   t o o l t i p = " "   t r a c k e d = " F a l s e " > < ! [ C D A T A [ �"� a n z e i g e n ] ] > < / T e x t > - 
-             < / P a r a m e t e r > - 
-             < T o o l b o x   w i n d o w w i d t h = " 0 "   w i n d o w h e i g h t = " 0 "   m i n w i n d o w w i d t h = " 0 "   m a x w i n d o w w i d t h = " 0 "   m i n w i n d o w h e i g h t = " 0 "   m a x w i n d o w h e i g h t = " 0 " > - 
-                 < T e x t   i d = " D o c u m e n t P r o p e r t i e s . S a v e P a t h "   r o w = " 0 "   c o l u m n = " 0 "   c o l u m n s p a n = " 0 "   m u l t i l i n e = " F a l s e "   m u l t i l i n e r o w s = " 3 "   l o c k e d = " F a l s e "   l a b e l = " "   r e a d o n l y = " F a l s e "   v i s i b l e = " T r u e "   r e q u i r e d = " F a l s e "   r e g e x = " "   v a l i d a t i o n m e s s a g e = " "   t o o l t i p = " "   t r a c k e d = " F a l s e " > < ! [ C D A T A [ \ \ s d s a m z 0 0 1 1 . k t . k t z h . c h \ V D I _ I B I S _ P r o f i l d a t e n $ \ b 2 1 4 p u r \ D e s k t o p \ M A B   2 0 1 8 \ M A B   2 0 1 9   -   D o k u m e n t a t i o n s - F o r m u l a r   V 2 . d o c x ] ] > < / T e x t > - 
-                 < T e x t   i d = " D o c u m e n t P r o p e r t i e s . D o c u m e n t N a m e "   r o w = " 0 "   c o l u m n = " 0 "   c o l u m n s p a n = " 0 "   m u l t i l i n e = " F a l s e "   m u l t i l i n e r o w s = " 3 "   l o c k e d = " F a l s e "   l a b e l = " "   r e a d o n l y = " F a l s e "   v i s i b l e = " T r u e "   r e q u i r e d = " F a l s e "   r e g e x = " "   v a l i d a t i o n m e s s a g e = " "   t o o l t i p = " "   t r a c k e d = " F a l s e " > < ! [ C D A T A [ M A B   2 0 1 9   -   D o k u m e n t a t i o n s - F o r m u l a r   V 2 . d o c x ] ] > < / T e x t > - 
-                 < D a t e T i m e   i d = " D o c u m e n t P r o p e r t i e s . S a v e T i m e s t a m p "   l i d = " D e u t s c h   ( D e u t s c h l a n d ) "   f o r m a t = " "   c a l e n d e r = " "   r o w = " 0 "   c o l u m n = " 0 "   c o l u m n s p a n = " 0 "   l o c k e d = " F a l s e "   l a b e l = " "   r e a d o n l y = " F a l s e "   v i s i b l e = " T r u e "   t o o l t i p = " "   t r a c k e d = " F a l s e " > 2 0 1 9 - 1 1 - 0 7 T 0 9 : 5 4 : 2 0 . 2 2 3 5 3 5 1 Z < / D a t e T i m e > - 
-             < / T o o l b o x > - 
-             < S c r i p t i n g   w i n d o w w i d t h = " 0 "   w i n d o w h e i g h t = " 0 "   m i n w i n d o w w i d t h = " 0 "   m a x w i n d o w w i d t h = " 0 "   m i n w i n d o w h e i g h t = " 0 "   m a x w i n d o w h e i g h t = " 0 " > - 
-                 < T e x t   i d = " C u s t o m E l e m e n t s . S i g n e r 1 W i t h o u t F u n c t i o n "   r o w = " 0 "   c o l u m n = " 0 "   c o l u m n s p a n = " 0 "   m u l t i l i n e = " F a l s e "   m u l t i l i n e r o w s = " 3 "   l o c k e d = " F a l s e "   l a b e l = " C u s t o m E l e m e n t s . S i g n e r 1 W i t h o u t F u n c t i o n "   r e a d o n l y = " F a l s e "   v i s i b l e = " T r u e "   r e q u i r e d = " F a l s e "   r e g e x = " "   v a l i d a t i o n m e s s a g e = " "   t o o l t i p = " "   t r a c k e d = " F a l s e " > < ! [ C D A T A [ A n d r e a   L � b b e r s t e d t ] ] > < / T e x t > - 
-                 < T e x t   i d = " C u s t o m E l e m e n t s . S i g n e r 2 W i t h o u t F u n c t i o n "   r o w = " 0 "   c o l u m n = " 0 "   c o l u m n s p a n = " 0 "   m u l t i l i n e = " F a l s e "   m u l t i l i n e r o w s = " 3 "   l o c k e d = " F a l s e "   l a b e l = " C u s t o m E l e m e n t s . S i g n e r 2 W i t h o u t F u n c t i o n "   r e a d o n l y = " F a l s e "   v i s i b l e = " T r u e "   r e q u i r e d = " F a l s e "   r e g e x = " "   v a l i d a t i o n m e s s a g e = " "   t o o l t i p = " "   t r a c k e d = " F a l s e " > < ! [ C D A T A [   ] ] > < / T e x t > - 
-                 < T e x t   i d = " C u s t o m E l e m e n t s . S i g n e r 3 W i t h o u t F u n c t i o n "   r o w = " 0 "   c o l u m n = " 0 "   c o l u m n s p a n = " 0 "   m u l t i l i n e = " F a l s e "   m u l t i l i n e r o w s = " 3 "   l o c k e d = " F a l s e "   l a b e l = " C u s t o m E l e m e n t s . S i g n e r 3 W i t h o u t F u n c t i o n "   r e a d o n l y = " F a l s e "   v i s i b l e = " T r u e "   r e q u i r e d = " F a l s e "   r e g e x = " "   v a l i d a t i o n m e s s a g e = " "   t o o l t i p = " "   t r a c k e d = " F a l s e " > < ! [ C D A T A [   ] ] > < / T e x t > - 
-                 < T e x t   i d = " C u s t o m E l e m e n t s . L o g i c . T i t l e . C o n t a i n s . P r o f i l e . N a m e L i n e "   r o w = " 0 "   c o l u m n = " 0 "   c o l u m n s p a n = " 0 "   m u l t i l i n e = " F a l s e "   m u l t i l i n e r o w s = " 3 "   l o c k e d = " F a l s e "   l a b e l = " C u s t o m E l e m e n t s . L o g i c . T i t l e . C o n t a i n s . P r o f i l e . N a m e L i n e "   r e a d o n l y = " F a l s e "   v i s i b l e = " T r u e "   r e q u i r e d = " F a l s e "   r e g e x = " "   v a l i d a t i o n m e s s a g e = " "   t o o l t i p = " "   t r a c k e d = " F a l s e " > < ! [ C D A T A [   ] ] > < / T e x t > - 
-                 < T e x t   i d = " C u s t o m E l e m e n t s . L o g i c . T i t l e . C o n t a i n s . S i g n e r 1 . N a m e L i n e "   r o w = " 0 "   c o l u m n = " 0 "   c o l u m n s p a n = " 0 "   m u l t i l i n e = " F a l s e "   m u l t i l i n e r o w s = " 3 "   l o c k e d = " F a l s e "   l a b e l = " C u s t o m E l e m e n t s . L o g i c . T i t l e . C o n t a i n s . S i g n e r 1 . N a m e L i n e "   r e a d o n l y = " F a l s e "   v i s i b l e = " T r u e "   r e q u i r e d = " F a l s e "   r e g e x = " "   v a l i d a t i o n m e s s a g e = " "   t o o l t i p = " "   t r a c k e d = " F a l s e " > < ! [ C D A T A [   ] ] > < / T e x t > - 
-                 < T e x t   i d = " C u s t o m E l e m e n t s . L o g i c . T i t l e . C o n t a i n s . S i g n e r 2 . N a m e L i n e "   r o w = " 0 "   c o l u m n = " 0 "   c o l u m n s p a n = " 0 "   m u l t i l i n e = " F a l s e "   m u l t i l i n e r o w s = " 3 "   l o c k e d = " F a l s e "   l a b e l = " C u s t o m E l e m e n t s . L o g i c . T i t l e . C o n t a i n s . S i g n e r 2 . N a m e L i n e "   r e a d o n l y = " F a l s e "   v i s i b l e = " T r u e "   r e q u i r e d = " F a l s e "   r e g e x = " "   v a l i d a t i o n m e s s a g e = " "   t o o l t i p = " "   t r a c k e d = " F a l s e " > < ! [ C D A T A [   ] ] > < / T e x t > - 
-                 < T e x t   i d = " C u s t o m E l e m e n t s . L o g i c . T i t l e . C o n t a i n s . S i g n e r 3 . N a m e L i n e "   r o w = " 0 "   c o l u m n = " 0 "   c o l u m n s p a n = " 0 "   m u l t i l i n e = " F a l s e "   m u l t i l i n e r o w s = " 3 "   l o c k e d = " F a l s e "   l a b e l = " C u s t o m E l e m e n t s . L o g i c . T i t l e . C o n t a i n s . S i g n e r 3 . N a m e L i n e "   r e a d o n l y = " F a l s e "   v i s i b l e = " T r u e "   r e q u i r e d = " F a l s e "   r e g e x = " "   v a l i d a t i o n m e s s a g e = " "   t o o l t i p = " "   t r a c k e d = " F a l s e " > < ! [ C D A T A [   ] ] > < / T e x t > - 
-                 < T e x t   i d = " C u s t o m E l e m e n t s . L o g i c . T i t l e . E q u a l s . P r o f i l e . N a m e L i n e "   r o w = " 0 "   c o l u m n = " 0 "   c o l u m n s p a n = " 0 "   m u l t i l i n e = " F a l s e "   m u l t i l i n e r o w s = " 3 "   l o c k e d = " F a l s e "   l a b e l = " C u s t o m E l e m e n t s . L o g i c . T i t l e . E q u a l s . P r o f i l e . N a m e L i n e "   r e a d o n l y = " F a l s e "   v i s i b l e = " T r u e "   r e q u i r e d = " F a l s e "   r e g e x = " "   v a l i d a t i o n m e s s a g e = " "   t o o l t i p = " "   t r a c k e d = " F a l s e " > < ! [ C D A T A [   ] ] > < / T e x t > - 
-                 < T e x t   i d = " C u s t o m E l e m e n t s . L o g i c . T i t l e . E q u a l s . S i g n e r 1 . N a m e L i n e "   r o w = " 0 "   c o l u m n = " 0 "   c o l u m n s p a n = " 0 "   m u l t i l i n e = " F a l s e "   m u l t i l i n e r o w s = " 3 "   l o c k e d = " F a l s e "   l a b e l = " C u s t o m E l e m e n t s . L o g i c . T i t l e . E q u a l s . S i g n e r 1 . N a m e L i n e "   r e a d o n l y = " F a l s e "   v i s i b l e = " T r u e "   r e q u i r e d = " F a l s e "   r e g e x = " "   v a l i d a t i o n m e s s a g e = " "   t o o l t i p = " "   t r a c k e d = " F a l s e " > < ! [ C D A T A [   ] ] > < / T e x t > - 
-                 < T e x t   i d = " C u s t o m E l e m e n t s . L o g i c . T i t l e . E q u a l s . S i g n e r 2 . N a m e L i n e "   r o w = " 0 "   c o l u m n = " 0 "   c o l u m n s p a n = " 0 "   m u l t i l i n e = " F a l s e "   m u l t i l i n e r o w s = " 3 "   l o c k e d = " F a l s e "   l a b e l = " C u s t o m E l e m e n t s . L o g i c . T i t l e . E q u a l s . S i g n e r 2 . N a m e L i n e "   r e a d o n l y = " F a l s e "   v i s i b l e = " T r u e "   r e q u i r e d = " F a l s e "   r e g e x = " "   v a l i d a t i o n m e s s a g e = " "   t o o l t i p = " "   t r a c k e d = " F a l s e " > < ! [ C D A T A [   ] ] > < / T e x t > - 
-                 < T e x t   i d = " C u s t o m E l e m e n t s . L o g i c . T i t l e . E q u a l s . S i g n e r 3 . N a m e L i n e "   r o w = " 0 "   c o l u m n = " 0 "   c o l u m n s p a n = " 0 "   m u l t i l i n e = " F a l s e "   m u l t i l i n e r o w s = " 3 "   l o c k e d = " F a l s e "   l a b e l = " C u s t o m E l e m e n t s . L o g i c . T i t l e . E q u a l s . S i g n e r 3 . N a m e L i n e "   r e a d o n l y = " F a l s e "   v i s i b l e = " T r u e "   r e q u i r e d = " F a l s e "   r e g e x = " "   v a l i d a t i o n m e s s a g e = " "   t o o l t i p = " "   t r a c k e d = " F a l s e " > < ! [ C D A T A [   ] ] > < / T e x t > - 
-                 < T e x t   i d = " C u s t o m E l e m e n t s . H e a d e r . A d r e s s . E m p t y L i n e s "   r o w = " 0 "   c o l u m n = " 0 "   c o l u m n s p a n = " 0 "   m u l t i l i n e = " F a l s e "   m u l t i l i n e r o w s = " 3 "   l o c k e d = " F a l s e "   l a b e l = " C u s t o m E l e m e n t s . H e a d e r . A d r e s s . E m p t y L i n e s "   r e a d o n l y = " F a l s e "   v i s i b l e = " T r u e "   r e q u i r e d = " F a l s e "   r e g e x = " "   v a l i d a t i o n m e s s a g e = " "   t o o l t i p = " "   t r a c k e d = " F a l s e " > < ! [ C D A T A [ � ] ] > < / T e x t > - 
-                 < T e x t   i d = " C u s t o m E l e m e n t s . H e a d e r . S c r i p t 1 "   r o w = " 0 "   c o l u m n = " 0 "   c o l u m n s p a n = " 0 "   m u l t i l i n e = " F a l s e "   m u l t i l i n e r o w s = " 3 "   l o c k e d = " F a l s e "   l a b e l = " C u s t o m E l e m e n t s . H e a d e r . S c r i p t 1 "   r e a d o n l y = " F a l s e "   v i s i b l e = " T r u e "   r e q u i r e d = " F a l s e "   r e g e x = " "   v a l i d a t i o n m e s s a g e = " "   t o o l t i p = " "   t r a c k e d = " F a l s e " > < ! [ C D A T A [ K a n t o n   Z � r i c h - 
- S i c h e r h e i t s d i r e k t i o n ] ] > < / T e x t > - 
-                 < T e x t   i d = " C u s t o m E l e m e n t s . H e a d e r . S c r i p t 2 "   r o w = " 0 "   c o l u m n = " 0 "   c o l u m n s p a n = " 0 "   m u l t i l i n e = " F a l s e "   m u l t i l i n e r o w s = " 3 "   l o c k e d = " F a l s e "   l a b e l = " C u s t o m E l e m e n t s . H e a d e r . S c r i p t 2 "   r e a d o n l y = " F a l s e "   v i s i b l e = " T r u e "   r e q u i r e d = " F a l s e "   r e g e x = " "   v a l i d a t i o n m e s s a g e = " "   t o o l t i p = " "   t r a c k e d = " F a l s e " > < ! [ C D A T A [ K a n t o n a l e s   S o z i a l a m t ] ] > < / T e x t > - 
-                 < T e x t   i d = " C u s t o m E l e m e n t s . H e a d e r . S c r i p t 3 "   r o w = " 0 "   c o l u m n = " 0 "   c o l u m n s p a n = " 0 "   m u l t i l i n e = " F a l s e "   m u l t i l i n e r o w s = " 3 "   l o c k e d = " F a l s e "   l a b e l = " C u s t o m E l e m e n t s . H e a d e r . S c r i p t 3 "   r e a d o n l y = " F a l s e "   v i s i b l e = " T r u e "   r e q u i r e d = " F a l s e "   r e g e x = " "   v a l i d a t i o n m e s s a g e = " "   t o o l t i p = " "   t r a c k e d = " F a l s e " > < ! [ C D A T A [   ] ] > < / T e x t > - 
-                 < T e x t   i d = " C u s t o m E l e m e n t s . H e a d e r . S c r i p t 4 "   r o w = " 0 "   c o l u m n = " 0 "   c o l u m n s p a n = " 0 "   m u l t i l i n e = " F a l s e "   m u l t i l i n e r o w s = " 3 "   l o c k e d = " F a l s e "   l a b e l = " C u s t o m E l e m e n t s . H e a d e r . S c r i p t 4 "   r e a d o n l y = " F a l s e "   v i s i b l e = " T r u e "   r e q u i r e d = " F a l s e "   r e g e x = " "   v a l i d a t i o n m e s s a g e = " "   t o o l t i p = " "   t r a c k e d = " F a l s e " > < ! [ C D A T A [ A n d r e a   L � b b e r s t e d t ] ] > < / T e x t > - 
-                 < T e x t   i d = " C u s t o m E l e m e n t s . H e a d e r . S c r i p t 5 "   r o w = " 0 "   c o l u m n = " 0 "   c o l u m n s p a n = " 0 "   m u l t i l i n e = " F a l s e "   m u l t i l i n e r o w s = " 3 "   l o c k e d = " F a l s e "   l a b e l = " C u s t o m E l e m e n t s . H e a d e r . S c r i p t 5 "   r e a d o n l y = " F a l s e "   v i s i b l e = " T r u e "   r e q u i r e d = " F a l s e "   r e g e x = " "   v a l i d a t i o n m e s s a g e = " "   t o o l t i p = " "   t r a c k e d = " F a l s e " > < ! [ C D A T A [ A m t s c h e f i n - 
- S c h a f f h a u s e r s t r a s s e   7 8 - 
- 8 0 9 0   Z � r i c h - 
- T e l e f o n   + 4 1   4 3   2 5 9   2 4   5 0 - 
- a n d r e a . l u e b b e r s t e d t @ s a . z h . c h - 
- w w w . s o z i a l a m t . z h . c h ] ] > < / T e x t > - 
-                 < T e x t   i d = " C u s t o m E l e m e n t s . H e a d e r . K o n t a k t S c r i p t K o m p l e t t "   r o w = " 0 "   c o l u m n = " 0 "   c o l u m n s p a n = " 0 "   m u l t i l i n e = " F a l s e "   m u l t i l i n e r o w s = " 3 "   l o c k e d = " F a l s e "   l a b e l = " C u s t o m E l e m e n t s . H e a d e r . K o n t a k t S c r i p t K o m p l e t t "   r e a d o n l y = " F a l s e "   v i s i b l e = " T r u e "   r e q u i r e d = " F a l s e "   r e g e x = " "   v a l i d a t i o n m e s s a g e = " "   t o o l t i p = " "   t r a c k e d = " F a l s e " > < ! [ C D A T A [ K o n t a k t : - 
- A n d r e a   L � b b e r s t e d t - 
- A m t s c h e f i n - 
- - 
- S c h a f f h a u s e r s t r a s s e   7 8 - 
- 8 0 9 0   Z � r i c h - 
- T e l e f o n   + 4 1   4 3   2 5 9   2 4   5 0 - 
- a n d r e a . l u e b b e r s t e d t @ s a . z h . c h - 
- w w w . s o z i a l a m t . z h . c h ] ] > < / T e x t > - 
-                 < T e x t   i d = " C u s t o m E l e m e n t s . H e a d e r . R e f N r "   r o w = " 0 "   c o l u m n = " 0 "   c o l u m n s p a n = " 0 "   m u l t i l i n e = " F a l s e "   m u l t i l i n e r o w s = " 3 "   l o c k e d = " F a l s e "   l a b e l = " C u s t o m E l e m e n t s . H e a d e r . R e f N r "   r e a d o n l y = " F a l s e "   v i s i b l e = " T r u e "   r e q u i r e d = " F a l s e "   r e g e x = " "   v a l i d a t i o n m e s s a g e = " "   t o o l t i p = " "   t r a c k e d = " F a l s e " > < ! [ C D A T A [   ] ] > < / T e x t > - 
-                 < T e x t   i d = " C u s t o m E l e m e n t s . H e a d e r . T e x t F o l g e s e i t e n "   r o w = " 0 "   c o l u m n = " 0 "   c o l u m n s p a n = " 0 "   m u l t i l i n e = " F a l s e "   m u l t i l i n e r o w s = " 3 "   l o c k e d = " F a l s e "   l a b e l = " C u s t o m E l e m e n t s . H e a d e r . T e x t F o l g e s e i t e n "   r e a d o n l y = " F a l s e "   v i s i b l e = " T r u e "   r e q u i r e d = " F a l s e "   r e g e x = " "   v a l i d a t i o n m e s s a g e = " "   t o o l t i p = " "   t r a c k e d = " F a l s e " > < ! [ C D A T A [ K a n t o n a l e s   S o z i a l a m t ] ] > < / T e x t > - 
-                 < T e x t   i d = " C u s t o m E l e m e n t s . H e a d e r . T e x t F o l g e s e i t e n O u L e v 2 "   r o w = " 0 "   c o l u m n = " 0 "   c o l u m n s p a n = " 0 "   m u l t i l i n e = " F a l s e "   m u l t i l i n e r o w s = " 3 "   l o c k e d = " F a l s e "   l a b e l = " C u s t o m E l e m e n t s . H e a d e r . T e x t F o l g e s e i t e n O u L e v 2 "   r e a d o n l y = " F a l s e "   v i s i b l e = " T r u e "   r e q u i r e d = " F a l s e "   r e g e x = " "   v a l i d a t i o n m e s s a g e = " "   t o o l t i p = " "   t r a c k e d = " F a l s e " > < ! [ C D A T A [ S i c h e r h e i t s d i r e k t i o n ] ] > < / T e x t > - 
-                 < T e x t   i d = " C u s t o m E l e m e n t s . H e a d e r . T e x t F o l g e s e i t e n O u L e v 3 "   r o w = " 0 "   c o l u m n = " 0 "   c o l u m n s p a n = " 0 "   m u l t i l i n e = " F a l s e "   m u l t i l i n e r o w s = " 3 "   l o c k e d = " F a l s e "   l a b e l = " C u s t o m E l e m e n t s . H e a d e r . T e x t F o l g e s e i t e n O u L e v 3 "   r e a d o n l y = " F a l s e "   v i s i b l e = " T r u e "   r e q u i r e d = " F a l s e "   r e g e x = " "   v a l i d a t i o n m e s s a g e = " "   t o o l t i p = " "   t r a c k e d = " F a l s e " > < ! [ C D A T A [ K a n t o n a l e s   S o z i a l a m t ] ] > < / T e x t > - 
-                 < T e x t   i d = " C u s t o m E l e m e n t s . H e a d e r . V o r g e s e t z e r S c r i p t 1 "   r o w = " 0 "   c o l u m n = " 0 "   c o l u m n s p a n = " 0 "   m u l t i l i n e = " F a l s e "   m u l t i l i n e r o w s = " 3 "   l o c k e d = " F a l s e "   l a b e l = " C u s t o m E l e m e n t s . H e a d e r . V o r g e s e t z e r S c r i p t 1 "   r e a d o n l y = " F a l s e "   v i s i b l e = " T r u e "   r e q u i r e d = " F a l s e "   r e g e x = " "   v a l i d a t i o n m e s s a g e = " "   t o o l t i p = " "   t r a c k e d = " F a l s e " > < ! [ C D A T A [ A n d r e a   L � b b e r s t e d t ] ] > < / T e x t > - 
-                 < T e x t   i d = " C u s t o m E l e m e n t s . H e a d e r . V o r g e s e t z e r S c r i p t 2 "   r o w = " 0 "   c o l u m n = " 0 "   c o l u m n s p a n = " 0 "   m u l t i l i n e = " F a l s e "   m u l t i l i n e r o w s = " 3 "   l o c k e d = " F a l s e "   l a b e l = " C u s t o m E l e m e n t s . H e a d e r . V o r g e s e t z e r S c r i p t 2 "   r e a d o n l y = " F a l s e "   v i s i b l e = " T r u e "   r e q u i r e d = " F a l s e "   r e g e x = " "   v a l i d a t i o n m e s s a g e = " "   t o o l t i p = " "   t r a c k e d = " F a l s e " > < ! [ C D A T A [ A m t s c h e f i n ] ] > < / T e x t > - 
-                 < T e x t   i d = " C u s t o m E l e m e n t s . H e a d e r . D a t e R e f N r . L e f t "   r o w = " 0 "   c o l u m n = " 0 "   c o l u m n s p a n = " 0 "   m u l t i l i n e = " F a l s e "   m u l t i l i n e r o w s = " 3 "   l o c k e d = " F a l s e "   l a b e l = " C u s t o m E l e m e n t s . H e a d e r . D a t e R e f N r . L e f t "   r e a d o n l y = " F a l s e "   v i s i b l e = " T r u e "   r e q u i r e d = " F a l s e "   r e g e x = " "   v a l i d a t i o n m e s s a g e = " "   t o o l t i p = " "   t r a c k e d = " F a l s e " > < ! [ C D A T A [ D a t u m ] ] > < / T e x t > - 
-                 < T e x t   i d = " C u s t o m E l e m e n t s . H e a d e r . D a t e R e f N r . R i g h t "   r o w = " 0 "   c o l u m n = " 0 "   c o l u m n s p a n = " 0 "   m u l t i l i n e = " F a l s e "   m u l t i l i n e r o w s = " 3 "   l o c k e d = " F a l s e "   l a b e l = " C u s t o m E l e m e n t s . H e a d e r . D a t e R e f N r . R i g h t "   r e a d o n l y = " F a l s e "   v i s i b l e = " T r u e "   r e q u i r e d = " F a l s e "   r e g e x = " "   v a l i d a t i o n m e s s a g e = " "   t o o l t i p = " "   t r a c k e d = " F a l s e " > < ! [ C D A T A [ 1 8 .   J u l i   2 0 1 9 ] ] > < / T e x t > - 
-                 < T e x t   i d = " C u s t o m E l e m e n t s . H e a d e r . D a t e "   r o w = " 0 "   c o l u m n = " 0 "   c o l u m n s p a n = " 0 "   m u l t i l i n e = " F a l s e "   m u l t i l i n e r o w s = " 3 "   l o c k e d = " F a l s e "   l a b e l = " C u s t o m E l e m e n t s . H e a d e r . D a t e "   r e a d o n l y = " F a l s e "   v i s i b l e = " T r u e "   r e q u i r e d = " F a l s e "   r e g e x = " "   v a l i d a t i o n m e s s a g e = " "   t o o l t i p = " "   t r a c k e d = " F a l s e " > < ! [ C D A T A [ 1 8 .   J u l i   2 0 1 9 ] ] > < / T e x t > - 
-                 < T e x t   i d = " C u s t o m E l e m e n t s . H e a d e r . D a t e S t a m p L i n e "   r o w = " 0 "   c o l u m n = " 0 "   c o l u m n s p a n = " 0 "   m u l t i l i n e = " F a l s e "   m u l t i l i n e r o w s = " 3 "   l o c k e d = " F a l s e "   l a b e l = " C u s t o m E l e m e n t s . H e a d e r . D a t e S t a m p L i n e "   r e a d o n l y = " F a l s e "   v i s i b l e = " T r u e "   r e q u i r e d = " F a l s e "   r e g e x = " "   v a l i d a t i o n m e s s a g e = " "   t o o l t i p = " "   t r a c k e d = " F a l s e " > < ! [ C D A T A [   ] ] > < / T e x t > - 
-                 < T e x t   i d = " C u s t o m E l e m e n t s . F o o t e r . L i n e "   r o w = " 0 "   c o l u m n = " 0 "   c o l u m n s p a n = " 0 "   m u l t i l i n e = " F a l s e "   m u l t i l i n e r o w s = " 3 "   l o c k e d = " F a l s e "   l a b e l = " C u s t o m E l e m e n t s . F o o t e r . L i n e "   r e a d o n l y = " F a l s e "   v i s i b l e = " T r u e "   r e q u i r e d = " F a l s e "   r e g e x = " "   v a l i d a t i o n m e s s a g e = " "   t o o l t i p = " "   t r a c k e d = " F a l s e " > < ! [ C D A T A [   ] ] > < / T e x t > - 
-             < / S c r i p t i n g > - 
-         < / D a t a M o d e l > - 
-     < / C o n t e n t > - 
- < / O n e O f f i x x D o c u m e n t P a r t > 
-</file>
-
-<file path=customXml/item3.xml><?xml version="1.0" encoding="utf-8"?>
+<file path=customXml/item2.xml><?xml version="1.0" encoding="utf-8"?>
 <OneOffixxExtendedBindingPart xmlns:xsd="http://www.w3.org/2001/XMLSchema" xmlns:xsi="http://www.w3.org/2001/XMLSchema-instance" xmlns="http://schema.oneoffixx.com/OneOffixxExtendedBindingPart/1">
   <StyleSheet>
     <xsl:stylesheet xmlns:xsl="http://www.w3.org/1999/XSL/Transform" xmlns:contact="http://schema.oneoffixx.com/OneOffixxContactsPart/1" xmlns:ext="http://schema.oneoffixx.com/OneOffixxExtendedBindingPart/1" xmlns:wpc="http://schemas.microsoft.com/office/word/2010/wordprocessingCanvas" xmlns:mc="http://schemas.openxmlformats.org/markup-compatibility/2006" xmlns:o="urn:schemas-microsoft-com:office:office" xmlns:r="http://schemas.openxmlformats.org/officeDocument/2006/relationships" xmlns:m="http://schemas.openxmlformats.org/officeDocument/2006/math" xmlns:v="urn:schemas-microsoft-com:vml" xmlns:wp14="http://schemas.microsoft.com/office/word/2010/wordprocessingDrawing" xmlns:wp="http://schemas.openxmlformats.org/drawingml/2006/wordprocessingDrawing" xmlns:w10="urn:schemas-microsoft-com:office:word" xmlns:w="http://schemas.openxmlformats.org/wordprocessingml/2006/main" xmlns:w14="http://schemas.microsoft.com/office/word/2010/wordml" xmlns:wpg="http://schemas.microsoft.com/office/word/2010/wordprocessingGroup" xmlns:wpi="http://schemas.microsoft.com/office/word/2010/wordprocessingInk" xmlns:wne="http://schemas.microsoft.com/office/word/2006/wordml" xmlns:wps="http://schemas.microsoft.com/office/word/2010/wordprocessingShape" version="1.0" mc:Ignorable="w14 wp14">
@@ -16865,170 +16365,7 @@
 </OneOffixxExtendedBindingPart>
 </file>
 
-<file path=customXml/item4.xml><?xml version="1.0" encoding="utf-8"?>
-<p:properties xmlns:p="http://schemas.microsoft.com/office/2006/metadata/properties" xmlns:xsi="http://www.w3.org/2001/XMLSchema-instance" xmlns:pc="http://schemas.microsoft.com/office/infopath/2007/PartnerControls">
-  <documentManagement>
-    <TaxCatchAll xmlns="09640fe3-f50f-46c8-a6f7-a2176bb49e6a" xsi:nil="true"/>
-    <lcf76f155ced4ddcb4097134ff3c332f xmlns="98fe2ab8-7d83-4567-ba90-4f594ae3f4fd">
-      <Terms xmlns="http://schemas.microsoft.com/office/infopath/2007/PartnerControls"/>
-    </lcf76f155ced4ddcb4097134ff3c332f>
-  </documentManagement>
-</p:properties>
-</file>
-
-<file path=customXml/item5.xml><?xml version="1.0" encoding="utf-8"?>
-<OneOffixxFormattingPart xmlns:xsd="http://www.w3.org/2001/XMLSchema" xmlns:xsi="http://www.w3.org/2001/XMLSchema-instance" xmlns="http://schema.oneoffixx.com/OneOffixxFormattingPart/1">
-  <Configuration>
-    <DocumentFunction xmlns="">
-      <!-- #################################################################### -->
-      <!-- ## Unterschiede zum Root:                                         ## -->
-      <!-- ## maxListLevels auf 6 gesetzt                                    ## -->
-      <!-- ## CustomStyles: Category «EingerueckteAufzaehlungen» hintzgefügt ## -->
-      <!-- #################################################################### -->
-      <!-- Parametrierung der Überschriften -->
-      <Group name="Headings">
-        <Definition type="Heading" level="1" style="Überschrift 1"/>
-        <Definition type="Heading" level="2" style="Überschrift 2"/>
-        <Definition type="Heading" level="3" style="Überschrift 3"/>
-        <Definition type="Heading" level="4" style="Überschrift 4"/>
-      </Group>
-      <!-- Parametrierung der Tabulatoren -->
-      <Group name="Indents" maxListLevels="6"/>
-      <!-- Parametrierung der Listen, Aufzählungen und Nummerierungen -->
-      <Group name="NumberingStyles">
-        <Definition type="Numeric" tabPosition="1" style="Liste_Nummern_Arabisch"/>
-        <Definition type="Alphabetic" tabPosition="1" style="Liste_Nummern_Roemisch"/>
-        <Definition type="Line" tabPosition="1" style="Liste_Bindestrich"/>
-      </Group>
-      <!-- Parametrierung der Nummerierungs-Optionen -->
-      <Group name="NumberingBehaviors">
-        <Definition type="Increment" style="Liste_Nummern_Arabisch"/>
-        <Definition type="Decrement"/>
-        <!--<Definition type="RestartMain"/>
-          <Definition type="RestartSub"/>-->
-        <Definition type="ResetChapter" style="Überschrift 1"/>
-        <Definition type="ResetList" style="Liste_Nummern_Arabisch"/>
-      </Group>
-      <!-- Parametrierung der weiteren Formatierungs-Optionen -->
-      <Group name="Styles">
-        <Definition type="Standard" style="Grundtext"/>
-        <Definition type="Bold" style="Fett"/>
-        <Definition type="Italic" style=""/>
-        <Definition type="Underline" style=""/>
-      </Group>
-      <!-- Parametrierung der weiteren kundenspezifischen Formatierungs-Optionen -->
-      <Group name="CustomStyles">
-        <Category id="Formatierungen">
-          <Label lcid="2055">Formatierungen</Label>
-          <Definition type="Randtitel" style="Randtitel mit Textbox">
-            <Label lcid="2055">Randtitel</Label>
-          </Definition>
-          <Definition type="Lead" style="Lead">
-            <Label lcid="2055">Lead</Label>
-          </Definition>
-        </Category>
-        <Category id="Überschriften">
-          <Label lcid="2055">Überschriften</Label>
-          <Definition type="Heading" level="1" style="Überschrift 1 Gross">
-            <Label lcid="2055">Überschrift 1 Gross</Label>
-          </Definition>
-        </Category>
-        <Category id="Tabelle">
-          <Label lcid="2055">Tabelle</Label>
-          <Definition type="Table" style="Tabelle Standard linksbündig">
-            <Label lcid="2055">Tabelle Standard linksbündig</Label>
-          </Definition>
-          <Definition type="Table" style="Tabelle Standard rechtsbündig">
-            <Label lcid="2055">Tabelle Standard rechtsbündig</Label>
-          </Definition>
-          <Definition type="Table" style="Tabelle klein linksbündig">
-            <Label lcid="2055">Tabelle klein linksbündig</Label>
-          </Definition>
-          <Definition type="Table" style="Tabelle klein rechtsbündig">
-            <Label lcid="2055">Tabelle klein rechtsbündig</Label>
-          </Definition>
-          <Definition type="Table" style="Tabelle fett">
-            <Label lcid="2055">Tabelle fett</Label>
-          </Definition>
-        </Category>
-        <Category id="Inline-Bild">
-          <Label lcid="2055">Bild in Zeile anzeigen</Label>
-          <Definition type="Image" style="Grundtext_neutral">
-            <Label lcid="2055">Grundtext neutral</Label>
-          </Definition>
-        </Category>
-        <Category id="EingerueckteAufzaehlungen">
-          <Label lcid="2055">Eingerückte Aufzählungen für nummerierte Überschriften</Label>
-          <Definition type="Liste_Bindestrich_Ebene_4" style="Liste_Bindestrich_Ebene_4">
-            <Label lcid="2055">Bindestrich-Liste eingerückt</Label>
-          </Definition>
-          <Definition type="Liste_Nummern_Arabisch_Ebene_4" style="Liste_Nummern_Arabisch_Ebene_4">
-            <Label lcid="2055">arabische Nummerierung eingerückt</Label>
-          </Definition>
-          <Definition type="Liste_Nummern_Roemisch_Ebene_4" style="Liste_Nummern_Roemisch_Ebene_4">
-            <Label lcid="2055">römische Nummerierung eingerückt</Label>
-          </Definition>
-        </Category>
-      </Group>
-    </DocumentFunction>
-  </Configuration>
-</OneOffixxFormattingPart>
-</file>
-
-<file path=customXml/item6.xml><?xml version="1.0" encoding="utf-8"?>
-<b:Sources xmlns:b="http://schemas.openxmlformats.org/officeDocument/2006/bibliography" xmlns="http://schemas.openxmlformats.org/officeDocument/2006/bibliography" SelectedStyle="\APASixthEditionOfficeOnline.xsl" StyleName="APA" Version="6"/>
-</file>
-
-<file path=customXml/item7.xml><?xml version="1.0" encoding="utf-8"?>
-<OneOffixxImageDefinitionPart xmlns:xsd="http://www.w3.org/2001/XMLSchema" xmlns:xsi="http://www.w3.org/2001/XMLSchema-instance" xmlns="http://schema.oneoffixx.com/OneOffixxImageDefinitionPart/1">
-  <ImageDefinitions>
-    <ImageSizeDefinition>
-      <Id>2032969613</Id>
-      <Width>0</Width>
-      <Height>0</Height>
-      <XPath>//Image[@id='Profile.Org.HeaderLogoShort']</XPath>
-      <ImageHash>7fe544e2f398d2732a9ea51d50e24d16</ImageHash>
-    </ImageSizeDefinition>
-    <ImageSizeDefinition>
-      <Id>155732410</Id>
-      <Width>0</Width>
-      <Height>0</Height>
-      <XPath>//Image[@id='Profile.Org.Kanton']</XPath>
-      <ImageHash>1a0b7be4d8c69e4fe4dabdfa77453b38</ImageHash>
-    </ImageSizeDefinition>
-    <ImageSizeDefinition>
-      <Id>2120064574</Id>
-      <Width>0</Width>
-      <Height>0</Height>
-      <XPath>//Image[@id='Profile.Org.Kanton']</XPath>
-      <ImageHash>1a0b7be4d8c69e4fe4dabdfa77453b38</ImageHash>
-    </ImageSizeDefinition>
-    <ImageSizeDefinition>
-      <Id>1768692683</Id>
-      <Width>0</Width>
-      <Height>0</Height>
-      <XPath>//Image[@id='Profile.Org.HeaderLogoShort']</XPath>
-      <ImageHash>7fe544e2f398d2732a9ea51d50e24d16</ImageHash>
-    </ImageSizeDefinition>
-    <ImageSizeDefinition>
-      <Id>1768692683</Id>
-      <Width>0</Width>
-      <Height>0</Height>
-      <XPath>//Image[@id='Profile.Org.Kanton']</XPath>
-      <ImageHash>1a0b7be4d8c69e4fe4dabdfa77453b38</ImageHash>
-    </ImageSizeDefinition>
-    <ImageSizeDefinition>
-      <Id>391736964</Id>
-      <Width>0</Width>
-      <Height>0</Height>
-      <XPath>//Image[@id='Profile.Org.HeaderLogoShort']</XPath>
-      <ImageHash>7fe544e2f398d2732a9ea51d50e24d16</ImageHash>
-    </ImageSizeDefinition>
-  </ImageDefinitions>
-</OneOffixxImageDefinitionPart>
-</file>
-
-<file path=customXml/item8.xml><?xml version="1.0" encoding="utf-8"?>
+<file path=customXml/item3.xml><?xml version="1.0" encoding="utf-8"?>
 <ct:contentTypeSchema xmlns:ct="http://schemas.microsoft.com/office/2006/metadata/contentType" xmlns:ma="http://schemas.microsoft.com/office/2006/metadata/properties/metaAttributes" ct:_="" ma:_="" ma:contentTypeName="Dokument" ma:contentTypeID="0x01010083D3B4F185DA3D4CB05F9C4C9E20B85B" ma:contentTypeVersion="11" ma:contentTypeDescription="Ein neues Dokument erstellen." ma:contentTypeScope="" ma:versionID="fd4c522e7c1ba389c0ef28d8fc191cb1">
   <xsd:schema xmlns:xsd="http://www.w3.org/2001/XMLSchema" xmlns:xs="http://www.w3.org/2001/XMLSchema" xmlns:p="http://schemas.microsoft.com/office/2006/metadata/properties" xmlns:ns2="98fe2ab8-7d83-4567-ba90-4f594ae3f4fd" xmlns:ns3="09640fe3-f50f-46c8-a6f7-a2176bb49e6a" targetNamespace="http://schemas.microsoft.com/office/2006/metadata/properties" ma:root="true" ma:fieldsID="be49d5eaf2a269482a3e3d593c28e72e" ns2:_="" ns3:_="">
     <xsd:import namespace="98fe2ab8-7d83-4567-ba90-4f594ae3f4fd"/>
@@ -17223,6 +16560,624 @@
 </ct:contentTypeSchema>
 </file>
 
+<file path=customXml/item4.xml><?xml version="1.0" encoding="utf-8"?>
+<p:properties xmlns:p="http://schemas.microsoft.com/office/2006/metadata/properties" xmlns:xsi="http://www.w3.org/2001/XMLSchema-instance" xmlns:pc="http://schemas.microsoft.com/office/infopath/2007/PartnerControls">
+  <documentManagement>
+    <TaxCatchAll xmlns="09640fe3-f50f-46c8-a6f7-a2176bb49e6a" xsi:nil="true"/>
+    <lcf76f155ced4ddcb4097134ff3c332f xmlns="98fe2ab8-7d83-4567-ba90-4f594ae3f4fd">
+      <Terms xmlns="http://schemas.microsoft.com/office/infopath/2007/PartnerControls"/>
+    </lcf76f155ced4ddcb4097134ff3c332f>
+  </documentManagement>
+</p:properties>
+</file>
+
+<file path=customXml/item5.xml>��< ? x m l   v e r s i o n = " 1 . 0 "   e n c o d i n g = " u t f - 1 6 " ? > < O n e O f f i x x D o c u m e n t P a r t   x m l n s : x s d = " h t t p : / / w w w . w 3 . o r g / 2 0 0 1 / X M L S c h e m a "   x m l n s : x s i = " h t t p : / / w w w . w 3 . o r g / 2 0 0 1 / X M L S c h e m a - i n s t a n c e "   i d = " 8 8 7 e d 9 d 7 - 7 7 b 6 - 4 9 e f - 9 b f 1 - 8 5 4 e 6 a 4 a a 3 4 1 "   t I d = " 7 c d 7 f b 1 d - 6 0 8 5 - 4 8 a 8 - b 5 8 7 - f 9 3 7 7 9 4 4 d 4 1 e "   m t I d = " 2 7 5 a f 3 2 e - b c 4 0 - 4 5 c 2 - 8 5 b 7 - a f b 1 c 0 3 8 2 6 5 3 "   t n a m e = " N e u t r a l   A 4   h o c h "   r e v i s i o n = " 3 "   c r e a t e d m a j o r v e r s i o n = " 2 "   c r e a t e d m i n o r v e r s i o n = " 0 "   c r e a t e d = " 2 0 1 5 - 1 2 - 0 3 T 1 7 : 3 7 : 0 2 . 8 5 6 1 3 1 7 + 0 1 : 0 0 "   m o d i f i e d m a j o r v e r s i o n = " 2 "   m o d i f i e d m i n o r v e r s i o n = " 3 "   m o d i f i e d = " 2 0 1 7 - 0 2 - 0 1 T 1 8 : 4 9 : 5 3 . 7 0 9 9 7 6 8 + 0 1 : 0 0 "   p r o f i l e = " a 1 4 4 4 5 a b - 1 f 9 9 - 4 4 6 9 - 8 b 5 a - 1 d a 7 1 0 b 9 8 2 b 0 "   m o d e = " S a v e d D o c u m e n t "   c o l o r m o d e = " C o l o r "   l c i d = " 2 0 5 5 "   x m l n s = " h t t p : / / s c h e m a . o n e o f f i x x . c o m / O n e O f f i x x D o c u m e n t P a r t / 1 " > + 
+     < C o n t e n t > + 
+         < D a t a M o d e l   x m l n s = " h t t p : / / s c h e m a . o n e o f f i x x . c o m / O n e O f f i x x D o c u m e n t P a r t / 1 / F i n a l i z e d " > + 
+             < P r o f i l e   w i n d o w w i d t h = " 0 "   w i n d o w h e i g h t = " 0 "   m i n w i n d o w w i d t h = " 0 "   m a x w i n d o w w i d t h = " 0 "   m i n w i n d o w h e i g h t = " 0 "   m a x w i n d o w h e i g h t = " 0 " > + 
+                 < T e x t   i d = " P r o f i l e . I d "   r o w = " 0 "   c o l u m n = " 0 "   c o l u m n s p a n = " 0 "   m u l t i l i n e = " F a l s e "   m u l t i l i n e r o w s = " 3 "   l o c k e d = " F a l s e "   l a b e l = " P r o f i l e . I d "   r e a d o n l y = " F a l s e "   v i s i b l e = " T r u e "   r e q u i r e d = " F a l s e "   r e g e x = " "   v a l i d a t i o n m e s s a g e = " "   t o o l t i p = " "   t r a c k e d = " F a l s e " > < ! [ C D A T A [ a 1 4 4 4 5 a b - 1 f 9 9 - 4 4 6 9 - 8 b 5 a - 1 d a 7 1 0 b 9 8 2 b 0 ] ] > < / T e x t > + 
+                 < T e x t   i d = " P r o f i l e . O r g a n i z a t i o n U n i t I d "   r o w = " 0 "   c o l u m n = " 0 "   c o l u m n s p a n = " 0 "   m u l t i l i n e = " F a l s e "   m u l t i l i n e r o w s = " 3 "   l o c k e d = " F a l s e "   l a b e l = " P r o f i l e . O r g a n i z a t i o n U n i t I d "   r e a d o n l y = " F a l s e "   v i s i b l e = " T r u e "   r e q u i r e d = " F a l s e "   r e g e x = " "   v a l i d a t i o n m e s s a g e = " "   t o o l t i p = " "   t r a c k e d = " F a l s e " > < ! [ C D A T A [ 5 f 9 8 4 b 2 6 - 4 c e 2 - 4 6 f d - 8 4 a a - 1 f 7 d b 5 4 8 a f e 8 ] ] > < / T e x t > + 
+                 < T e x t   i d = " P r o f i l e . O r g . P o s t a l . C o u n t r y "   r o w = " 0 "   c o l u m n = " 0 "   c o l u m n s p a n = " 0 "   m u l t i l i n e = " F a l s e "   m u l t i l i n e r o w s = " 3 "   l o c k e d = " F a l s e "   l a b e l = " P r o f i l e . O r g . P o s t a l . C o u n t r y "   r e a d o n l y = " F a l s e "   v i s i b l e = " T r u e "   r e q u i r e d = " F a l s e "   r e g e x = " "   v a l i d a t i o n m e s s a g e = " "   t o o l t i p = " "   t r a c k e d = " F a l s e " > < ! [ C D A T A [ S c h w e i z ] ] > < / T e x t > + 
+                 < T e x t   i d = " P r o f i l e . O r g . P o s t a l . L Z i p "   r o w = " 0 "   c o l u m n = " 0 "   c o l u m n s p a n = " 0 "   m u l t i l i n e = " F a l s e "   m u l t i l i n e r o w s = " 3 "   l o c k e d = " F a l s e "   l a b e l = " P r o f i l e . O r g . P o s t a l . L Z i p "   r e a d o n l y = " F a l s e "   v i s i b l e = " T r u e "   r e q u i r e d = " F a l s e "   r e g e x = " "   v a l i d a t i o n m e s s a g e = " "   t o o l t i p = " "   t r a c k e d = " F a l s e " > < ! [ C D A T A [ C H ] ] > < / T e x t > + 
+                 < T e x t   i d = " P r o f i l e . O r g . T i t l e "   r o w = " 0 "   c o l u m n = " 0 "   c o l u m n s p a n = " 0 "   m u l t i l i n e = " F a l s e "   m u l t i l i n e r o w s = " 3 "   l o c k e d = " F a l s e "   l a b e l = " P r o f i l e . O r g . T i t l e "   r e a d o n l y = " F a l s e "   v i s i b l e = " T r u e "   r e q u i r e d = " F a l s e "   r e g e x = " "   v a l i d a t i o n m e s s a g e = " "   t o o l t i p = " "   t r a c k e d = " F a l s e " > < ! [ C D A T A [ K a n t o n   Z � r i c h ] ] > < / T e x t > + 
+                 < T e x t   i d = " P r o f i l e . U s e r . A l i a s "   r o w = " 0 "   c o l u m n = " 0 "   c o l u m n s p a n = " 0 "   m u l t i l i n e = " F a l s e "   m u l t i l i n e r o w s = " 3 "   l o c k e d = " F a l s e "   l a b e l = " P r o f i l e . U s e r . A l i a s "   r e a d o n l y = " F a l s e "   v i s i b l e = " T r u e "   r e q u i r e d = " F a l s e "   r e g e x = " "   v a l i d a t i o n m e s s a g e = " "   t o o l t i p = " "   t r a c k e d = " F a l s e " > < ! [ C D A T A [   ] ] > < / T e x t > + 
+                 < T e x t   i d = " P r o f i l e . U s e r . E m a i l "   r o w = " 0 "   c o l u m n = " 0 "   c o l u m n s p a n = " 0 "   m u l t i l i n e = " F a l s e "   m u l t i l i n e r o w s = " 3 "   l o c k e d = " F a l s e "   l a b e l = " P r o f i l e . U s e r . E m a i l "   r e a d o n l y = " F a l s e "   v i s i b l e = " T r u e "   r e q u i r e d = " F a l s e "   r e g e x = " "   v a l i d a t i o n m e s s a g e = " "   t o o l t i p = " "   t r a c k e d = " F a l s e " > < ! [ C D A T A [ a n d r e a . l u e b b e r s t e d t @ s a . z h . c h ] ] > < / T e x t > + 
+                 < T e x t   i d = " P r o f i l e . U s e r . F a x "   r o w = " 0 "   c o l u m n = " 0 "   c o l u m n s p a n = " 0 "   m u l t i l i n e = " F a l s e "   m u l t i l i n e r o w s = " 3 "   l o c k e d = " F a l s e "   l a b e l = " P r o f i l e . U s e r . F a x "   r e a d o n l y = " F a l s e "   v i s i b l e = " T r u e "   r e q u i r e d = " F a l s e "   r e g e x = " "   v a l i d a t i o n m e s s a g e = " "   t o o l t i p = " "   t r a c k e d = " F a l s e " > < ! [ C D A T A [ + 4 1   4 3   2 5 9   5 1   0 7 ] ] > < / T e x t > + 
+                 < T e x t   i d = " P r o f i l e . U s e r . F i r s t N a m e "   r o w = " 0 "   c o l u m n = " 0 "   c o l u m n s p a n = " 0 "   m u l t i l i n e = " F a l s e "   m u l t i l i n e r o w s = " 3 "   l o c k e d = " F a l s e "   l a b e l = " P r o f i l e . U s e r . F i r s t N a m e "   r e a d o n l y = " F a l s e "   v i s i b l e = " T r u e "   r e q u i r e d = " F a l s e "   r e g e x = " "   v a l i d a t i o n m e s s a g e = " "   t o o l t i p = " "   t r a c k e d = " F a l s e " > < ! [ C D A T A [ A n d r e a ] ] > < / T e x t > + 
+                 < T e x t   i d = " P r o f i l e . U s e r . F u n c t i o n "   r o w = " 0 "   c o l u m n = " 0 "   c o l u m n s p a n = " 0 "   m u l t i l i n e = " F a l s e "   m u l t i l i n e r o w s = " 3 "   l o c k e d = " F a l s e "   l a b e l = " P r o f i l e . U s e r . F u n c t i o n "   r e a d o n l y = " F a l s e "   v i s i b l e = " T r u e "   r e q u i r e d = " F a l s e "   r e g e x = " "   v a l i d a t i o n m e s s a g e = " "   t o o l t i p = " "   t r a c k e d = " F a l s e " > < ! [ C D A T A [ A m t s c h e f i n ] ] > < / T e x t > + 
+                 < T e x t   i d = " P r o f i l e . U s e r . J o b D e s c r i p t i o n "   r o w = " 0 "   c o l u m n = " 0 "   c o l u m n s p a n = " 0 "   m u l t i l i n e = " F a l s e "   m u l t i l i n e r o w s = " 3 "   l o c k e d = " F a l s e "   l a b e l = " P r o f i l e . U s e r . J o b D e s c r i p t i o n "   r e a d o n l y = " F a l s e "   v i s i b l e = " T r u e "   r e q u i r e d = " F a l s e "   r e g e x = " "   v a l i d a t i o n m e s s a g e = " "   t o o l t i p = " "   t r a c k e d = " F a l s e " > < ! [ C D A T A [   ] ] > < / T e x t > + 
+                 < T e x t   i d = " P r o f i l e . U s e r . L a s t N a m e "   r o w = " 0 "   c o l u m n = " 0 "   c o l u m n s p a n = " 0 "   m u l t i l i n e = " F a l s e "   m u l t i l i n e r o w s = " 3 "   l o c k e d = " F a l s e "   l a b e l = " P r o f i l e . U s e r . L a s t N a m e "   r e a d o n l y = " F a l s e "   v i s i b l e = " T r u e "   r e q u i r e d = " F a l s e "   r e g e x = " "   v a l i d a t i o n m e s s a g e = " "   t o o l t i p = " "   t r a c k e d = " F a l s e " > < ! [ C D A T A [ L � b b e r s t e d t ] ] > < / T e x t > + 
+                 < T e x t   i d = " P r o f i l e . U s e r . O u L e v 1 "   r o w = " 0 "   c o l u m n = " 0 "   c o l u m n s p a n = " 0 "   m u l t i l i n e = " F a l s e "   m u l t i l i n e r o w s = " 3 "   l o c k e d = " F a l s e "   l a b e l = " P r o f i l e . U s e r . O u L e v 1 "   r e a d o n l y = " F a l s e "   v i s i b l e = " T r u e "   r e q u i r e d = " F a l s e "   r e g e x = " "   v a l i d a t i o n m e s s a g e = " "   t o o l t i p = " "   t r a c k e d = " F a l s e " > < ! [ C D A T A [ K a n t o n   Z � r i c h ] ] > < / T e x t > + 
+                 < T e x t   i d = " P r o f i l e . U s e r . O u L e v 2 "   r o w = " 0 "   c o l u m n = " 0 "   c o l u m n s p a n = " 0 "   m u l t i l i n e = " F a l s e "   m u l t i l i n e r o w s = " 3 "   l o c k e d = " F a l s e "   l a b e l = " P r o f i l e . U s e r . O u L e v 2 "   r e a d o n l y = " F a l s e "   v i s i b l e = " T r u e "   r e q u i r e d = " F a l s e "   r e g e x = " "   v a l i d a t i o n m e s s a g e = " "   t o o l t i p = " "   t r a c k e d = " F a l s e " > < ! [ C D A T A [ S i c h e r h e i t s d i r e k t i o n ] ] > < / T e x t > + 
+                 < T e x t   i d = " P r o f i l e . U s e r . O u L e v 3 "   r o w = " 0 "   c o l u m n = " 0 "   c o l u m n s p a n = " 0 "   m u l t i l i n e = " F a l s e "   m u l t i l i n e r o w s = " 3 "   l o c k e d = " F a l s e "   l a b e l = " P r o f i l e . U s e r . O u L e v 3 "   r e a d o n l y = " F a l s e "   v i s i b l e = " T r u e "   r e q u i r e d = " F a l s e "   r e g e x = " "   v a l i d a t i o n m e s s a g e = " "   t o o l t i p = " "   t r a c k e d = " F a l s e " > < ! [ C D A T A [ K a n t o n a l e s   S o z i a l a m t ] ] > < / T e x t > + 
+                 < T e x t   i d = " P r o f i l e . U s e r . O u L e v 4 "   r o w = " 0 "   c o l u m n = " 0 "   c o l u m n s p a n = " 0 "   m u l t i l i n e = " F a l s e "   m u l t i l i n e r o w s = " 3 "   l o c k e d = " F a l s e "   l a b e l = " P r o f i l e . U s e r . O u L e v 4 "   r e a d o n l y = " F a l s e "   v i s i b l e = " T r u e "   r e q u i r e d = " F a l s e "   r e g e x = " "   v a l i d a t i o n m e s s a g e = " "   t o o l t i p = " "   t r a c k e d = " F a l s e " > < ! [ C D A T A [   ] ] > < / T e x t > + 
+                 < T e x t   i d = " P r o f i l e . U s e r . O u L e v 5 "   r o w = " 0 "   c o l u m n = " 0 "   c o l u m n s p a n = " 0 "   m u l t i l i n e = " F a l s e "   m u l t i l i n e r o w s = " 3 "   l o c k e d = " F a l s e "   l a b e l = " P r o f i l e . U s e r . O u L e v 5 "   r e a d o n l y = " F a l s e "   v i s i b l e = " T r u e "   r e q u i r e d = " F a l s e "   r e g e x = " "   v a l i d a t i o n m e s s a g e = " "   t o o l t i p = " "   t r a c k e d = " F a l s e " > < ! [ C D A T A [   ] ] > < / T e x t > + 
+                 < T e x t   i d = " P r o f i l e . U s e r . O u L e v 6 "   r o w = " 0 "   c o l u m n = " 0 "   c o l u m n s p a n = " 0 "   m u l t i l i n e = " F a l s e "   m u l t i l i n e r o w s = " 3 "   l o c k e d = " F a l s e "   l a b e l = " P r o f i l e . U s e r . O u L e v 6 "   r e a d o n l y = " F a l s e "   v i s i b l e = " T r u e "   r e q u i r e d = " F a l s e "   r e g e x = " "   v a l i d a t i o n m e s s a g e = " "   t o o l t i p = " "   t r a c k e d = " F a l s e " > < ! [ C D A T A [   ] ] > < / T e x t > + 
+                 < T e x t   i d = " P r o f i l e . U s e r . O u L e v 7 "   r o w = " 0 "   c o l u m n = " 0 "   c o l u m n s p a n = " 0 "   m u l t i l i n e = " F a l s e "   m u l t i l i n e r o w s = " 3 "   l o c k e d = " F a l s e "   l a b e l = " P r o f i l e . U s e r . O u L e v 7 "   r e a d o n l y = " F a l s e "   v i s i b l e = " T r u e "   r e q u i r e d = " F a l s e "   r e g e x = " "   v a l i d a t i o n m e s s a g e = " "   t o o l t i p = " "   t r a c k e d = " F a l s e " > < ! [ C D A T A [   ] ] > < / T e x t > + 
+                 < T e x t   i d = " P r o f i l e . U s e r . O u M a i l "   r o w = " 0 "   c o l u m n = " 0 "   c o l u m n s p a n = " 0 "   m u l t i l i n e = " F a l s e "   m u l t i l i n e r o w s = " 3 "   l o c k e d = " F a l s e "   l a b e l = " P r o f i l e . U s e r . O u M a i l "   r e a d o n l y = " F a l s e "   v i s i b l e = " T r u e "   r e q u i r e d = " F a l s e "   r e g e x = " "   v a l i d a t i o n m e s s a g e = " "   t o o l t i p = " "   t r a c k e d = " F a l s e " > < ! [ C D A T A [ i n f o @ s a . z h . c h ] ] > < / T e x t > + 
+                 < T e x t   i d = " P r o f i l e . U s e r . O u P h o n e "   r o w = " 0 "   c o l u m n = " 0 "   c o l u m n s p a n = " 0 "   m u l t i l i n e = " F a l s e "   m u l t i l i n e r o w s = " 3 "   l o c k e d = " F a l s e "   l a b e l = " P r o f i l e . U s e r . O u P h o n e "   r e a d o n l y = " F a l s e "   v i s i b l e = " T r u e "   r e q u i r e d = " F a l s e "   r e g e x = " "   v a l i d a t i o n m e s s a g e = " "   t o o l t i p = " "   t r a c k e d = " F a l s e " > < ! [ C D A T A [ + 4 1   4 3   2 5 9   2 4   5 1 ] ] > < / T e x t > + 
+                 < T e x t   i d = " P r o f i l e . U s e r . P h o n e "   r o w = " 0 "   c o l u m n = " 0 "   c o l u m n s p a n = " 0 "   m u l t i l i n e = " F a l s e "   m u l t i l i n e r o w s = " 3 "   l o c k e d = " F a l s e "   l a b e l = " P r o f i l e . U s e r . P h o n e "   r e a d o n l y = " F a l s e "   v i s i b l e = " T r u e "   r e q u i r e d = " F a l s e "   r e g e x = " "   v a l i d a t i o n m e s s a g e = " "   t o o l t i p = " "   t r a c k e d = " F a l s e " > < ! [ C D A T A [ + 4 1   4 3   2 5 9   2 4   5 0 ] ] > < / T e x t > + 
+                 < T e x t   i d = " P r o f i l e . U s e r . P o s t a l . C i t y "   r o w = " 0 "   c o l u m n = " 0 "   c o l u m n s p a n = " 0 "   m u l t i l i n e = " F a l s e "   m u l t i l i n e r o w s = " 3 "   l o c k e d = " F a l s e "   l a b e l = " P r o f i l e . U s e r . P o s t a l . C i t y "   r e a d o n l y = " F a l s e "   v i s i b l e = " T r u e "   r e q u i r e d = " F a l s e "   r e g e x = " "   v a l i d a t i o n m e s s a g e = " "   t o o l t i p = " "   t r a c k e d = " F a l s e " > < ! [ C D A T A [ Z � r i c h ] ] > < / T e x t > + 
+                 < T e x t   i d = " P r o f i l e . U s e r . P o s t a l . O f f i c e N a m e "   r o w = " 0 "   c o l u m n = " 0 "   c o l u m n s p a n = " 0 "   m u l t i l i n e = " F a l s e "   m u l t i l i n e r o w s = " 3 "   l o c k e d = " F a l s e "   l a b e l = " P r o f i l e . U s e r . P o s t a l . O f f i c e N a m e "   r e a d o n l y = " F a l s e "   v i s i b l e = " T r u e "   r e q u i r e d = " F a l s e "   r e g e x = " "   v a l i d a t i o n m e s s a g e = " "   t o o l t i p = " "   t r a c k e d = " F a l s e " > < ! [ C D A T A [ 5 0 5 ] ] > < / T e x t > + 
+                 < T e x t   i d = " P r o f i l e . U s e r . P o s t a l . P O B o x "   r o w = " 0 "   c o l u m n = " 0 "   c o l u m n s p a n = " 0 "   m u l t i l i n e = " F a l s e "   m u l t i l i n e r o w s = " 3 "   l o c k e d = " F a l s e "   l a b e l = " P r o f i l e . U s e r . P o s t a l . P O B o x "   r e a d o n l y = " F a l s e "   v i s i b l e = " T r u e "   r e q u i r e d = " F a l s e "   r e g e x = " "   v a l i d a t i o n m e s s a g e = " "   t o o l t i p = " "   t r a c k e d = " F a l s e " > < ! [ C D A T A [ P o s t f a c h ] ] > < / T e x t > + 
+                 < T e x t   i d = " P r o f i l e . U s e r . P o s t a l . S t r e e t "   r o w = " 0 "   c o l u m n = " 0 "   c o l u m n s p a n = " 0 "   m u l t i l i n e = " F a l s e "   m u l t i l i n e r o w s = " 3 "   l o c k e d = " F a l s e "   l a b e l = " P r o f i l e . U s e r . P o s t a l . S t r e e t "   r e a d o n l y = " F a l s e "   v i s i b l e = " T r u e "   r e q u i r e d = " F a l s e "   r e g e x = " "   v a l i d a t i o n m e s s a g e = " "   t o o l t i p = " "   t r a c k e d = " F a l s e " > < ! [ C D A T A [ S c h a f f h a u s e r s t r a s s e   7 8 ] ] > < / T e x t > + 
+                 < T e x t   i d = " P r o f i l e . U s e r . P o s t a l . Z i p "   r o w = " 0 "   c o l u m n = " 0 "   c o l u m n s p a n = " 0 "   m u l t i l i n e = " F a l s e "   m u l t i l i n e r o w s = " 3 "   l o c k e d = " F a l s e "   l a b e l = " P r o f i l e . U s e r . P o s t a l . Z i p "   r e a d o n l y = " F a l s e "   v i s i b l e = " T r u e "   r e q u i r e d = " F a l s e "   r e g e x = " "   v a l i d a t i o n m e s s a g e = " "   t o o l t i p = " "   t r a c k e d = " F a l s e " > < ! [ C D A T A [ 8 0 9 0 ] ] > < / T e x t > + 
+                 < T e x t   i d = " P r o f i l e . U s e r . S a l u t a t i o n "   r o w = " 0 "   c o l u m n = " 0 "   c o l u m n s p a n = " 0 "   m u l t i l i n e = " F a l s e "   m u l t i l i n e r o w s = " 3 "   l o c k e d = " F a l s e "   l a b e l = " P r o f i l e . U s e r . S a l u t a t i o n "   r e a d o n l y = " F a l s e "   v i s i b l e = " T r u e "   r e q u i r e d = " F a l s e "   r e g e x = " "   v a l i d a t i o n m e s s a g e = " "   t o o l t i p = " "   t r a c k e d = " F a l s e " > < ! [ C D A T A [ F r a u ] ] > < / T e x t > + 
+                 < T e x t   i d = " P r o f i l e . U s e r . T i t l e "   r o w = " 0 "   c o l u m n = " 0 "   c o l u m n s p a n = " 0 "   m u l t i l i n e = " F a l s e "   m u l t i l i n e r o w s = " 3 "   l o c k e d = " F a l s e "   l a b e l = " P r o f i l e . U s e r . T i t l e "   r e a d o n l y = " F a l s e "   v i s i b l e = " T r u e "   r e q u i r e d = " F a l s e "   r e g e x = " "   v a l i d a t i o n m e s s a g e = " "   t o o l t i p = " "   t r a c k e d = " F a l s e " > < ! [ C D A T A [   ] ] > < / T e x t > + 
+                 < T e x t   i d = " P r o f i l e . U s e r . U r l "   r o w = " 0 "   c o l u m n = " 0 "   c o l u m n s p a n = " 0 "   m u l t i l i n e = " F a l s e "   m u l t i l i n e r o w s = " 3 "   l o c k e d = " F a l s e "   l a b e l = " P r o f i l e . U s e r . U r l "   r e a d o n l y = " F a l s e "   v i s i b l e = " T r u e "   r e q u i r e d = " F a l s e "   r e g e x = " "   v a l i d a t i o n m e s s a g e = " "   t o o l t i p = " "   t r a c k e d = " F a l s e " > < ! [ C D A T A [ w w w . s o z i a l a m t . z h . c h ] ] > < / T e x t > + 
+             < / P r o f i l e > + 
+             < A u t h o r   w i n d o w w i d t h = " 0 "   w i n d o w h e i g h t = " 0 "   m i n w i n d o w w i d t h = " 0 "   m a x w i n d o w w i d t h = " 0 "   m i n w i n d o w h e i g h t = " 0 "   m a x w i n d o w h e i g h t = " 0 " > + 
+                 < T e x t   i d = " A u t h o r . U s e r . A l i a s "   r o w = " 0 "   c o l u m n = " 0 "   c o l u m n s p a n = " 0 "   m u l t i l i n e = " F a l s e "   m u l t i l i n e r o w s = " 3 "   l o c k e d = " F a l s e "   l a b e l = " A u t h o r . U s e r . A l i a s "   r e a d o n l y = " F a l s e "   v i s i b l e = " T r u e "   r e q u i r e d = " F a l s e "   r e g e x = " "   v a l i d a t i o n m e s s a g e = " "   t o o l t i p = " "   t r a c k e d = " F a l s e " > < ! [ C D A T A [   ] ] > < / T e x t > + 
+                 < T e x t   i d = " A u t h o r . U s e r . E m a i l "   r o w = " 0 "   c o l u m n = " 0 "   c o l u m n s p a n = " 0 "   m u l t i l i n e = " F a l s e "   m u l t i l i n e r o w s = " 3 "   l o c k e d = " F a l s e "   l a b e l = " A u t h o r . U s e r . E m a i l "   r e a d o n l y = " F a l s e "   v i s i b l e = " T r u e "   r e q u i r e d = " F a l s e "   r e g e x = " "   v a l i d a t i o n m e s s a g e = " "   t o o l t i p = " "   t r a c k e d = " F a l s e " > < ! [ C D A T A [ a n d r e a . l u e b b e r s t e d t @ s a . z h . c h ] ] > < / T e x t > + 
+                 < T e x t   i d = " A u t h o r . U s e r . F a x "   r o w = " 0 "   c o l u m n = " 0 "   c o l u m n s p a n = " 0 "   m u l t i l i n e = " F a l s e "   m u l t i l i n e r o w s = " 3 "   l o c k e d = " F a l s e "   l a b e l = " A u t h o r . U s e r . F a x "   r e a d o n l y = " F a l s e "   v i s i b l e = " T r u e "   r e q u i r e d = " F a l s e "   r e g e x = " "   v a l i d a t i o n m e s s a g e = " "   t o o l t i p = " "   t r a c k e d = " F a l s e " > < ! [ C D A T A [ + 4 1   4 3   2 5 9   5 1   0 7 ] ] > < / T e x t > + 
+                 < T e x t   i d = " A u t h o r . U s e r . F i r s t N a m e "   r o w = " 0 "   c o l u m n = " 0 "   c o l u m n s p a n = " 0 "   m u l t i l i n e = " F a l s e "   m u l t i l i n e r o w s = " 3 "   l o c k e d = " F a l s e "   l a b e l = " A u t h o r . U s e r . F i r s t N a m e "   r e a d o n l y = " F a l s e "   v i s i b l e = " T r u e "   r e q u i r e d = " F a l s e "   r e g e x = " "   v a l i d a t i o n m e s s a g e = " "   t o o l t i p = " "   t r a c k e d = " F a l s e " > < ! [ C D A T A [ A n d r e a ] ] > < / T e x t > + 
+                 < T e x t   i d = " A u t h o r . U s e r . F u n c t i o n "   r o w = " 0 "   c o l u m n = " 0 "   c o l u m n s p a n = " 0 "   m u l t i l i n e = " F a l s e "   m u l t i l i n e r o w s = " 3 "   l o c k e d = " F a l s e "   l a b e l = " A u t h o r . U s e r . F u n c t i o n "   r e a d o n l y = " F a l s e "   v i s i b l e = " T r u e "   r e q u i r e d = " F a l s e "   r e g e x = " "   v a l i d a t i o n m e s s a g e = " "   t o o l t i p = " "   t r a c k e d = " F a l s e " > < ! [ C D A T A [ A m t s c h e f i n ] ] > < / T e x t > + 
+                 < T e x t   i d = " A u t h o r . U s e r . J o b D e s c r i p t i o n "   r o w = " 0 "   c o l u m n = " 0 "   c o l u m n s p a n = " 0 "   m u l t i l i n e = " F a l s e "   m u l t i l i n e r o w s = " 3 "   l o c k e d = " F a l s e "   l a b e l = " A u t h o r . U s e r . J o b D e s c r i p t i o n "   r e a d o n l y = " F a l s e "   v i s i b l e = " T r u e "   r e q u i r e d = " F a l s e "   r e g e x = " "   v a l i d a t i o n m e s s a g e = " "   t o o l t i p = " "   t r a c k e d = " F a l s e " > < ! [ C D A T A [   ] ] > < / T e x t > + 
+                 < T e x t   i d = " A u t h o r . U s e r . L a s t N a m e "   r o w = " 0 "   c o l u m n = " 0 "   c o l u m n s p a n = " 0 "   m u l t i l i n e = " F a l s e "   m u l t i l i n e r o w s = " 3 "   l o c k e d = " F a l s e "   l a b e l = " A u t h o r . U s e r . L a s t N a m e "   r e a d o n l y = " F a l s e "   v i s i b l e = " T r u e "   r e q u i r e d = " F a l s e "   r e g e x = " "   v a l i d a t i o n m e s s a g e = " "   t o o l t i p = " "   t r a c k e d = " F a l s e " > < ! [ C D A T A [ L � b b e r s t e d t ] ] > < / T e x t > + 
+                 < T e x t   i d = " A u t h o r . U s e r . O u L e v 1 "   r o w = " 0 "   c o l u m n = " 0 "   c o l u m n s p a n = " 0 "   m u l t i l i n e = " F a l s e "   m u l t i l i n e r o w s = " 3 "   l o c k e d = " F a l s e "   l a b e l = " A u t h o r . U s e r . O u L e v 1 "   r e a d o n l y = " F a l s e "   v i s i b l e = " T r u e "   r e q u i r e d = " F a l s e "   r e g e x = " "   v a l i d a t i o n m e s s a g e = " "   t o o l t i p = " "   t r a c k e d = " F a l s e " > < ! [ C D A T A [ K a n t o n   Z � r i c h ] ] > < / T e x t > + 
+                 < T e x t   i d = " A u t h o r . U s e r . O u L e v 2 "   r o w = " 0 "   c o l u m n = " 0 "   c o l u m n s p a n = " 0 "   m u l t i l i n e = " F a l s e "   m u l t i l i n e r o w s = " 3 "   l o c k e d = " F a l s e "   l a b e l = " A u t h o r . U s e r . O u L e v 2 "   r e a d o n l y = " F a l s e "   v i s i b l e = " T r u e "   r e q u i r e d = " F a l s e "   r e g e x = " "   v a l i d a t i o n m e s s a g e = " "   t o o l t i p = " "   t r a c k e d = " F a l s e " > < ! [ C D A T A [ S i c h e r h e i t s d i r e k t i o n ] ] > < / T e x t > + 
+                 < T e x t   i d = " A u t h o r . U s e r . O u L e v 3 "   r o w = " 0 "   c o l u m n = " 0 "   c o l u m n s p a n = " 0 "   m u l t i l i n e = " F a l s e "   m u l t i l i n e r o w s = " 3 "   l o c k e d = " F a l s e "   l a b e l = " A u t h o r . U s e r . O u L e v 3 "   r e a d o n l y = " F a l s e "   v i s i b l e = " T r u e "   r e q u i r e d = " F a l s e "   r e g e x = " "   v a l i d a t i o n m e s s a g e = " "   t o o l t i p = " "   t r a c k e d = " F a l s e " > < ! [ C D A T A [ K a n t o n a l e s   S o z i a l a m t ] ] > < / T e x t > + 
+                 < T e x t   i d = " A u t h o r . U s e r . O u L e v 4 "   r o w = " 0 "   c o l u m n = " 0 "   c o l u m n s p a n = " 0 "   m u l t i l i n e = " F a l s e "   m u l t i l i n e r o w s = " 3 "   l o c k e d = " F a l s e "   l a b e l = " A u t h o r . U s e r . O u L e v 4 "   r e a d o n l y = " F a l s e "   v i s i b l e = " T r u e "   r e q u i r e d = " F a l s e "   r e g e x = " "   v a l i d a t i o n m e s s a g e = " "   t o o l t i p = " "   t r a c k e d = " F a l s e " > < ! [ C D A T A [   ] ] > < / T e x t > + 
+                 < T e x t   i d = " A u t h o r . U s e r . O u L e v 5 "   r o w = " 0 "   c o l u m n = " 0 "   c o l u m n s p a n = " 0 "   m u l t i l i n e = " F a l s e "   m u l t i l i n e r o w s = " 3 "   l o c k e d = " F a l s e "   l a b e l = " A u t h o r . U s e r . O u L e v 5 "   r e a d o n l y = " F a l s e "   v i s i b l e = " T r u e "   r e q u i r e d = " F a l s e "   r e g e x = " "   v a l i d a t i o n m e s s a g e = " "   t o o l t i p = " "   t r a c k e d = " F a l s e " > < ! [ C D A T A [   ] ] > < / T e x t > + 
+                 < T e x t   i d = " A u t h o r . U s e r . O u L e v 6 "   r o w = " 0 "   c o l u m n = " 0 "   c o l u m n s p a n = " 0 "   m u l t i l i n e = " F a l s e "   m u l t i l i n e r o w s = " 3 "   l o c k e d = " F a l s e "   l a b e l = " A u t h o r . U s e r . O u L e v 6 "   r e a d o n l y = " F a l s e "   v i s i b l e = " T r u e "   r e q u i r e d = " F a l s e "   r e g e x = " "   v a l i d a t i o n m e s s a g e = " "   t o o l t i p = " "   t r a c k e d = " F a l s e " > < ! [ C D A T A [   ] ] > < / T e x t > + 
+                 < T e x t   i d = " A u t h o r . U s e r . O u L e v 7 "   r o w = " 0 "   c o l u m n = " 0 "   c o l u m n s p a n = " 0 "   m u l t i l i n e = " F a l s e "   m u l t i l i n e r o w s = " 3 "   l o c k e d = " F a l s e "   l a b e l = " A u t h o r . U s e r . O u L e v 7 "   r e a d o n l y = " F a l s e "   v i s i b l e = " T r u e "   r e q u i r e d = " F a l s e "   r e g e x = " "   v a l i d a t i o n m e s s a g e = " "   t o o l t i p = " "   t r a c k e d = " F a l s e " > < ! [ C D A T A [   ] ] > < / T e x t > + 
+                 < T e x t   i d = " A u t h o r . U s e r . O u M a i l "   r o w = " 0 "   c o l u m n = " 0 "   c o l u m n s p a n = " 0 "   m u l t i l i n e = " F a l s e "   m u l t i l i n e r o w s = " 3 "   l o c k e d = " F a l s e "   l a b e l = " A u t h o r . U s e r . O u M a i l "   r e a d o n l y = " F a l s e "   v i s i b l e = " T r u e "   r e q u i r e d = " F a l s e "   r e g e x = " "   v a l i d a t i o n m e s s a g e = " "   t o o l t i p = " "   t r a c k e d = " F a l s e " > < ! [ C D A T A [ i n f o @ s a . z h . c h ] ] > < / T e x t > + 
+                 < T e x t   i d = " A u t h o r . U s e r . O u P h o n e "   r o w = " 0 "   c o l u m n = " 0 "   c o l u m n s p a n = " 0 "   m u l t i l i n e = " F a l s e "   m u l t i l i n e r o w s = " 3 "   l o c k e d = " F a l s e "   l a b e l = " A u t h o r . U s e r . O u P h o n e "   r e a d o n l y = " F a l s e "   v i s i b l e = " T r u e "   r e q u i r e d = " F a l s e "   r e g e x = " "   v a l i d a t i o n m e s s a g e = " "   t o o l t i p = " "   t r a c k e d = " F a l s e " > < ! [ C D A T A [ + 4 1   4 3   2 5 9   2 4   5 1 ] ] > < / T e x t > + 
+                 < T e x t   i d = " A u t h o r . U s e r . P h o n e "   r o w = " 0 "   c o l u m n = " 0 "   c o l u m n s p a n = " 0 "   m u l t i l i n e = " F a l s e "   m u l t i l i n e r o w s = " 3 "   l o c k e d = " F a l s e "   l a b e l = " A u t h o r . U s e r . P h o n e "   r e a d o n l y = " F a l s e "   v i s i b l e = " T r u e "   r e q u i r e d = " F a l s e "   r e g e x = " "   v a l i d a t i o n m e s s a g e = " "   t o o l t i p = " "   t r a c k e d = " F a l s e " > < ! [ C D A T A [ + 4 1   4 3   2 5 9   2 4   5 0 ] ] > < / T e x t > + 
+                 < T e x t   i d = " A u t h o r . U s e r . P o s t a l . C i t y "   r o w = " 0 "   c o l u m n = " 0 "   c o l u m n s p a n = " 0 "   m u l t i l i n e = " F a l s e "   m u l t i l i n e r o w s = " 3 "   l o c k e d = " F a l s e "   l a b e l = " A u t h o r . U s e r . P o s t a l . C i t y "   r e a d o n l y = " F a l s e "   v i s i b l e = " T r u e "   r e q u i r e d = " F a l s e "   r e g e x = " "   v a l i d a t i o n m e s s a g e = " "   t o o l t i p = " "   t r a c k e d = " F a l s e " > < ! [ C D A T A [ Z � r i c h ] ] > < / T e x t > + 
+                 < T e x t   i d = " A u t h o r . U s e r . P o s t a l . O f f i c e N a m e "   r o w = " 0 "   c o l u m n = " 0 "   c o l u m n s p a n = " 0 "   m u l t i l i n e = " F a l s e "   m u l t i l i n e r o w s = " 3 "   l o c k e d = " F a l s e "   l a b e l = " A u t h o r . U s e r . P o s t a l . O f f i c e N a m e "   r e a d o n l y = " F a l s e "   v i s i b l e = " T r u e "   r e q u i r e d = " F a l s e "   r e g e x = " "   v a l i d a t i o n m e s s a g e = " "   t o o l t i p = " "   t r a c k e d = " F a l s e " > < ! [ C D A T A [ 5 0 5 ] ] > < / T e x t > + 
+                 < T e x t   i d = " A u t h o r . U s e r . P o s t a l . P O B o x "   r o w = " 0 "   c o l u m n = " 0 "   c o l u m n s p a n = " 0 "   m u l t i l i n e = " F a l s e "   m u l t i l i n e r o w s = " 3 "   l o c k e d = " F a l s e "   l a b e l = " A u t h o r . U s e r . P o s t a l . P O B o x "   r e a d o n l y = " F a l s e "   v i s i b l e = " T r u e "   r e q u i r e d = " F a l s e "   r e g e x = " "   v a l i d a t i o n m e s s a g e = " "   t o o l t i p = " "   t r a c k e d = " F a l s e " > < ! [ C D A T A [ P o s t f a c h ] ] > < / T e x t > + 
+                 < T e x t   i d = " A u t h o r . U s e r . P o s t a l . S t r e e t "   r o w = " 0 "   c o l u m n = " 0 "   c o l u m n s p a n = " 0 "   m u l t i l i n e = " F a l s e "   m u l t i l i n e r o w s = " 3 "   l o c k e d = " F a l s e "   l a b e l = " A u t h o r . U s e r . P o s t a l . S t r e e t "   r e a d o n l y = " F a l s e "   v i s i b l e = " T r u e "   r e q u i r e d = " F a l s e "   r e g e x = " "   v a l i d a t i o n m e s s a g e = " "   t o o l t i p = " "   t r a c k e d = " F a l s e " > < ! [ C D A T A [ S c h a f f h a u s e r s t r a s s e   7 8 ] ] > < / T e x t > + 
+                 < T e x t   i d = " A u t h o r . U s e r . P o s t a l . Z i p "   r o w = " 0 "   c o l u m n = " 0 "   c o l u m n s p a n = " 0 "   m u l t i l i n e = " F a l s e "   m u l t i l i n e r o w s = " 3 "   l o c k e d = " F a l s e "   l a b e l = " A u t h o r . U s e r . P o s t a l . Z i p "   r e a d o n l y = " F a l s e "   v i s i b l e = " T r u e "   r e q u i r e d = " F a l s e "   r e g e x = " "   v a l i d a t i o n m e s s a g e = " "   t o o l t i p = " "   t r a c k e d = " F a l s e " > < ! [ C D A T A [ 8 0 9 0 ] ] > < / T e x t > + 
+                 < T e x t   i d = " A u t h o r . U s e r . S a l u t a t i o n "   r o w = " 0 "   c o l u m n = " 0 "   c o l u m n s p a n = " 0 "   m u l t i l i n e = " F a l s e "   m u l t i l i n e r o w s = " 3 "   l o c k e d = " F a l s e "   l a b e l = " A u t h o r . U s e r . S a l u t a t i o n "   r e a d o n l y = " F a l s e "   v i s i b l e = " T r u e "   r e q u i r e d = " F a l s e "   r e g e x = " "   v a l i d a t i o n m e s s a g e = " "   t o o l t i p = " "   t r a c k e d = " F a l s e " > < ! [ C D A T A [ F r a u ] ] > < / T e x t > + 
+                 < T e x t   i d = " A u t h o r . U s e r . T i t l e "   r o w = " 0 "   c o l u m n = " 0 "   c o l u m n s p a n = " 0 "   m u l t i l i n e = " F a l s e "   m u l t i l i n e r o w s = " 3 "   l o c k e d = " F a l s e "   l a b e l = " A u t h o r . U s e r . T i t l e "   r e a d o n l y = " F a l s e "   v i s i b l e = " T r u e "   r e q u i r e d = " F a l s e "   r e g e x = " "   v a l i d a t i o n m e s s a g e = " "   t o o l t i p = " "   t r a c k e d = " F a l s e " > < ! [ C D A T A [   ] ] > < / T e x t > + 
+                 < T e x t   i d = " A u t h o r . U s e r . U r l "   r o w = " 0 "   c o l u m n = " 0 "   c o l u m n s p a n = " 0 "   m u l t i l i n e = " F a l s e "   m u l t i l i n e r o w s = " 3 "   l o c k e d = " F a l s e "   l a b e l = " A u t h o r . U s e r . U r l "   r e a d o n l y = " F a l s e "   v i s i b l e = " T r u e "   r e q u i r e d = " F a l s e "   r e g e x = " "   v a l i d a t i o n m e s s a g e = " "   t o o l t i p = " "   t r a c k e d = " F a l s e " > < ! [ C D A T A [ w w w . s o z i a l a m t . z h . c h ] ] > < / T e x t > + 
+             < / A u t h o r > + 
+             < S i g n e r _ 0   w i n d o w w i d t h = " 0 "   w i n d o w h e i g h t = " 0 "   m i n w i n d o w w i d t h = " 0 "   m a x w i n d o w w i d t h = " 0 "   m i n w i n d o w h e i g h t = " 0 "   m a x w i n d o w h e i g h t = " 0 " > + 
+                 < T e x t   i d = " S i g n e r _ 0 . I d "   r o w = " 0 "   c o l u m n = " 0 "   c o l u m n s p a n = " 0 "   m u l t i l i n e = " F a l s e "   m u l t i l i n e r o w s = " 3 "   l o c k e d = " F a l s e "   l a b e l = " S i g n e r _ 0 . I d "   r e a d o n l y = " F a l s e "   v i s i b l e = " T r u e "   r e q u i r e d = " F a l s e "   r e g e x = " "   v a l i d a t i o n m e s s a g e = " "   t o o l t i p = " "   t r a c k e d = " F a l s e " > < ! [ C D A T A [ a 1 4 4 4 5 a b - 1 f 9 9 - 4 4 6 9 - 8 b 5 a - 1 d a 7 1 0 b 9 8 2 b 0 ] ] > < / T e x t > + 
+                 < T e x t   i d = " S i g n e r _ 0 . O r g a n i z a t i o n U n i t I d "   r o w = " 0 "   c o l u m n = " 0 "   c o l u m n s p a n = " 0 "   m u l t i l i n e = " F a l s e "   m u l t i l i n e r o w s = " 3 "   l o c k e d = " F a l s e "   l a b e l = " S i g n e r _ 0 . O r g a n i z a t i o n U n i t I d "   r e a d o n l y = " F a l s e "   v i s i b l e = " T r u e "   r e q u i r e d = " F a l s e "   r e g e x = " "   v a l i d a t i o n m e s s a g e = " "   t o o l t i p = " "   t r a c k e d = " F a l s e " > < ! [ C D A T A [ 5 f 9 8 4 b 2 6 - 4 c e 2 - 4 6 f d - 8 4 a a - 1 f 7 d b 5 4 8 a f e 8 ] ] > < / T e x t > + 
+                 < T e x t   i d = " S i g n e r _ 0 . O r g . P o s t a l . C o u n t r y "   r o w = " 0 "   c o l u m n = " 0 "   c o l u m n s p a n = " 0 "   m u l t i l i n e = " F a l s e "   m u l t i l i n e r o w s = " 3 "   l o c k e d = " F a l s e "   l a b e l = " S i g n e r _ 0 . O r g . P o s t a l . C o u n t r y "   r e a d o n l y = " F a l s e "   v i s i b l e = " T r u e "   r e q u i r e d = " F a l s e "   r e g e x = " "   v a l i d a t i o n m e s s a g e = " "   t o o l t i p = " "   t r a c k e d = " F a l s e " > < ! [ C D A T A [ S c h w e i z ] ] > < / T e x t > + 
+                 < T e x t   i d = " S i g n e r _ 0 . O r g . P o s t a l . L Z i p "   r o w = " 0 "   c o l u m n = " 0 "   c o l u m n s p a n = " 0 "   m u l t i l i n e = " F a l s e "   m u l t i l i n e r o w s = " 3 "   l o c k e d = " F a l s e "   l a b e l = " S i g n e r _ 0 . O r g . P o s t a l . L Z i p "   r e a d o n l y = " F a l s e "   v i s i b l e = " T r u e "   r e q u i r e d = " F a l s e "   r e g e x = " "   v a l i d a t i o n m e s s a g e = " "   t o o l t i p = " "   t r a c k e d = " F a l s e " > < ! [ C D A T A [ C H ] ] > < / T e x t > + 
+                 < T e x t   i d = " S i g n e r _ 0 . O r g . T i t l e "   r o w = " 0 "   c o l u m n = " 0 "   c o l u m n s p a n = " 0 "   m u l t i l i n e = " F a l s e "   m u l t i l i n e r o w s = " 3 "   l o c k e d = " F a l s e "   l a b e l = " S i g n e r _ 0 . O r g . T i t l e "   r e a d o n l y = " F a l s e "   v i s i b l e = " T r u e "   r e q u i r e d = " F a l s e "   r e g e x = " "   v a l i d a t i o n m e s s a g e = " "   t o o l t i p = " "   t r a c k e d = " F a l s e " > < ! [ C D A T A [ K a n t o n   Z � r i c h ] ] > < / T e x t > + 
+                 < T e x t   i d = " S i g n e r _ 0 . U s e r . A l i a s "   r o w = " 0 "   c o l u m n = " 0 "   c o l u m n s p a n = " 0 "   m u l t i l i n e = " F a l s e "   m u l t i l i n e r o w s = " 3 "   l o c k e d = " F a l s e "   l a b e l = " S i g n e r _ 0 . U s e r . A l i a s "   r e a d o n l y = " F a l s e "   v i s i b l e = " T r u e "   r e q u i r e d = " F a l s e "   r e g e x = " "   v a l i d a t i o n m e s s a g e = " "   t o o l t i p = " "   t r a c k e d = " F a l s e " > < ! [ C D A T A [   ] ] > < / T e x t > + 
+                 < T e x t   i d = " S i g n e r _ 0 . U s e r . E m a i l "   r o w = " 0 "   c o l u m n = " 0 "   c o l u m n s p a n = " 0 "   m u l t i l i n e = " F a l s e "   m u l t i l i n e r o w s = " 3 "   l o c k e d = " F a l s e "   l a b e l = " S i g n e r _ 0 . U s e r . E m a i l "   r e a d o n l y = " F a l s e "   v i s i b l e = " T r u e "   r e q u i r e d = " F a l s e "   r e g e x = " "   v a l i d a t i o n m e s s a g e = " "   t o o l t i p = " "   t r a c k e d = " F a l s e " > < ! [ C D A T A [ a n d r e a . l u e b b e r s t e d t @ s a . z h . c h ] ] > < / T e x t > + 
+                 < T e x t   i d = " S i g n e r _ 0 . U s e r . F a x "   r o w = " 0 "   c o l u m n = " 0 "   c o l u m n s p a n = " 0 "   m u l t i l i n e = " F a l s e "   m u l t i l i n e r o w s = " 3 "   l o c k e d = " F a l s e "   l a b e l = " S i g n e r _ 0 . U s e r . F a x "   r e a d o n l y = " F a l s e "   v i s i b l e = " T r u e "   r e q u i r e d = " F a l s e "   r e g e x = " "   v a l i d a t i o n m e s s a g e = " "   t o o l t i p = " "   t r a c k e d = " F a l s e " > < ! [ C D A T A [ + 4 1   4 3   2 5 9   5 1   0 7 ] ] > < / T e x t > + 
+                 < T e x t   i d = " S i g n e r _ 0 . U s e r . F i r s t N a m e "   r o w = " 0 "   c o l u m n = " 0 "   c o l u m n s p a n = " 0 "   m u l t i l i n e = " F a l s e "   m u l t i l i n e r o w s = " 3 "   l o c k e d = " F a l s e "   l a b e l = " S i g n e r _ 0 . U s e r . F i r s t N a m e "   r e a d o n l y = " F a l s e "   v i s i b l e = " T r u e "   r e q u i r e d = " F a l s e "   r e g e x = " "   v a l i d a t i o n m e s s a g e = " "   t o o l t i p = " "   t r a c k e d = " F a l s e " > < ! [ C D A T A [ A n d r e a ] ] > < / T e x t > + 
+                 < T e x t   i d = " S i g n e r _ 0 . U s e r . F u n c t i o n "   r o w = " 0 "   c o l u m n = " 0 "   c o l u m n s p a n = " 0 "   m u l t i l i n e = " F a l s e "   m u l t i l i n e r o w s = " 3 "   l o c k e d = " F a l s e "   l a b e l = " S i g n e r _ 0 . U s e r . F u n c t i o n "   r e a d o n l y = " F a l s e "   v i s i b l e = " T r u e "   r e q u i r e d = " F a l s e "   r e g e x = " "   v a l i d a t i o n m e s s a g e = " "   t o o l t i p = " "   t r a c k e d = " F a l s e " > < ! [ C D A T A [ A m t s c h e f i n ] ] > < / T e x t > + 
+                 < T e x t   i d = " S i g n e r _ 0 . U s e r . J o b D e s c r i p t i o n "   r o w = " 0 "   c o l u m n = " 0 "   c o l u m n s p a n = " 0 "   m u l t i l i n e = " F a l s e "   m u l t i l i n e r o w s = " 3 "   l o c k e d = " F a l s e "   l a b e l = " S i g n e r _ 0 . U s e r . J o b D e s c r i p t i o n "   r e a d o n l y = " F a l s e "   v i s i b l e = " T r u e "   r e q u i r e d = " F a l s e "   r e g e x = " "   v a l i d a t i o n m e s s a g e = " "   t o o l t i p = " "   t r a c k e d = " F a l s e " > < ! [ C D A T A [   ] ] > < / T e x t > + 
+                 < T e x t   i d = " S i g n e r _ 0 . U s e r . L a s t N a m e "   r o w = " 0 "   c o l u m n = " 0 "   c o l u m n s p a n = " 0 "   m u l t i l i n e = " F a l s e "   m u l t i l i n e r o w s = " 3 "   l o c k e d = " F a l s e "   l a b e l = " S i g n e r _ 0 . U s e r . L a s t N a m e "   r e a d o n l y = " F a l s e "   v i s i b l e = " T r u e "   r e q u i r e d = " F a l s e "   r e g e x = " "   v a l i d a t i o n m e s s a g e = " "   t o o l t i p = " "   t r a c k e d = " F a l s e " > < ! [ C D A T A [ L � b b e r s t e d t ] ] > < / T e x t > + 
+                 < T e x t   i d = " S i g n e r _ 0 . U s e r . O u L e v 1 "   r o w = " 0 "   c o l u m n = " 0 "   c o l u m n s p a n = " 0 "   m u l t i l i n e = " F a l s e "   m u l t i l i n e r o w s = " 3 "   l o c k e d = " F a l s e "   l a b e l = " S i g n e r _ 0 . U s e r . O u L e v 1 "   r e a d o n l y = " F a l s e "   v i s i b l e = " T r u e "   r e q u i r e d = " F a l s e "   r e g e x = " "   v a l i d a t i o n m e s s a g e = " "   t o o l t i p = " "   t r a c k e d = " F a l s e " > < ! [ C D A T A [ K a n t o n   Z � r i c h ] ] > < / T e x t > + 
+                 < T e x t   i d = " S i g n e r _ 0 . U s e r . O u L e v 2 "   r o w = " 0 "   c o l u m n = " 0 "   c o l u m n s p a n = " 0 "   m u l t i l i n e = " F a l s e "   m u l t i l i n e r o w s = " 3 "   l o c k e d = " F a l s e "   l a b e l = " S i g n e r _ 0 . U s e r . O u L e v 2 "   r e a d o n l y = " F a l s e "   v i s i b l e = " T r u e "   r e q u i r e d = " F a l s e "   r e g e x = " "   v a l i d a t i o n m e s s a g e = " "   t o o l t i p = " "   t r a c k e d = " F a l s e " > < ! [ C D A T A [ S i c h e r h e i t s d i r e k t i o n ] ] > < / T e x t > + 
+                 < T e x t   i d = " S i g n e r _ 0 . U s e r . O u L e v 3 "   r o w = " 0 "   c o l u m n = " 0 "   c o l u m n s p a n = " 0 "   m u l t i l i n e = " F a l s e "   m u l t i l i n e r o w s = " 3 "   l o c k e d = " F a l s e "   l a b e l = " S i g n e r _ 0 . U s e r . O u L e v 3 "   r e a d o n l y = " F a l s e "   v i s i b l e = " T r u e "   r e q u i r e d = " F a l s e "   r e g e x = " "   v a l i d a t i o n m e s s a g e = " "   t o o l t i p = " "   t r a c k e d = " F a l s e " > < ! [ C D A T A [ K a n t o n a l e s   S o z i a l a m t ] ] > < / T e x t > + 
+                 < T e x t   i d = " S i g n e r _ 0 . U s e r . O u L e v 4 "   r o w = " 0 "   c o l u m n = " 0 "   c o l u m n s p a n = " 0 "   m u l t i l i n e = " F a l s e "   m u l t i l i n e r o w s = " 3 "   l o c k e d = " F a l s e "   l a b e l = " S i g n e r _ 0 . U s e r . O u L e v 4 "   r e a d o n l y = " F a l s e "   v i s i b l e = " T r u e "   r e q u i r e d = " F a l s e "   r e g e x = " "   v a l i d a t i o n m e s s a g e = " "   t o o l t i p = " "   t r a c k e d = " F a l s e " > < ! [ C D A T A [   ] ] > < / T e x t > + 
+                 < T e x t   i d = " S i g n e r _ 0 . U s e r . O u L e v 5 "   r o w = " 0 "   c o l u m n = " 0 "   c o l u m n s p a n = " 0 "   m u l t i l i n e = " F a l s e "   m u l t i l i n e r o w s = " 3 "   l o c k e d = " F a l s e "   l a b e l = " S i g n e r _ 0 . U s e r . O u L e v 5 "   r e a d o n l y = " F a l s e "   v i s i b l e = " T r u e "   r e q u i r e d = " F a l s e "   r e g e x = " "   v a l i d a t i o n m e s s a g e = " "   t o o l t i p = " "   t r a c k e d = " F a l s e " > < ! [ C D A T A [   ] ] > < / T e x t > + 
+                 < T e x t   i d = " S i g n e r _ 0 . U s e r . O u L e v 6 "   r o w = " 0 "   c o l u m n = " 0 "   c o l u m n s p a n = " 0 "   m u l t i l i n e = " F a l s e "   m u l t i l i n e r o w s = " 3 "   l o c k e d = " F a l s e "   l a b e l = " S i g n e r _ 0 . U s e r . O u L e v 6 "   r e a d o n l y = " F a l s e "   v i s i b l e = " T r u e "   r e q u i r e d = " F a l s e "   r e g e x = " "   v a l i d a t i o n m e s s a g e = " "   t o o l t i p = " "   t r a c k e d = " F a l s e " > < ! [ C D A T A [   ] ] > < / T e x t > + 
+                 < T e x t   i d = " S i g n e r _ 0 . U s e r . O u L e v 7 "   r o w = " 0 "   c o l u m n = " 0 "   c o l u m n s p a n = " 0 "   m u l t i l i n e = " F a l s e "   m u l t i l i n e r o w s = " 3 "   l o c k e d = " F a l s e "   l a b e l = " S i g n e r _ 0 . U s e r . O u L e v 7 "   r e a d o n l y = " F a l s e "   v i s i b l e = " T r u e "   r e q u i r e d = " F a l s e "   r e g e x = " "   v a l i d a t i o n m e s s a g e = " "   t o o l t i p = " "   t r a c k e d = " F a l s e " > < ! [ C D A T A [   ] ] > < / T e x t > + 
+                 < T e x t   i d = " S i g n e r _ 0 . U s e r . O u M a i l "   r o w = " 0 "   c o l u m n = " 0 "   c o l u m n s p a n = " 0 "   m u l t i l i n e = " F a l s e "   m u l t i l i n e r o w s = " 3 "   l o c k e d = " F a l s e "   l a b e l = " S i g n e r _ 0 . U s e r . O u M a i l "   r e a d o n l y = " F a l s e "   v i s i b l e = " T r u e "   r e q u i r e d = " F a l s e "   r e g e x = " "   v a l i d a t i o n m e s s a g e = " "   t o o l t i p = " "   t r a c k e d = " F a l s e " > < ! [ C D A T A [ i n f o @ s a . z h . c h ] ] > < / T e x t > + 
+                 < T e x t   i d = " S i g n e r _ 0 . U s e r . O u P h o n e "   r o w = " 0 "   c o l u m n = " 0 "   c o l u m n s p a n = " 0 "   m u l t i l i n e = " F a l s e "   m u l t i l i n e r o w s = " 3 "   l o c k e d = " F a l s e "   l a b e l = " S i g n e r _ 0 . U s e r . O u P h o n e "   r e a d o n l y = " F a l s e "   v i s i b l e = " T r u e "   r e q u i r e d = " F a l s e "   r e g e x = " "   v a l i d a t i o n m e s s a g e = " "   t o o l t i p = " "   t r a c k e d = " F a l s e " > < ! [ C D A T A [ + 4 1   4 3   2 5 9   2 4   5 1 ] ] > < / T e x t > + 
+                 < T e x t   i d = " S i g n e r _ 0 . U s e r . P h o n e "   r o w = " 0 "   c o l u m n = " 0 "   c o l u m n s p a n = " 0 "   m u l t i l i n e = " F a l s e "   m u l t i l i n e r o w s = " 3 "   l o c k e d = " F a l s e "   l a b e l = " S i g n e r _ 0 . U s e r . P h o n e "   r e a d o n l y = " F a l s e "   v i s i b l e = " T r u e "   r e q u i r e d = " F a l s e "   r e g e x = " "   v a l i d a t i o n m e s s a g e = " "   t o o l t i p = " "   t r a c k e d = " F a l s e " > < ! [ C D A T A [ + 4 1   4 3   2 5 9   2 4   5 0 ] ] > < / T e x t > + 
+                 < T e x t   i d = " S i g n e r _ 0 . U s e r . P o s t a l . C i t y "   r o w = " 0 "   c o l u m n = " 0 "   c o l u m n s p a n = " 0 "   m u l t i l i n e = " F a l s e "   m u l t i l i n e r o w s = " 3 "   l o c k e d = " F a l s e "   l a b e l = " S i g n e r _ 0 . U s e r . P o s t a l . C i t y "   r e a d o n l y = " F a l s e "   v i s i b l e = " T r u e "   r e q u i r e d = " F a l s e "   r e g e x = " "   v a l i d a t i o n m e s s a g e = " "   t o o l t i p = " "   t r a c k e d = " F a l s e " > < ! [ C D A T A [ Z � r i c h ] ] > < / T e x t > + 
+                 < T e x t   i d = " S i g n e r _ 0 . U s e r . P o s t a l . O f f i c e N a m e "   r o w = " 0 "   c o l u m n = " 0 "   c o l u m n s p a n = " 0 "   m u l t i l i n e = " F a l s e "   m u l t i l i n e r o w s = " 3 "   l o c k e d = " F a l s e "   l a b e l = " S i g n e r _ 0 . U s e r . P o s t a l . O f f i c e N a m e "   r e a d o n l y = " F a l s e "   v i s i b l e = " T r u e "   r e q u i r e d = " F a l s e "   r e g e x = " "   v a l i d a t i o n m e s s a g e = " "   t o o l t i p = " "   t r a c k e d = " F a l s e " > < ! [ C D A T A [ 5 0 5 ] ] > < / T e x t > + 
+                 < T e x t   i d = " S i g n e r _ 0 . U s e r . P o s t a l . P O B o x "   r o w = " 0 "   c o l u m n = " 0 "   c o l u m n s p a n = " 0 "   m u l t i l i n e = " F a l s e "   m u l t i l i n e r o w s = " 3 "   l o c k e d = " F a l s e "   l a b e l = " S i g n e r _ 0 . U s e r . P o s t a l . P O B o x "   r e a d o n l y = " F a l s e "   v i s i b l e = " T r u e "   r e q u i r e d = " F a l s e "   r e g e x = " "   v a l i d a t i o n m e s s a g e = " "   t o o l t i p = " "   t r a c k e d = " F a l s e " > < ! [ C D A T A [ P o s t f a c h ] ] > < / T e x t > + 
+                 < T e x t   i d = " S i g n e r _ 0 . U s e r . P o s t a l . S t r e e t "   r o w = " 0 "   c o l u m n = " 0 "   c o l u m n s p a n = " 0 "   m u l t i l i n e = " F a l s e "   m u l t i l i n e r o w s = " 3 "   l o c k e d = " F a l s e "   l a b e l = " S i g n e r _ 0 . U s e r . P o s t a l . S t r e e t "   r e a d o n l y = " F a l s e "   v i s i b l e = " T r u e "   r e q u i r e d = " F a l s e "   r e g e x = " "   v a l i d a t i o n m e s s a g e = " "   t o o l t i p = " "   t r a c k e d = " F a l s e " > < ! [ C D A T A [ S c h a f f h a u s e r s t r a s s e   7 8 ] ] > < / T e x t > + 
+                 < T e x t   i d = " S i g n e r _ 0 . U s e r . P o s t a l . Z i p "   r o w = " 0 "   c o l u m n = " 0 "   c o l u m n s p a n = " 0 "   m u l t i l i n e = " F a l s e "   m u l t i l i n e r o w s = " 3 "   l o c k e d = " F a l s e "   l a b e l = " S i g n e r _ 0 . U s e r . P o s t a l . Z i p "   r e a d o n l y = " F a l s e "   v i s i b l e = " T r u e "   r e q u i r e d = " F a l s e "   r e g e x = " "   v a l i d a t i o n m e s s a g e = " "   t o o l t i p = " "   t r a c k e d = " F a l s e " > < ! [ C D A T A [ 8 0 9 0 ] ] > < / T e x t > + 
+                 < T e x t   i d = " S i g n e r _ 0 . U s e r . S a l u t a t i o n "   r o w = " 0 "   c o l u m n = " 0 "   c o l u m n s p a n = " 0 "   m u l t i l i n e = " F a l s e "   m u l t i l i n e r o w s = " 3 "   l o c k e d = " F a l s e "   l a b e l = " S i g n e r _ 0 . U s e r . S a l u t a t i o n "   r e a d o n l y = " F a l s e "   v i s i b l e = " T r u e "   r e q u i r e d = " F a l s e "   r e g e x = " "   v a l i d a t i o n m e s s a g e = " "   t o o l t i p = " "   t r a c k e d = " F a l s e " > < ! [ C D A T A [ F r a u ] ] > < / T e x t > + 
+                 < T e x t   i d = " S i g n e r _ 0 . U s e r . T i t l e "   r o w = " 0 "   c o l u m n = " 0 "   c o l u m n s p a n = " 0 "   m u l t i l i n e = " F a l s e "   m u l t i l i n e r o w s = " 3 "   l o c k e d = " F a l s e "   l a b e l = " S i g n e r _ 0 . U s e r . T i t l e "   r e a d o n l y = " F a l s e "   v i s i b l e = " T r u e "   r e q u i r e d = " F a l s e "   r e g e x = " "   v a l i d a t i o n m e s s a g e = " "   t o o l t i p = " "   t r a c k e d = " F a l s e " > < ! [ C D A T A [   ] ] > < / T e x t > + 
+                 < T e x t   i d = " S i g n e r _ 0 . U s e r . U r l "   r o w = " 0 "   c o l u m n = " 0 "   c o l u m n s p a n = " 0 "   m u l t i l i n e = " F a l s e "   m u l t i l i n e r o w s = " 3 "   l o c k e d = " F a l s e "   l a b e l = " S i g n e r _ 0 . U s e r . U r l "   r e a d o n l y = " F a l s e "   v i s i b l e = " T r u e "   r e q u i r e d = " F a l s e "   r e g e x = " "   v a l i d a t i o n m e s s a g e = " "   t o o l t i p = " "   t r a c k e d = " F a l s e " > < ! [ C D A T A [ w w w . s o z i a l a m t . z h . c h ] ] > < / T e x t > + 
+             < / S i g n e r _ 0 > + 
+             < S i g n e r _ 1   w i n d o w w i d t h = " 0 "   w i n d o w h e i g h t = " 0 "   m i n w i n d o w w i d t h = " 0 "   m a x w i n d o w w i d t h = " 0 "   m i n w i n d o w h e i g h t = " 0 "   m a x w i n d o w h e i g h t = " 0 " > + 
+                 < T e x t   i d = " S i g n e r _ 1 . I d "   r o w = " 0 "   c o l u m n = " 0 "   c o l u m n s p a n = " 0 "   m u l t i l i n e = " F a l s e "   m u l t i l i n e r o w s = " 3 "   l o c k e d = " F a l s e "   l a b e l = " S i g n e r _ 1 . I d "   r e a d o n l y = " F a l s e "   v i s i b l e = " T r u e "   r e q u i r e d = " F a l s e "   r e g e x = " "   v a l i d a t i o n m e s s a g e = " "   t o o l t i p = " "   t r a c k e d = " F a l s e " > < ! [ C D A T A [ 0 0 0 0 0 0 0 0 - 0 0 0 0 - 0 0 0 0 - 0 0 0 0 - 0 0 0 0 0 0 0 0 0 0 0 0 ] ] > < / T e x t > + 
+                 < T e x t   i d = " S i g n e r _ 1 . O r g a n i z a t i o n U n i t I d "   r o w = " 0 "   c o l u m n = " 0 "   c o l u m n s p a n = " 0 "   m u l t i l i n e = " F a l s e "   m u l t i l i n e r o w s = " 3 "   l o c k e d = " F a l s e "   l a b e l = " S i g n e r _ 1 . O r g a n i z a t i o n U n i t I d "   r e a d o n l y = " F a l s e "   v i s i b l e = " T r u e "   r e q u i r e d = " F a l s e "   r e g e x = " "   v a l i d a t i o n m e s s a g e = " "   t o o l t i p = " "   t r a c k e d = " F a l s e " > < ! [ C D A T A [   ] ] > < / T e x t > + 
+                 < T e x t   i d = " S i g n e r _ 1 . O r g . P o s t a l . C o u n t r y "   r o w = " 0 "   c o l u m n = " 0 "   c o l u m n s p a n = " 0 "   m u l t i l i n e = " F a l s e "   m u l t i l i n e r o w s = " 3 "   l o c k e d = " F a l s e "   l a b e l = " S i g n e r _ 1 . O r g . P o s t a l . C o u n t r y "   r e a d o n l y = " F a l s e "   v i s i b l e = " T r u e "   r e q u i r e d = " F a l s e "   r e g e x = " "   v a l i d a t i o n m e s s a g e = " "   t o o l t i p = " "   t r a c k e d = " F a l s e " > < ! [ C D A T A [   ] ] > < / T e x t > + 
+                 < T e x t   i d = " S i g n e r _ 1 . O r g . P o s t a l . L Z i p "   r o w = " 0 "   c o l u m n = " 0 "   c o l u m n s p a n = " 0 "   m u l t i l i n e = " F a l s e "   m u l t i l i n e r o w s = " 3 "   l o c k e d = " F a l s e "   l a b e l = " S i g n e r _ 1 . O r g . P o s t a l . L Z i p "   r e a d o n l y = " F a l s e "   v i s i b l e = " T r u e "   r e q u i r e d = " F a l s e "   r e g e x = " "   v a l i d a t i o n m e s s a g e = " "   t o o l t i p = " "   t r a c k e d = " F a l s e " > < ! [ C D A T A [   ] ] > < / T e x t > + 
+                 < T e x t   i d = " S i g n e r _ 1 . O r g . T i t l e "   r o w = " 0 "   c o l u m n = " 0 "   c o l u m n s p a n = " 0 "   m u l t i l i n e = " F a l s e "   m u l t i l i n e r o w s = " 3 "   l o c k e d = " F a l s e "   l a b e l = " S i g n e r _ 1 . O r g . T i t l e "   r e a d o n l y = " F a l s e "   v i s i b l e = " T r u e "   r e q u i r e d = " F a l s e "   r e g e x = " "   v a l i d a t i o n m e s s a g e = " "   t o o l t i p = " "   t r a c k e d = " F a l s e " > < ! [ C D A T A [   ] ] > < / T e x t > + 
+                 < T e x t   i d = " S i g n e r _ 1 . U s e r . A l i a s "   r o w = " 0 "   c o l u m n = " 0 "   c o l u m n s p a n = " 0 "   m u l t i l i n e = " F a l s e "   m u l t i l i n e r o w s = " 3 "   l o c k e d = " F a l s e "   l a b e l = " S i g n e r _ 1 . U s e r . A l i a s "   r e a d o n l y = " F a l s e "   v i s i b l e = " T r u e "   r e q u i r e d = " F a l s e "   r e g e x = " "   v a l i d a t i o n m e s s a g e = " "   t o o l t i p = " "   t r a c k e d = " F a l s e " > < ! [ C D A T A [   ] ] > < / T e x t > + 
+                 < T e x t   i d = " S i g n e r _ 1 . U s e r . E m a i l "   r o w = " 0 "   c o l u m n = " 0 "   c o l u m n s p a n = " 0 "   m u l t i l i n e = " F a l s e "   m u l t i l i n e r o w s = " 3 "   l o c k e d = " F a l s e "   l a b e l = " S i g n e r _ 1 . U s e r . E m a i l "   r e a d o n l y = " F a l s e "   v i s i b l e = " T r u e "   r e q u i r e d = " F a l s e "   r e g e x = " "   v a l i d a t i o n m e s s a g e = " "   t o o l t i p = " "   t r a c k e d = " F a l s e " > < ! [ C D A T A [   ] ] > < / T e x t > + 
+                 < T e x t   i d = " S i g n e r _ 1 . U s e r . F a x "   r o w = " 0 "   c o l u m n = " 0 "   c o l u m n s p a n = " 0 "   m u l t i l i n e = " F a l s e "   m u l t i l i n e r o w s = " 3 "   l o c k e d = " F a l s e "   l a b e l = " S i g n e r _ 1 . U s e r . F a x "   r e a d o n l y = " F a l s e "   v i s i b l e = " T r u e "   r e q u i r e d = " F a l s e "   r e g e x = " "   v a l i d a t i o n m e s s a g e = " "   t o o l t i p = " "   t r a c k e d = " F a l s e " > < ! [ C D A T A [   ] ] > < / T e x t > + 
+                 < T e x t   i d = " S i g n e r _ 1 . U s e r . F i r s t N a m e "   r o w = " 0 "   c o l u m n = " 0 "   c o l u m n s p a n = " 0 "   m u l t i l i n e = " F a l s e "   m u l t i l i n e r o w s = " 3 "   l o c k e d = " F a l s e "   l a b e l = " S i g n e r _ 1 . U s e r . F i r s t N a m e "   r e a d o n l y = " F a l s e "   v i s i b l e = " T r u e "   r e q u i r e d = " F a l s e "   r e g e x = " "   v a l i d a t i o n m e s s a g e = " "   t o o l t i p = " "   t r a c k e d = " F a l s e " > < ! [ C D A T A [   ] ] > < / T e x t > + 
+                 < T e x t   i d = " S i g n e r _ 1 . U s e r . F u n c t i o n "   r o w = " 0 "   c o l u m n = " 0 "   c o l u m n s p a n = " 0 "   m u l t i l i n e = " F a l s e "   m u l t i l i n e r o w s = " 3 "   l o c k e d = " F a l s e "   l a b e l = " S i g n e r _ 1 . U s e r . F u n c t i o n "   r e a d o n l y = " F a l s e "   v i s i b l e = " T r u e "   r e q u i r e d = " F a l s e "   r e g e x = " "   v a l i d a t i o n m e s s a g e = " "   t o o l t i p = " "   t r a c k e d = " F a l s e " > < ! [ C D A T A [   ] ] > < / T e x t > + 
+                 < T e x t   i d = " S i g n e r _ 1 . U s e r . J o b D e s c r i p t i o n "   r o w = " 0 "   c o l u m n = " 0 "   c o l u m n s p a n = " 0 "   m u l t i l i n e = " F a l s e "   m u l t i l i n e r o w s = " 3 "   l o c k e d = " F a l s e "   l a b e l = " S i g n e r _ 1 . U s e r . J o b D e s c r i p t i o n "   r e a d o n l y = " F a l s e "   v i s i b l e = " T r u e "   r e q u i r e d = " F a l s e "   r e g e x = " "   v a l i d a t i o n m e s s a g e = " "   t o o l t i p = " "   t r a c k e d = " F a l s e " > < ! [ C D A T A [   ] ] > < / T e x t > + 
+                 < T e x t   i d = " S i g n e r _ 1 . U s e r . L a s t N a m e "   r o w = " 0 "   c o l u m n = " 0 "   c o l u m n s p a n = " 0 "   m u l t i l i n e = " F a l s e "   m u l t i l i n e r o w s = " 3 "   l o c k e d = " F a l s e "   l a b e l = " S i g n e r _ 1 . U s e r . L a s t N a m e "   r e a d o n l y = " F a l s e "   v i s i b l e = " T r u e "   r e q u i r e d = " F a l s e "   r e g e x = " "   v a l i d a t i o n m e s s a g e = " "   t o o l t i p = " "   t r a c k e d = " F a l s e " > < ! [ C D A T A [   ] ] > < / T e x t > + 
+                 < T e x t   i d = " S i g n e r _ 1 . U s e r . O u L e v 1 "   r o w = " 0 "   c o l u m n = " 0 "   c o l u m n s p a n = " 0 "   m u l t i l i n e = " F a l s e "   m u l t i l i n e r o w s = " 3 "   l o c k e d = " F a l s e "   l a b e l = " S i g n e r _ 1 . U s e r . O u L e v 1 "   r e a d o n l y = " F a l s e "   v i s i b l e = " T r u e "   r e q u i r e d = " F a l s e "   r e g e x = " "   v a l i d a t i o n m e s s a g e = " "   t o o l t i p = " "   t r a c k e d = " F a l s e " > < ! [ C D A T A [   ] ] > < / T e x t > + 
+                 < T e x t   i d = " S i g n e r _ 1 . U s e r . O u L e v 2 "   r o w = " 0 "   c o l u m n = " 0 "   c o l u m n s p a n = " 0 "   m u l t i l i n e = " F a l s e "   m u l t i l i n e r o w s = " 3 "   l o c k e d = " F a l s e "   l a b e l = " S i g n e r _ 1 . U s e r . O u L e v 2 "   r e a d o n l y = " F a l s e "   v i s i b l e = " T r u e "   r e q u i r e d = " F a l s e "   r e g e x = " "   v a l i d a t i o n m e s s a g e = " "   t o o l t i p = " "   t r a c k e d = " F a l s e " > < ! [ C D A T A [   ] ] > < / T e x t > + 
+                 < T e x t   i d = " S i g n e r _ 1 . U s e r . O u L e v 3 "   r o w = " 0 "   c o l u m n = " 0 "   c o l u m n s p a n = " 0 "   m u l t i l i n e = " F a l s e "   m u l t i l i n e r o w s = " 3 "   l o c k e d = " F a l s e "   l a b e l = " S i g n e r _ 1 . U s e r . O u L e v 3 "   r e a d o n l y = " F a l s e "   v i s i b l e = " T r u e "   r e q u i r e d = " F a l s e "   r e g e x = " "   v a l i d a t i o n m e s s a g e = " "   t o o l t i p = " "   t r a c k e d = " F a l s e " > < ! [ C D A T A [   ] ] > < / T e x t > + 
+                 < T e x t   i d = " S i g n e r _ 1 . U s e r . O u L e v 4 "   r o w = " 0 "   c o l u m n = " 0 "   c o l u m n s p a n = " 0 "   m u l t i l i n e = " F a l s e "   m u l t i l i n e r o w s = " 3 "   l o c k e d = " F a l s e "   l a b e l = " S i g n e r _ 1 . U s e r . O u L e v 4 "   r e a d o n l y = " F a l s e "   v i s i b l e = " T r u e "   r e q u i r e d = " F a l s e "   r e g e x = " "   v a l i d a t i o n m e s s a g e = " "   t o o l t i p = " "   t r a c k e d = " F a l s e " > < ! [ C D A T A [   ] ] > < / T e x t > + 
+                 < T e x t   i d = " S i g n e r _ 1 . U s e r . O u L e v 5 "   r o w = " 0 "   c o l u m n = " 0 "   c o l u m n s p a n = " 0 "   m u l t i l i n e = " F a l s e "   m u l t i l i n e r o w s = " 3 "   l o c k e d = " F a l s e "   l a b e l = " S i g n e r _ 1 . U s e r . O u L e v 5 "   r e a d o n l y = " F a l s e "   v i s i b l e = " T r u e "   r e q u i r e d = " F a l s e "   r e g e x = " "   v a l i d a t i o n m e s s a g e = " "   t o o l t i p = " "   t r a c k e d = " F a l s e " > < ! [ C D A T A [   ] ] > < / T e x t > + 
+                 < T e x t   i d = " S i g n e r _ 1 . U s e r . O u L e v 6 "   r o w = " 0 "   c o l u m n = " 0 "   c o l u m n s p a n = " 0 "   m u l t i l i n e = " F a l s e "   m u l t i l i n e r o w s = " 3 "   l o c k e d = " F a l s e "   l a b e l = " S i g n e r _ 1 . U s e r . O u L e v 6 "   r e a d o n l y = " F a l s e "   v i s i b l e = " T r u e "   r e q u i r e d = " F a l s e "   r e g e x = " "   v a l i d a t i o n m e s s a g e = " "   t o o l t i p = " "   t r a c k e d = " F a l s e " > < ! [ C D A T A [   ] ] > < / T e x t > + 
+                 < T e x t   i d = " S i g n e r _ 1 . U s e r . O u L e v 7 "   r o w = " 0 "   c o l u m n = " 0 "   c o l u m n s p a n = " 0 "   m u l t i l i n e = " F a l s e "   m u l t i l i n e r o w s = " 3 "   l o c k e d = " F a l s e "   l a b e l = " S i g n e r _ 1 . U s e r . O u L e v 7 "   r e a d o n l y = " F a l s e "   v i s i b l e = " T r u e "   r e q u i r e d = " F a l s e "   r e g e x = " "   v a l i d a t i o n m e s s a g e = " "   t o o l t i p = " "   t r a c k e d = " F a l s e " > < ! [ C D A T A [   ] ] > < / T e x t > + 
+                 < T e x t   i d = " S i g n e r _ 1 . U s e r . O u M a i l "   r o w = " 0 "   c o l u m n = " 0 "   c o l u m n s p a n = " 0 "   m u l t i l i n e = " F a l s e "   m u l t i l i n e r o w s = " 3 "   l o c k e d = " F a l s e "   l a b e l = " S i g n e r _ 1 . U s e r . O u M a i l "   r e a d o n l y = " F a l s e "   v i s i b l e = " T r u e "   r e q u i r e d = " F a l s e "   r e g e x = " "   v a l i d a t i o n m e s s a g e = " "   t o o l t i p = " "   t r a c k e d = " F a l s e " > < ! [ C D A T A [   ] ] > < / T e x t > + 
+                 < T e x t   i d = " S i g n e r _ 1 . U s e r . O u P h o n e "   r o w = " 0 "   c o l u m n = " 0 "   c o l u m n s p a n = " 0 "   m u l t i l i n e = " F a l s e "   m u l t i l i n e r o w s = " 3 "   l o c k e d = " F a l s e "   l a b e l = " S i g n e r _ 1 . U s e r . O u P h o n e "   r e a d o n l y = " F a l s e "   v i s i b l e = " T r u e "   r e q u i r e d = " F a l s e "   r e g e x = " "   v a l i d a t i o n m e s s a g e = " "   t o o l t i p = " "   t r a c k e d = " F a l s e " > < ! [ C D A T A [   ] ] > < / T e x t > + 
+                 < T e x t   i d = " S i g n e r _ 1 . U s e r . P h o n e "   r o w = " 0 "   c o l u m n = " 0 "   c o l u m n s p a n = " 0 "   m u l t i l i n e = " F a l s e "   m u l t i l i n e r o w s = " 3 "   l o c k e d = " F a l s e "   l a b e l = " S i g n e r _ 1 . U s e r . P h o n e "   r e a d o n l y = " F a l s e "   v i s i b l e = " T r u e "   r e q u i r e d = " F a l s e "   r e g e x = " "   v a l i d a t i o n m e s s a g e = " "   t o o l t i p = " "   t r a c k e d = " F a l s e " > < ! [ C D A T A [   ] ] > < / T e x t > + 
+                 < T e x t   i d = " S i g n e r _ 1 . U s e r . P o s t a l . C i t y "   r o w = " 0 "   c o l u m n = " 0 "   c o l u m n s p a n = " 0 "   m u l t i l i n e = " F a l s e "   m u l t i l i n e r o w s = " 3 "   l o c k e d = " F a l s e "   l a b e l = " S i g n e r _ 1 . U s e r . P o s t a l . C i t y "   r e a d o n l y = " F a l s e "   v i s i b l e = " T r u e "   r e q u i r e d = " F a l s e "   r e g e x = " "   v a l i d a t i o n m e s s a g e = " "   t o o l t i p = " "   t r a c k e d = " F a l s e " > < ! [ C D A T A [   ] ] > < / T e x t > + 
+                 < T e x t   i d = " S i g n e r _ 1 . U s e r . P o s t a l . O f f i c e N a m e "   r o w = " 0 "   c o l u m n = " 0 "   c o l u m n s p a n = " 0 "   m u l t i l i n e = " F a l s e "   m u l t i l i n e r o w s = " 3 "   l o c k e d = " F a l s e "   l a b e l = " S i g n e r _ 1 . U s e r . P o s t a l . O f f i c e N a m e "   r e a d o n l y = " F a l s e "   v i s i b l e = " T r u e "   r e q u i r e d = " F a l s e "   r e g e x = " "   v a l i d a t i o n m e s s a g e = " "   t o o l t i p = " "   t r a c k e d = " F a l s e " > < ! [ C D A T A [   ] ] > < / T e x t > + 
+                 < T e x t   i d = " S i g n e r _ 1 . U s e r . P o s t a l . P O B o x "   r o w = " 0 "   c o l u m n = " 0 "   c o l u m n s p a n = " 0 "   m u l t i l i n e = " F a l s e "   m u l t i l i n e r o w s = " 3 "   l o c k e d = " F a l s e "   l a b e l = " S i g n e r _ 1 . U s e r . P o s t a l . P O B o x "   r e a d o n l y = " F a l s e "   v i s i b l e = " T r u e "   r e q u i r e d = " F a l s e "   r e g e x = " "   v a l i d a t i o n m e s s a g e = " "   t o o l t i p = " "   t r a c k e d = " F a l s e " > < ! [ C D A T A [   ] ] > < / T e x t > + 
+                 < T e x t   i d = " S i g n e r _ 1 . U s e r . P o s t a l . S t r e e t "   r o w = " 0 "   c o l u m n = " 0 "   c o l u m n s p a n = " 0 "   m u l t i l i n e = " F a l s e "   m u l t i l i n e r o w s = " 3 "   l o c k e d = " F a l s e "   l a b e l = " S i g n e r _ 1 . U s e r . P o s t a l . S t r e e t "   r e a d o n l y = " F a l s e "   v i s i b l e = " T r u e "   r e q u i r e d = " F a l s e "   r e g e x = " "   v a l i d a t i o n m e s s a g e = " "   t o o l t i p = " "   t r a c k e d = " F a l s e " > < ! [ C D A T A [   ] ] > < / T e x t > + 
+                 < T e x t   i d = " S i g n e r _ 1 . U s e r . P o s t a l . Z i p "   r o w = " 0 "   c o l u m n = " 0 "   c o l u m n s p a n = " 0 "   m u l t i l i n e = " F a l s e "   m u l t i l i n e r o w s = " 3 "   l o c k e d = " F a l s e "   l a b e l = " S i g n e r _ 1 . U s e r . P o s t a l . Z i p "   r e a d o n l y = " F a l s e "   v i s i b l e = " T r u e "   r e q u i r e d = " F a l s e "   r e g e x = " "   v a l i d a t i o n m e s s a g e = " "   t o o l t i p = " "   t r a c k e d = " F a l s e " > < ! [ C D A T A [   ] ] > < / T e x t > + 
+                 < T e x t   i d = " S i g n e r _ 1 . U s e r . S a l u t a t i o n "   r o w = " 0 "   c o l u m n = " 0 "   c o l u m n s p a n = " 0 "   m u l t i l i n e = " F a l s e "   m u l t i l i n e r o w s = " 3 "   l o c k e d = " F a l s e "   l a b e l = " S i g n e r _ 1 . U s e r . S a l u t a t i o n "   r e a d o n l y = " F a l s e "   v i s i b l e = " T r u e "   r e q u i r e d = " F a l s e "   r e g e x = " "   v a l i d a t i o n m e s s a g e = " "   t o o l t i p = " "   t r a c k e d = " F a l s e " > < ! [ C D A T A [   ] ] > < / T e x t > + 
+                 < T e x t   i d = " S i g n e r _ 1 . U s e r . T i t l e "   r o w = " 0 "   c o l u m n = " 0 "   c o l u m n s p a n = " 0 "   m u l t i l i n e = " F a l s e "   m u l t i l i n e r o w s = " 3 "   l o c k e d = " F a l s e "   l a b e l = " S i g n e r _ 1 . U s e r . T i t l e "   r e a d o n l y = " F a l s e "   v i s i b l e = " T r u e "   r e q u i r e d = " F a l s e "   r e g e x = " "   v a l i d a t i o n m e s s a g e = " "   t o o l t i p = " "   t r a c k e d = " F a l s e " > < ! [ C D A T A [   ] ] > < / T e x t > + 
+                 < T e x t   i d = " S i g n e r _ 1 . U s e r . U r l "   r o w = " 0 "   c o l u m n = " 0 "   c o l u m n s p a n = " 0 "   m u l t i l i n e = " F a l s e "   m u l t i l i n e r o w s = " 3 "   l o c k e d = " F a l s e "   l a b e l = " S i g n e r _ 1 . U s e r . U r l "   r e a d o n l y = " F a l s e "   v i s i b l e = " T r u e "   r e q u i r e d = " F a l s e "   r e g e x = " "   v a l i d a t i o n m e s s a g e = " "   t o o l t i p = " "   t r a c k e d = " F a l s e " > < ! [ C D A T A [   ] ] > < / T e x t > + 
+             < / S i g n e r _ 1 > + 
+             < S i g n e r _ 2   w i n d o w w i d t h = " 0 "   w i n d o w h e i g h t = " 0 "   m i n w i n d o w w i d t h = " 0 "   m a x w i n d o w w i d t h = " 0 "   m i n w i n d o w h e i g h t = " 0 "   m a x w i n d o w h e i g h t = " 0 " > + 
+                 < T e x t   i d = " S i g n e r _ 2 . I d "   r o w = " 0 "   c o l u m n = " 0 "   c o l u m n s p a n = " 0 "   m u l t i l i n e = " F a l s e "   m u l t i l i n e r o w s = " 3 "   l o c k e d = " F a l s e "   l a b e l = " S i g n e r _ 2 . I d "   r e a d o n l y = " F a l s e "   v i s i b l e = " T r u e "   r e q u i r e d = " F a l s e "   r e g e x = " "   v a l i d a t i o n m e s s a g e = " "   t o o l t i p = " "   t r a c k e d = " F a l s e " > < ! [ C D A T A [ 0 0 0 0 0 0 0 0 - 0 0 0 0 - 0 0 0 0 - 0 0 0 0 - 0 0 0 0 0 0 0 0 0 0 0 0 ] ] > < / T e x t > + 
+                 < T e x t   i d = " S i g n e r _ 2 . O r g a n i z a t i o n U n i t I d "   r o w = " 0 "   c o l u m n = " 0 "   c o l u m n s p a n = " 0 "   m u l t i l i n e = " F a l s e "   m u l t i l i n e r o w s = " 3 "   l o c k e d = " F a l s e "   l a b e l = " S i g n e r _ 2 . O r g a n i z a t i o n U n i t I d "   r e a d o n l y = " F a l s e "   v i s i b l e = " T r u e "   r e q u i r e d = " F a l s e "   r e g e x = " "   v a l i d a t i o n m e s s a g e = " "   t o o l t i p = " "   t r a c k e d = " F a l s e " > < ! [ C D A T A [   ] ] > < / T e x t > + 
+                 < T e x t   i d = " S i g n e r _ 2 . O r g . P o s t a l . C o u n t r y "   r o w = " 0 "   c o l u m n = " 0 "   c o l u m n s p a n = " 0 "   m u l t i l i n e = " F a l s e "   m u l t i l i n e r o w s = " 3 "   l o c k e d = " F a l s e "   l a b e l = " S i g n e r _ 2 . O r g . P o s t a l . C o u n t r y "   r e a d o n l y = " F a l s e "   v i s i b l e = " T r u e "   r e q u i r e d = " F a l s e "   r e g e x = " "   v a l i d a t i o n m e s s a g e = " "   t o o l t i p = " "   t r a c k e d = " F a l s e " > < ! [ C D A T A [   ] ] > < / T e x t > + 
+                 < T e x t   i d = " S i g n e r _ 2 . O r g . P o s t a l . L Z i p "   r o w = " 0 "   c o l u m n = " 0 "   c o l u m n s p a n = " 0 "   m u l t i l i n e = " F a l s e "   m u l t i l i n e r o w s = " 3 "   l o c k e d = " F a l s e "   l a b e l = " S i g n e r _ 2 . O r g . P o s t a l . L Z i p "   r e a d o n l y = " F a l s e "   v i s i b l e = " T r u e "   r e q u i r e d = " F a l s e "   r e g e x = " "   v a l i d a t i o n m e s s a g e = " "   t o o l t i p = " "   t r a c k e d = " F a l s e " > < ! [ C D A T A [   ] ] > < / T e x t > + 
+                 < T e x t   i d = " S i g n e r _ 2 . O r g . T i t l e "   r o w = " 0 "   c o l u m n = " 0 "   c o l u m n s p a n = " 0 "   m u l t i l i n e = " F a l s e "   m u l t i l i n e r o w s = " 3 "   l o c k e d = " F a l s e "   l a b e l = " S i g n e r _ 2 . O r g . T i t l e "   r e a d o n l y = " F a l s e "   v i s i b l e = " T r u e "   r e q u i r e d = " F a l s e "   r e g e x = " "   v a l i d a t i o n m e s s a g e = " "   t o o l t i p = " "   t r a c k e d = " F a l s e " > < ! [ C D A T A [   ] ] > < / T e x t > + 
+                 < T e x t   i d = " S i g n e r _ 2 . U s e r . A l i a s "   r o w = " 0 "   c o l u m n = " 0 "   c o l u m n s p a n = " 0 "   m u l t i l i n e = " F a l s e "   m u l t i l i n e r o w s = " 3 "   l o c k e d = " F a l s e "   l a b e l = " S i g n e r _ 2 . U s e r . A l i a s "   r e a d o n l y = " F a l s e "   v i s i b l e = " T r u e "   r e q u i r e d = " F a l s e "   r e g e x = " "   v a l i d a t i o n m e s s a g e = " "   t o o l t i p = " "   t r a c k e d = " F a l s e " > < ! [ C D A T A [   ] ] > < / T e x t > + 
+                 < T e x t   i d = " S i g n e r _ 2 . U s e r . E m a i l "   r o w = " 0 "   c o l u m n = " 0 "   c o l u m n s p a n = " 0 "   m u l t i l i n e = " F a l s e "   m u l t i l i n e r o w s = " 3 "   l o c k e d = " F a l s e "   l a b e l = " S i g n e r _ 2 . U s e r . E m a i l "   r e a d o n l y = " F a l s e "   v i s i b l e = " T r u e "   r e q u i r e d = " F a l s e "   r e g e x = " "   v a l i d a t i o n m e s s a g e = " "   t o o l t i p = " "   t r a c k e d = " F a l s e " > < ! [ C D A T A [   ] ] > < / T e x t > + 
+                 < T e x t   i d = " S i g n e r _ 2 . U s e r . F a x "   r o w = " 0 "   c o l u m n = " 0 "   c o l u m n s p a n = " 0 "   m u l t i l i n e = " F a l s e "   m u l t i l i n e r o w s = " 3 "   l o c k e d = " F a l s e "   l a b e l = " S i g n e r _ 2 . U s e r . F a x "   r e a d o n l y = " F a l s e "   v i s i b l e = " T r u e "   r e q u i r e d = " F a l s e "   r e g e x = " "   v a l i d a t i o n m e s s a g e = " "   t o o l t i p = " "   t r a c k e d = " F a l s e " > < ! [ C D A T A [   ] ] > < / T e x t > + 
+                 < T e x t   i d = " S i g n e r _ 2 . U s e r . F i r s t N a m e "   r o w = " 0 "   c o l u m n = " 0 "   c o l u m n s p a n = " 0 "   m u l t i l i n e = " F a l s e "   m u l t i l i n e r o w s = " 3 "   l o c k e d = " F a l s e "   l a b e l = " S i g n e r _ 2 . U s e r . F i r s t N a m e "   r e a d o n l y = " F a l s e "   v i s i b l e = " T r u e "   r e q u i r e d = " F a l s e "   r e g e x = " "   v a l i d a t i o n m e s s a g e = " "   t o o l t i p = " "   t r a c k e d = " F a l s e " > < ! [ C D A T A [   ] ] > < / T e x t > + 
+                 < T e x t   i d = " S i g n e r _ 2 . U s e r . F u n c t i o n "   r o w = " 0 "   c o l u m n = " 0 "   c o l u m n s p a n = " 0 "   m u l t i l i n e = " F a l s e "   m u l t i l i n e r o w s = " 3 "   l o c k e d = " F a l s e "   l a b e l = " S i g n e r _ 2 . U s e r . F u n c t i o n "   r e a d o n l y = " F a l s e "   v i s i b l e = " T r u e "   r e q u i r e d = " F a l s e "   r e g e x = " "   v a l i d a t i o n m e s s a g e = " "   t o o l t i p = " "   t r a c k e d = " F a l s e " > < ! [ C D A T A [   ] ] > < / T e x t > + 
+                 < T e x t   i d = " S i g n e r _ 2 . U s e r . J o b D e s c r i p t i o n "   r o w = " 0 "   c o l u m n = " 0 "   c o l u m n s p a n = " 0 "   m u l t i l i n e = " F a l s e "   m u l t i l i n e r o w s = " 3 "   l o c k e d = " F a l s e "   l a b e l = " S i g n e r _ 2 . U s e r . J o b D e s c r i p t i o n "   r e a d o n l y = " F a l s e "   v i s i b l e = " T r u e "   r e q u i r e d = " F a l s e "   r e g e x = " "   v a l i d a t i o n m e s s a g e = " "   t o o l t i p = " "   t r a c k e d = " F a l s e " > < ! [ C D A T A [   ] ] > < / T e x t > + 
+                 < T e x t   i d = " S i g n e r _ 2 . U s e r . L a s t N a m e "   r o w = " 0 "   c o l u m n = " 0 "   c o l u m n s p a n = " 0 "   m u l t i l i n e = " F a l s e "   m u l t i l i n e r o w s = " 3 "   l o c k e d = " F a l s e "   l a b e l = " S i g n e r _ 2 . U s e r . L a s t N a m e "   r e a d o n l y = " F a l s e "   v i s i b l e = " T r u e "   r e q u i r e d = " F a l s e "   r e g e x = " "   v a l i d a t i o n m e s s a g e = " "   t o o l t i p = " "   t r a c k e d = " F a l s e " > < ! [ C D A T A [   ] ] > < / T e x t > + 
+                 < T e x t   i d = " S i g n e r _ 2 . U s e r . O u L e v 1 "   r o w = " 0 "   c o l u m n = " 0 "   c o l u m n s p a n = " 0 "   m u l t i l i n e = " F a l s e "   m u l t i l i n e r o w s = " 3 "   l o c k e d = " F a l s e "   l a b e l = " S i g n e r _ 2 . U s e r . O u L e v 1 "   r e a d o n l y = " F a l s e "   v i s i b l e = " T r u e "   r e q u i r e d = " F a l s e "   r e g e x = " "   v a l i d a t i o n m e s s a g e = " "   t o o l t i p = " "   t r a c k e d = " F a l s e " > < ! [ C D A T A [   ] ] > < / T e x t > + 
+                 < T e x t   i d = " S i g n e r _ 2 . U s e r . O u L e v 2 "   r o w = " 0 "   c o l u m n = " 0 "   c o l u m n s p a n = " 0 "   m u l t i l i n e = " F a l s e "   m u l t i l i n e r o w s = " 3 "   l o c k e d = " F a l s e "   l a b e l = " S i g n e r _ 2 . U s e r . O u L e v 2 "   r e a d o n l y = " F a l s e "   v i s i b l e = " T r u e "   r e q u i r e d = " F a l s e "   r e g e x = " "   v a l i d a t i o n m e s s a g e = " "   t o o l t i p = " "   t r a c k e d = " F a l s e " > < ! [ C D A T A [   ] ] > < / T e x t > + 
+                 < T e x t   i d = " S i g n e r _ 2 . U s e r . O u L e v 3 "   r o w = " 0 "   c o l u m n = " 0 "   c o l u m n s p a n = " 0 "   m u l t i l i n e = " F a l s e "   m u l t i l i n e r o w s = " 3 "   l o c k e d = " F a l s e "   l a b e l = " S i g n e r _ 2 . U s e r . O u L e v 3 "   r e a d o n l y = " F a l s e "   v i s i b l e = " T r u e "   r e q u i r e d = " F a l s e "   r e g e x = " "   v a l i d a t i o n m e s s a g e = " "   t o o l t i p = " "   t r a c k e d = " F a l s e " > < ! [ C D A T A [   ] ] > < / T e x t > + 
+                 < T e x t   i d = " S i g n e r _ 2 . U s e r . O u L e v 4 "   r o w = " 0 "   c o l u m n = " 0 "   c o l u m n s p a n = " 0 "   m u l t i l i n e = " F a l s e "   m u l t i l i n e r o w s = " 3 "   l o c k e d = " F a l s e "   l a b e l = " S i g n e r _ 2 . U s e r . O u L e v 4 "   r e a d o n l y = " F a l s e "   v i s i b l e = " T r u e "   r e q u i r e d = " F a l s e "   r e g e x = " "   v a l i d a t i o n m e s s a g e = " "   t o o l t i p = " "   t r a c k e d = " F a l s e " > < ! [ C D A T A [   ] ] > < / T e x t > + 
+                 < T e x t   i d = " S i g n e r _ 2 . U s e r . O u L e v 5 "   r o w = " 0 "   c o l u m n = " 0 "   c o l u m n s p a n = " 0 "   m u l t i l i n e = " F a l s e "   m u l t i l i n e r o w s = " 3 "   l o c k e d = " F a l s e "   l a b e l = " S i g n e r _ 2 . U s e r . O u L e v 5 "   r e a d o n l y = " F a l s e "   v i s i b l e = " T r u e "   r e q u i r e d = " F a l s e "   r e g e x = " "   v a l i d a t i o n m e s s a g e = " "   t o o l t i p = " "   t r a c k e d = " F a l s e " > < ! [ C D A T A [   ] ] > < / T e x t > + 
+                 < T e x t   i d = " S i g n e r _ 2 . U s e r . O u L e v 6 "   r o w = " 0 "   c o l u m n = " 0 "   c o l u m n s p a n = " 0 "   m u l t i l i n e = " F a l s e "   m u l t i l i n e r o w s = " 3 "   l o c k e d = " F a l s e "   l a b e l = " S i g n e r _ 2 . U s e r . O u L e v 6 "   r e a d o n l y = " F a l s e "   v i s i b l e = " T r u e "   r e q u i r e d = " F a l s e "   r e g e x = " "   v a l i d a t i o n m e s s a g e = " "   t o o l t i p = " "   t r a c k e d = " F a l s e " > < ! [ C D A T A [   ] ] > < / T e x t > + 
+                 < T e x t   i d = " S i g n e r _ 2 . U s e r . O u L e v 7 "   r o w = " 0 "   c o l u m n = " 0 "   c o l u m n s p a n = " 0 "   m u l t i l i n e = " F a l s e "   m u l t i l i n e r o w s = " 3 "   l o c k e d = " F a l s e "   l a b e l = " S i g n e r _ 2 . U s e r . O u L e v 7 "   r e a d o n l y = " F a l s e "   v i s i b l e = " T r u e "   r e q u i r e d = " F a l s e "   r e g e x = " "   v a l i d a t i o n m e s s a g e = " "   t o o l t i p = " "   t r a c k e d = " F a l s e " > < ! [ C D A T A [   ] ] > < / T e x t > + 
+                 < T e x t   i d = " S i g n e r _ 2 . U s e r . O u M a i l "   r o w = " 0 "   c o l u m n = " 0 "   c o l u m n s p a n = " 0 "   m u l t i l i n e = " F a l s e "   m u l t i l i n e r o w s = " 3 "   l o c k e d = " F a l s e "   l a b e l = " S i g n e r _ 2 . U s e r . O u M a i l "   r e a d o n l y = " F a l s e "   v i s i b l e = " T r u e "   r e q u i r e d = " F a l s e "   r e g e x = " "   v a l i d a t i o n m e s s a g e = " "   t o o l t i p = " "   t r a c k e d = " F a l s e " > < ! [ C D A T A [   ] ] > < / T e x t > + 
+                 < T e x t   i d = " S i g n e r _ 2 . U s e r . O u P h o n e "   r o w = " 0 "   c o l u m n = " 0 "   c o l u m n s p a n = " 0 "   m u l t i l i n e = " F a l s e "   m u l t i l i n e r o w s = " 3 "   l o c k e d = " F a l s e "   l a b e l = " S i g n e r _ 2 . U s e r . O u P h o n e "   r e a d o n l y = " F a l s e "   v i s i b l e = " T r u e "   r e q u i r e d = " F a l s e "   r e g e x = " "   v a l i d a t i o n m e s s a g e = " "   t o o l t i p = " "   t r a c k e d = " F a l s e " > < ! [ C D A T A [   ] ] > < / T e x t > + 
+                 < T e x t   i d = " S i g n e r _ 2 . U s e r . P h o n e "   r o w = " 0 "   c o l u m n = " 0 "   c o l u m n s p a n = " 0 "   m u l t i l i n e = " F a l s e "   m u l t i l i n e r o w s = " 3 "   l o c k e d = " F a l s e "   l a b e l = " S i g n e r _ 2 . U s e r . P h o n e "   r e a d o n l y = " F a l s e "   v i s i b l e = " T r u e "   r e q u i r e d = " F a l s e "   r e g e x = " "   v a l i d a t i o n m e s s a g e = " "   t o o l t i p = " "   t r a c k e d = " F a l s e " > < ! [ C D A T A [   ] ] > < / T e x t > + 
+                 < T e x t   i d = " S i g n e r _ 2 . U s e r . P o s t a l . C i t y "   r o w = " 0 "   c o l u m n = " 0 "   c o l u m n s p a n = " 0 "   m u l t i l i n e = " F a l s e "   m u l t i l i n e r o w s = " 3 "   l o c k e d = " F a l s e "   l a b e l = " S i g n e r _ 2 . U s e r . P o s t a l . C i t y "   r e a d o n l y = " F a l s e "   v i s i b l e = " T r u e "   r e q u i r e d = " F a l s e "   r e g e x = " "   v a l i d a t i o n m e s s a g e = " "   t o o l t i p = " "   t r a c k e d = " F a l s e " > < ! [ C D A T A [   ] ] > < / T e x t > + 
+                 < T e x t   i d = " S i g n e r _ 2 . U s e r . P o s t a l . O f f i c e N a m e "   r o w = " 0 "   c o l u m n = " 0 "   c o l u m n s p a n = " 0 "   m u l t i l i n e = " F a l s e "   m u l t i l i n e r o w s = " 3 "   l o c k e d = " F a l s e "   l a b e l = " S i g n e r _ 2 . U s e r . P o s t a l . O f f i c e N a m e "   r e a d o n l y = " F a l s e "   v i s i b l e = " T r u e "   r e q u i r e d = " F a l s e "   r e g e x = " "   v a l i d a t i o n m e s s a g e = " "   t o o l t i p = " "   t r a c k e d = " F a l s e " > < ! [ C D A T A [   ] ] > < / T e x t > + 
+                 < T e x t   i d = " S i g n e r _ 2 . U s e r . P o s t a l . P O B o x "   r o w = " 0 "   c o l u m n = " 0 "   c o l u m n s p a n = " 0 "   m u l t i l i n e = " F a l s e "   m u l t i l i n e r o w s = " 3 "   l o c k e d = " F a l s e "   l a b e l = " S i g n e r _ 2 . U s e r . P o s t a l . P O B o x "   r e a d o n l y = " F a l s e "   v i s i b l e = " T r u e "   r e q u i r e d = " F a l s e "   r e g e x = " "   v a l i d a t i o n m e s s a g e = " "   t o o l t i p = " "   t r a c k e d = " F a l s e " > < ! [ C D A T A [   ] ] > < / T e x t > + 
+                 < T e x t   i d = " S i g n e r _ 2 . U s e r . P o s t a l . S t r e e t "   r o w = " 0 "   c o l u m n = " 0 "   c o l u m n s p a n = " 0 "   m u l t i l i n e = " F a l s e "   m u l t i l i n e r o w s = " 3 "   l o c k e d = " F a l s e "   l a b e l = " S i g n e r _ 2 . U s e r . P o s t a l . S t r e e t "   r e a d o n l y = " F a l s e "   v i s i b l e = " T r u e "   r e q u i r e d = " F a l s e "   r e g e x = " "   v a l i d a t i o n m e s s a g e = " "   t o o l t i p = " "   t r a c k e d = " F a l s e " > < ! [ C D A T A [   ] ] > < / T e x t > + 
+                 < T e x t   i d = " S i g n e r _ 2 . U s e r . P o s t a l . Z i p "   r o w = " 0 "   c o l u m n = " 0 "   c o l u m n s p a n = " 0 "   m u l t i l i n e = " F a l s e "   m u l t i l i n e r o w s = " 3 "   l o c k e d = " F a l s e "   l a b e l = " S i g n e r _ 2 . U s e r . P o s t a l . Z i p "   r e a d o n l y = " F a l s e "   v i s i b l e = " T r u e "   r e q u i r e d = " F a l s e "   r e g e x = " "   v a l i d a t i o n m e s s a g e = " "   t o o l t i p = " "   t r a c k e d = " F a l s e " > < ! [ C D A T A [   ] ] > < / T e x t > + 
+                 < T e x t   i d = " S i g n e r _ 2 . U s e r . S a l u t a t i o n "   r o w = " 0 "   c o l u m n = " 0 "   c o l u m n s p a n = " 0 "   m u l t i l i n e = " F a l s e "   m u l t i l i n e r o w s = " 3 "   l o c k e d = " F a l s e "   l a b e l = " S i g n e r _ 2 . U s e r . S a l u t a t i o n "   r e a d o n l y = " F a l s e "   v i s i b l e = " T r u e "   r e q u i r e d = " F a l s e "   r e g e x = " "   v a l i d a t i o n m e s s a g e = " "   t o o l t i p = " "   t r a c k e d = " F a l s e " > < ! [ C D A T A [   ] ] > < / T e x t > + 
+                 < T e x t   i d = " S i g n e r _ 2 . U s e r . T i t l e "   r o w = " 0 "   c o l u m n = " 0 "   c o l u m n s p a n = " 0 "   m u l t i l i n e = " F a l s e "   m u l t i l i n e r o w s = " 3 "   l o c k e d = " F a l s e "   l a b e l = " S i g n e r _ 2 . U s e r . T i t l e "   r e a d o n l y = " F a l s e "   v i s i b l e = " T r u e "   r e q u i r e d = " F a l s e "   r e g e x = " "   v a l i d a t i o n m e s s a g e = " "   t o o l t i p = " "   t r a c k e d = " F a l s e " > < ! [ C D A T A [   ] ] > < / T e x t > + 
+                 < T e x t   i d = " S i g n e r _ 2 . U s e r . U r l "   r o w = " 0 "   c o l u m n = " 0 "   c o l u m n s p a n = " 0 "   m u l t i l i n e = " F a l s e "   m u l t i l i n e r o w s = " 3 "   l o c k e d = " F a l s e "   l a b e l = " S i g n e r _ 2 . U s e r . U r l "   r e a d o n l y = " F a l s e "   v i s i b l e = " T r u e "   r e q u i r e d = " F a l s e "   r e g e x = " "   v a l i d a t i o n m e s s a g e = " "   t o o l t i p = " "   t r a c k e d = " F a l s e " > < ! [ C D A T A [   ] ] > < / T e x t > + 
+             < / S i g n e r _ 2 > + 
+             < P a r a m e t e r   w i n d o w w i d t h = " 7 5 0 "   w i n d o w h e i g h t = " 0 "   m i n w i n d o w w i d t h = " 0 "   m a x w i n d o w w i d t h = " 0 "   m i n w i n d o w h e i g h t = " 0 "   m a x w i n d o w h e i g h t = " 0 " > + 
+                 < D a t e T i m e   i d = " D o c P a r a m . D a t e "   l i d = " D e u t s c h   ( D e u t s c h l a n d ) "   f o r m a t = " d .   M M M M   y y y y "   c a l e n d e r = " G r e g o r "   r o w = " 0 "   c o l u m n = " 1 "   c o l u m n s p a n = " 1 "   l o c k e d = " F a l s e "   l a b e l = " D a t u m "   r e a d o n l y = " F a l s e "   v i s i b l e = " T r u e "   t o o l t i p = " "   t r a c k e d = " F a l s e " > 2 0 1 9 - 0 7 - 1 8 T 0 0 : 0 0 : 0 0 Z < / D a t e T i m e > + 
+                 < C h e c k B o x   i d = " D o c P a r a m . D a t e H i d e D a y "   r o w = " 0 "   c o l u m n = " 2 "   c o l u m n s p a n = " 1 "   i s i n p u t e n a b l e d = " F a l s e "   l o c k e d = " F a l s e "   l a b e l = " T a g   v e r b e r g e n "   r e a d o n l y = " F a l s e "   v i s i b l e = " T r u e "   t o o l t i p = " "   t r a c k e d = " F a l s e " > f a l s e < / C h e c k B o x > + 
+                 < T e x t   i d = " T e x t D o c P a r a m . D a t e H i d e D a y "   r o w = " 0 "   c o l u m n = " 0 "   c o l u m n s p a n = " 0 "   m u l t i l i n e = " F a l s e "   m u l t i l i n e r o w s = " 3 "   l o c k e d = " F a l s e "   l a b e l = " T a g   v e r b e r g e n t e x t "   r e a d o n l y = " F a l s e "   v i s i b l e = " F a l s e "   r e q u i r e d = " F a l s e "   r e g e x = " "   v a l i d a t i o n m e s s a g e = " "   t o o l t i p = " "   t r a c k e d = " F a l s e " > < ! [ C D A T A [ T a g   v e r b e r g e n ] ] > < / T e x t > + 
+                 < T e x t   i d = " D o c P a r a m . F o o t e r N r "   r o w = " 2 "   c o l u m n = " 1 "   c o l u m n s p a n = " 1 "   m u l t i l i n e = " F a l s e "   m u l t i l i n e r o w s = " 3 "   l o c k e d = " F a l s e "   l a b e l = " N r   ( F u s s z e i l e ) "   r e a d o n l y = " F a l s e "   v i s i b l e = " F a l s e "   r e q u i r e d = " F a l s e "   r e g e x = " "   v a l i d a t i o n m e s s a g e = " "   t o o l t i p = " "   t r a c k e d = " F a l s e " > < ! [ C D A T A [   ] ] > < / T e x t > + 
+                 < T e x t   i d = " D o c P a r a m . H e a d e r S u b j e c t "   r o w = " 1 "   c o l u m n = " 1 "   c o l u m n s p a n = " 2 "   m u l t i l i n e = " T r u e "   m u l t i l i n e r o w s = " 1 . 5 "   l o c k e d = " F a l s e "   l a b e l = " T e x t   F o l g e s e i t e n "   r e a d o n l y = " F a l s e "   v i s i b l e = " T r u e "   r e q u i r e d = " F a l s e "   r e g e x = " "   v a l i d a t i o n m e s s a g e = " "   t o o l t i p = " "   t r a c k e d = " F a l s e " > < ! [ C D A T A [   ] ] > < / T e x t > + 
+                 < D a t e T i m e   i d = " D o c P a r a m . H i d d e n . C r e a t i o n T i m e "   l i d = " D e u t s c h   ( D e u t s c h l a n d ) "   f o r m a t = " d .   M M M M   y y y y "   c a l e n d e r = " G r e g o r "   r o w = " 0 "   c o l u m n = " 5 "   c o l u m n s p a n = " 0 "   l o c k e d = " F a l s e "   l a b e l = " "   r e a d o n l y = " F a l s e "   v i s i b l e = " F a l s e "   t o o l t i p = " "   t r a c k e d = " F a l s e " > 2 0 1 9 - 0 7 - 1 8 T 0 7 : 1 1 : 0 7 . 5 1 4 1 6 2 7 Z < / D a t e T i m e > + 
+                 < C h e c k B o x   i d = " D o c P a r a m . S h o w F o o t e r "   r o w = " 2 "   c o l u m n = " 2 "   c o l u m n s p a n = " 1 "   i s i n p u t e n a b l e d = " F a l s e "   l o c k e d = " F a l s e "   l a b e l = " a n z e i g e n "   r e a d o n l y = " F a l s e "   v i s i b l e = " F a l s e "   t o o l t i p = " "   t r a c k e d = " F a l s e " > f a l s e < / C h e c k B o x > + 
+                 < T e x t   i d = " T e x t D o c P a r a m . S h o w F o o t e r "   r o w = " 0 "   c o l u m n = " 0 "   c o l u m n s p a n = " 0 "   m u l t i l i n e = " F a l s e "   m u l t i l i n e r o w s = " 3 "   l o c k e d = " F a l s e "   l a b e l = " a n z e i g e n t e x t "   r e a d o n l y = " F a l s e "   v i s i b l e = " F a l s e "   r e q u i r e d = " F a l s e "   r e g e x = " "   v a l i d a t i o n m e s s a g e = " "   t o o l t i p = " "   t r a c k e d = " F a l s e " > < ! [ C D A T A [ a n z e i g e n ] ] > < / T e x t > + 
+                 < C h e c k B o x   i d = " D o c P a r a m . S h o w H e a d e r S u b j e c t "   r o w = " 1 "   c o l u m n = " 3 "   c o l u m n s p a n = " 1 "   i s i n p u t e n a b l e d = " F a l s e "   l o c k e d = " F a l s e "   l a b e l = " a n z e i g e n "   r e a d o n l y = " F a l s e "   v i s i b l e = " F a l s e "   t o o l t i p = " "   t r a c k e d = " F a l s e " > t r u e < / C h e c k B o x > + 
+                 < T e x t   i d = " T e x t D o c P a r a m . S h o w H e a d e r S u b j e c t "   r o w = " 0 "   c o l u m n = " 0 "   c o l u m n s p a n = " 0 "   m u l t i l i n e = " F a l s e "   m u l t i l i n e r o w s = " 3 "   l o c k e d = " F a l s e "   l a b e l = " a n z e i g e n t e x t "   r e a d o n l y = " F a l s e "   v i s i b l e = " F a l s e "   r e q u i r e d = " F a l s e "   r e g e x = " "   v a l i d a t i o n m e s s a g e = " "   t o o l t i p = " "   t r a c k e d = " F a l s e " > < ! [ C D A T A [ a n z e i g e n ] ] > < / T e x t > + 
+                 < T e x t   i d = " S p e c i a l . C h e c k b o x G r o u p V i e w L i s t "   r o w = " 0 "   c o l u m n = " 0 "   c o l u m n s p a n = " 0 "   m u l t i l i n e = " F a l s e "   m u l t i l i n e r o w s = " 3 "   l o c k e d = " F a l s e "   l a b e l = " S p e c i a l . C h e c k b o x G r o u p V i e w L i s t "   r e a d o n l y = " F a l s e "   v i s i b l e = " F a l s e "   r e q u i r e d = " F a l s e "   r e g e x = " "   v a l i d a t i o n m e s s a g e = " "   t o o l t i p = " "   t r a c k e d = " F a l s e " > < ! [ C D A T A [ �%� a n z e i g e n ] ] > < / T e x t > + 
+                 < T e x t   i d = " S p e c i a l . C h e c k b o x G r o u p V i e w B o x "   r o w = " 0 "   c o l u m n = " 0 "   c o l u m n s p a n = " 0 "   m u l t i l i n e = " F a l s e "   m u l t i l i n e r o w s = " 3 "   l o c k e d = " F a l s e "   l a b e l = " S p e c i a l . C h e c k b o x G r o u p V i e w B o x "   r e a d o n l y = " F a l s e "   v i s i b l e = " F a l s e "   r e q u i r e d = " F a l s e "   r e g e x = " "   v a l i d a t i o n m e s s a g e = " "   t o o l t i p = " "   t r a c k e d = " F a l s e " > < ! [ C D A T A [ �"] ] > < / T e x t > + 
+                 < T e x t   i d = " S p e c i a l . C h e c k b o x G r o u p V i e w T e x t "   r o w = " 0 "   c o l u m n = " 0 "   c o l u m n s p a n = " 0 "   m u l t i l i n e = " F a l s e "   m u l t i l i n e r o w s = " 3 "   l o c k e d = " F a l s e "   l a b e l = " S p e c i a l . C h e c k b o x G r o u p V i e w T e x t "   r e a d o n l y = " F a l s e "   v i s i b l e = " F a l s e "   r e q u i r e d = " F a l s e "   r e g e x = " "   v a l i d a t i o n m e s s a g e = " "   t o o l t i p = " "   t r a c k e d = " F a l s e " > < ! [ C D A T A [ a n z e i g e n ] ] > < / T e x t > + 
+                 < T e x t   i d = " S p e c i a l . C h e c k b o x G r o u p V i e w B o x A n d T e x t "   r o w = " 0 "   c o l u m n = " 0 "   c o l u m n s p a n = " 0 "   m u l t i l i n e = " F a l s e "   m u l t i l i n e r o w s = " 3 "   l o c k e d = " F a l s e "   l a b e l = " S p e c i a l . C h e c k b o x G r o u p V i e w B o x A n d T e x t "   r e a d o n l y = " F a l s e "   v i s i b l e = " F a l s e "   r e q u i r e d = " F a l s e "   r e g e x = " "   v a l i d a t i o n m e s s a g e = " "   t o o l t i p = " "   t r a c k e d = " F a l s e " > < ! [ C D A T A [ �"� a n z e i g e n ] ] > < / T e x t > + 
+             < / P a r a m e t e r > + 
+             < T o o l b o x   w i n d o w w i d t h = " 0 "   w i n d o w h e i g h t = " 0 "   m i n w i n d o w w i d t h = " 0 "   m a x w i n d o w w i d t h = " 0 "   m i n w i n d o w h e i g h t = " 0 "   m a x w i n d o w h e i g h t = " 0 " > + 
+                 < T e x t   i d = " D o c u m e n t P r o p e r t i e s . S a v e P a t h "   r o w = " 0 "   c o l u m n = " 0 "   c o l u m n s p a n = " 0 "   m u l t i l i n e = " F a l s e "   m u l t i l i n e r o w s = " 3 "   l o c k e d = " F a l s e "   l a b e l = " "   r e a d o n l y = " F a l s e "   v i s i b l e = " T r u e "   r e q u i r e d = " F a l s e "   r e g e x = " "   v a l i d a t i o n m e s s a g e = " "   t o o l t i p = " "   t r a c k e d = " F a l s e " > < ! [ C D A T A [ \ \ s d s a m z 0 0 1 1 . k t . k t z h . c h \ V D I _ I B I S _ P r o f i l d a t e n $ \ b 2 1 4 p u r \ D e s k t o p \ M A B   2 0 1 8 \ M A B   2 0 1 9   -   D o k u m e n t a t i o n s - F o r m u l a r   V 2 . d o c x ] ] > < / T e x t > + 
+                 < T e x t   i d = " D o c u m e n t P r o p e r t i e s . D o c u m e n t N a m e "   r o w = " 0 "   c o l u m n = " 0 "   c o l u m n s p a n = " 0 "   m u l t i l i n e = " F a l s e "   m u l t i l i n e r o w s = " 3 "   l o c k e d = " F a l s e "   l a b e l = " "   r e a d o n l y = " F a l s e "   v i s i b l e = " T r u e "   r e q u i r e d = " F a l s e "   r e g e x = " "   v a l i d a t i o n m e s s a g e = " "   t o o l t i p = " "   t r a c k e d = " F a l s e " > < ! [ C D A T A [ M A B   2 0 1 9   -   D o k u m e n t a t i o n s - F o r m u l a r   V 2 . d o c x ] ] > < / T e x t > + 
+                 < D a t e T i m e   i d = " D o c u m e n t P r o p e r t i e s . S a v e T i m e s t a m p "   l i d = " D e u t s c h   ( D e u t s c h l a n d ) "   f o r m a t = " "   c a l e n d e r = " "   r o w = " 0 "   c o l u m n = " 0 "   c o l u m n s p a n = " 0 "   l o c k e d = " F a l s e "   l a b e l = " "   r e a d o n l y = " F a l s e "   v i s i b l e = " T r u e "   t o o l t i p = " "   t r a c k e d = " F a l s e " > 2 0 1 9 - 1 1 - 0 7 T 0 9 : 5 4 : 2 0 . 2 2 3 5 3 5 1 Z < / D a t e T i m e > + 
+             < / T o o l b o x > + 
+             < S c r i p t i n g   w i n d o w w i d t h = " 0 "   w i n d o w h e i g h t = " 0 "   m i n w i n d o w w i d t h = " 0 "   m a x w i n d o w w i d t h = " 0 "   m i n w i n d o w h e i g h t = " 0 "   m a x w i n d o w h e i g h t = " 0 " > + 
+                 < T e x t   i d = " C u s t o m E l e m e n t s . S i g n e r 1 W i t h o u t F u n c t i o n "   r o w = " 0 "   c o l u m n = " 0 "   c o l u m n s p a n = " 0 "   m u l t i l i n e = " F a l s e "   m u l t i l i n e r o w s = " 3 "   l o c k e d = " F a l s e "   l a b e l = " C u s t o m E l e m e n t s . S i g n e r 1 W i t h o u t F u n c t i o n "   r e a d o n l y = " F a l s e "   v i s i b l e = " T r u e "   r e q u i r e d = " F a l s e "   r e g e x = " "   v a l i d a t i o n m e s s a g e = " "   t o o l t i p = " "   t r a c k e d = " F a l s e " > < ! [ C D A T A [ A n d r e a   L � b b e r s t e d t ] ] > < / T e x t > + 
+                 < T e x t   i d = " C u s t o m E l e m e n t s . S i g n e r 2 W i t h o u t F u n c t i o n "   r o w = " 0 "   c o l u m n = " 0 "   c o l u m n s p a n = " 0 "   m u l t i l i n e = " F a l s e "   m u l t i l i n e r o w s = " 3 "   l o c k e d = " F a l s e "   l a b e l = " C u s t o m E l e m e n t s . S i g n e r 2 W i t h o u t F u n c t i o n "   r e a d o n l y = " F a l s e "   v i s i b l e = " T r u e "   r e q u i r e d = " F a l s e "   r e g e x = " "   v a l i d a t i o n m e s s a g e = " "   t o o l t i p = " "   t r a c k e d = " F a l s e " > < ! [ C D A T A [   ] ] > < / T e x t > + 
+                 < T e x t   i d = " C u s t o m E l e m e n t s . S i g n e r 3 W i t h o u t F u n c t i o n "   r o w = " 0 "   c o l u m n = " 0 "   c o l u m n s p a n = " 0 "   m u l t i l i n e = " F a l s e "   m u l t i l i n e r o w s = " 3 "   l o c k e d = " F a l s e "   l a b e l = " C u s t o m E l e m e n t s . S i g n e r 3 W i t h o u t F u n c t i o n "   r e a d o n l y = " F a l s e "   v i s i b l e = " T r u e "   r e q u i r e d = " F a l s e "   r e g e x = " "   v a l i d a t i o n m e s s a g e = " "   t o o l t i p = " "   t r a c k e d = " F a l s e " > < ! [ C D A T A [   ] ] > < / T e x t > + 
+                 < T e x t   i d = " C u s t o m E l e m e n t s . L o g i c . T i t l e . C o n t a i n s . P r o f i l e . N a m e L i n e "   r o w = " 0 "   c o l u m n = " 0 "   c o l u m n s p a n = " 0 "   m u l t i l i n e = " F a l s e "   m u l t i l i n e r o w s = " 3 "   l o c k e d = " F a l s e "   l a b e l = " C u s t o m E l e m e n t s . L o g i c . T i t l e . C o n t a i n s . P r o f i l e . N a m e L i n e "   r e a d o n l y = " F a l s e "   v i s i b l e = " T r u e "   r e q u i r e d = " F a l s e "   r e g e x = " "   v a l i d a t i o n m e s s a g e = " "   t o o l t i p = " "   t r a c k e d = " F a l s e " > < ! [ C D A T A [   ] ] > < / T e x t > + 
+                 < T e x t   i d = " C u s t o m E l e m e n t s . L o g i c . T i t l e . C o n t a i n s . S i g n e r 1 . N a m e L i n e "   r o w = " 0 "   c o l u m n = " 0 "   c o l u m n s p a n = " 0 "   m u l t i l i n e = " F a l s e "   m u l t i l i n e r o w s = " 3 "   l o c k e d = " F a l s e "   l a b e l = " C u s t o m E l e m e n t s . L o g i c . T i t l e . C o n t a i n s . S i g n e r 1 . N a m e L i n e "   r e a d o n l y = " F a l s e "   v i s i b l e = " T r u e "   r e q u i r e d = " F a l s e "   r e g e x = " "   v a l i d a t i o n m e s s a g e = " "   t o o l t i p = " "   t r a c k e d = " F a l s e " > < ! [ C D A T A [   ] ] > < / T e x t > + 
+                 < T e x t   i d = " C u s t o m E l e m e n t s . L o g i c . T i t l e . C o n t a i n s . S i g n e r 2 . N a m e L i n e "   r o w = " 0 "   c o l u m n = " 0 "   c o l u m n s p a n = " 0 "   m u l t i l i n e = " F a l s e "   m u l t i l i n e r o w s = " 3 "   l o c k e d = " F a l s e "   l a b e l = " C u s t o m E l e m e n t s . L o g i c . T i t l e . C o n t a i n s . S i g n e r 2 . N a m e L i n e "   r e a d o n l y = " F a l s e "   v i s i b l e = " T r u e "   r e q u i r e d = " F a l s e "   r e g e x = " "   v a l i d a t i o n m e s s a g e = " "   t o o l t i p = " "   t r a c k e d = " F a l s e " > < ! [ C D A T A [   ] ] > < / T e x t > + 
+                 < T e x t   i d = " C u s t o m E l e m e n t s . L o g i c . T i t l e . C o n t a i n s . S i g n e r 3 . N a m e L i n e "   r o w = " 0 "   c o l u m n = " 0 "   c o l u m n s p a n = " 0 "   m u l t i l i n e = " F a l s e "   m u l t i l i n e r o w s = " 3 "   l o c k e d = " F a l s e "   l a b e l = " C u s t o m E l e m e n t s . L o g i c . T i t l e . C o n t a i n s . S i g n e r 3 . N a m e L i n e "   r e a d o n l y = " F a l s e "   v i s i b l e = " T r u e "   r e q u i r e d = " F a l s e "   r e g e x = " "   v a l i d a t i o n m e s s a g e = " "   t o o l t i p = " "   t r a c k e d = " F a l s e " > < ! [ C D A T A [   ] ] > < / T e x t > + 
+                 < T e x t   i d = " C u s t o m E l e m e n t s . L o g i c . T i t l e . E q u a l s . P r o f i l e . N a m e L i n e "   r o w = " 0 "   c o l u m n = " 0 "   c o l u m n s p a n = " 0 "   m u l t i l i n e = " F a l s e "   m u l t i l i n e r o w s = " 3 "   l o c k e d = " F a l s e "   l a b e l = " C u s t o m E l e m e n t s . L o g i c . T i t l e . E q u a l s . P r o f i l e . N a m e L i n e "   r e a d o n l y = " F a l s e "   v i s i b l e = " T r u e "   r e q u i r e d = " F a l s e "   r e g e x = " "   v a l i d a t i o n m e s s a g e = " "   t o o l t i p = " "   t r a c k e d = " F a l s e " > < ! [ C D A T A [   ] ] > < / T e x t > + 
+                 < T e x t   i d = " C u s t o m E l e m e n t s . L o g i c . T i t l e . E q u a l s . S i g n e r 1 . N a m e L i n e "   r o w = " 0 "   c o l u m n = " 0 "   c o l u m n s p a n = " 0 "   m u l t i l i n e = " F a l s e "   m u l t i l i n e r o w s = " 3 "   l o c k e d = " F a l s e "   l a b e l = " C u s t o m E l e m e n t s . L o g i c . T i t l e . E q u a l s . S i g n e r 1 . N a m e L i n e "   r e a d o n l y = " F a l s e "   v i s i b l e = " T r u e "   r e q u i r e d = " F a l s e "   r e g e x = " "   v a l i d a t i o n m e s s a g e = " "   t o o l t i p = " "   t r a c k e d = " F a l s e " > < ! [ C D A T A [   ] ] > < / T e x t > + 
+                 < T e x t   i d = " C u s t o m E l e m e n t s . L o g i c . T i t l e . E q u a l s . S i g n e r 2 . N a m e L i n e "   r o w = " 0 "   c o l u m n = " 0 "   c o l u m n s p a n = " 0 "   m u l t i l i n e = " F a l s e "   m u l t i l i n e r o w s = " 3 "   l o c k e d = " F a l s e "   l a b e l = " C u s t o m E l e m e n t s . L o g i c . T i t l e . E q u a l s . S i g n e r 2 . N a m e L i n e "   r e a d o n l y = " F a l s e "   v i s i b l e = " T r u e "   r e q u i r e d = " F a l s e "   r e g e x = " "   v a l i d a t i o n m e s s a g e = " "   t o o l t i p = " "   t r a c k e d = " F a l s e " > < ! [ C D A T A [   ] ] > < / T e x t > + 
+                 < T e x t   i d = " C u s t o m E l e m e n t s . L o g i c . T i t l e . E q u a l s . S i g n e r 3 . N a m e L i n e "   r o w = " 0 "   c o l u m n = " 0 "   c o l u m n s p a n = " 0 "   m u l t i l i n e = " F a l s e "   m u l t i l i n e r o w s = " 3 "   l o c k e d = " F a l s e "   l a b e l = " C u s t o m E l e m e n t s . L o g i c . T i t l e . E q u a l s . S i g n e r 3 . N a m e L i n e "   r e a d o n l y = " F a l s e "   v i s i b l e = " T r u e "   r e q u i r e d = " F a l s e "   r e g e x = " "   v a l i d a t i o n m e s s a g e = " "   t o o l t i p = " "   t r a c k e d = " F a l s e " > < ! [ C D A T A [   ] ] > < / T e x t > + 
+                 < T e x t   i d = " C u s t o m E l e m e n t s . H e a d e r . A d r e s s . E m p t y L i n e s "   r o w = " 0 "   c o l u m n = " 0 "   c o l u m n s p a n = " 0 "   m u l t i l i n e = " F a l s e "   m u l t i l i n e r o w s = " 3 "   l o c k e d = " F a l s e "   l a b e l = " C u s t o m E l e m e n t s . H e a d e r . A d r e s s . E m p t y L i n e s "   r e a d o n l y = " F a l s e "   v i s i b l e = " T r u e "   r e q u i r e d = " F a l s e "   r e g e x = " "   v a l i d a t i o n m e s s a g e = " "   t o o l t i p = " "   t r a c k e d = " F a l s e " > < ! [ C D A T A [ � ] ] > < / T e x t > + 
+                 < T e x t   i d = " C u s t o m E l e m e n t s . H e a d e r . S c r i p t 1 "   r o w = " 0 "   c o l u m n = " 0 "   c o l u m n s p a n = " 0 "   m u l t i l i n e = " F a l s e "   m u l t i l i n e r o w s = " 3 "   l o c k e d = " F a l s e "   l a b e l = " C u s t o m E l e m e n t s . H e a d e r . S c r i p t 1 "   r e a d o n l y = " F a l s e "   v i s i b l e = " T r u e "   r e q u i r e d = " F a l s e "   r e g e x = " "   v a l i d a t i o n m e s s a g e = " "   t o o l t i p = " "   t r a c k e d = " F a l s e " > < ! [ C D A T A [ K a n t o n   Z � r i c h + 
+ S i c h e r h e i t s d i r e k t i o n ] ] > < / T e x t > + 
+                 < T e x t   i d = " C u s t o m E l e m e n t s . H e a d e r . S c r i p t 2 "   r o w = " 0 "   c o l u m n = " 0 "   c o l u m n s p a n = " 0 "   m u l t i l i n e = " F a l s e "   m u l t i l i n e r o w s = " 3 "   l o c k e d = " F a l s e "   l a b e l = " C u s t o m E l e m e n t s . H e a d e r . S c r i p t 2 "   r e a d o n l y = " F a l s e "   v i s i b l e = " T r u e "   r e q u i r e d = " F a l s e "   r e g e x = " "   v a l i d a t i o n m e s s a g e = " "   t o o l t i p = " "   t r a c k e d = " F a l s e " > < ! [ C D A T A [ K a n t o n a l e s   S o z i a l a m t ] ] > < / T e x t > + 
+                 < T e x t   i d = " C u s t o m E l e m e n t s . H e a d e r . S c r i p t 3 "   r o w = " 0 "   c o l u m n = " 0 "   c o l u m n s p a n = " 0 "   m u l t i l i n e = " F a l s e "   m u l t i l i n e r o w s = " 3 "   l o c k e d = " F a l s e "   l a b e l = " C u s t o m E l e m e n t s . H e a d e r . S c r i p t 3 "   r e a d o n l y = " F a l s e "   v i s i b l e = " T r u e "   r e q u i r e d = " F a l s e "   r e g e x = " "   v a l i d a t i o n m e s s a g e = " "   t o o l t i p = " "   t r a c k e d = " F a l s e " > < ! [ C D A T A [   ] ] > < / T e x t > + 
+                 < T e x t   i d = " C u s t o m E l e m e n t s . H e a d e r . S c r i p t 4 "   r o w = " 0 "   c o l u m n = " 0 "   c o l u m n s p a n = " 0 "   m u l t i l i n e = " F a l s e "   m u l t i l i n e r o w s = " 3 "   l o c k e d = " F a l s e "   l a b e l = " C u s t o m E l e m e n t s . H e a d e r . S c r i p t 4 "   r e a d o n l y = " F a l s e "   v i s i b l e = " T r u e "   r e q u i r e d = " F a l s e "   r e g e x = " "   v a l i d a t i o n m e s s a g e = " "   t o o l t i p = " "   t r a c k e d = " F a l s e " > < ! [ C D A T A [ A n d r e a   L � b b e r s t e d t ] ] > < / T e x t > + 
+                 < T e x t   i d = " C u s t o m E l e m e n t s . H e a d e r . S c r i p t 5 "   r o w = " 0 "   c o l u m n = " 0 "   c o l u m n s p a n = " 0 "   m u l t i l i n e = " F a l s e "   m u l t i l i n e r o w s = " 3 "   l o c k e d = " F a l s e "   l a b e l = " C u s t o m E l e m e n t s . H e a d e r . S c r i p t 5 "   r e a d o n l y = " F a l s e "   v i s i b l e = " T r u e "   r e q u i r e d = " F a l s e "   r e g e x = " "   v a l i d a t i o n m e s s a g e = " "   t o o l t i p = " "   t r a c k e d = " F a l s e " > < ! [ C D A T A [ A m t s c h e f i n + 
+ S c h a f f h a u s e r s t r a s s e   7 8 + 
+ 8 0 9 0   Z � r i c h + 
+ T e l e f o n   + 4 1   4 3   2 5 9   2 4   5 0 + 
+ a n d r e a . l u e b b e r s t e d t @ s a . z h . c h + 
+ w w w . s o z i a l a m t . z h . c h ] ] > < / T e x t > + 
+                 < T e x t   i d = " C u s t o m E l e m e n t s . H e a d e r . K o n t a k t S c r i p t K o m p l e t t "   r o w = " 0 "   c o l u m n = " 0 "   c o l u m n s p a n = " 0 "   m u l t i l i n e = " F a l s e "   m u l t i l i n e r o w s = " 3 "   l o c k e d = " F a l s e "   l a b e l = " C u s t o m E l e m e n t s . H e a d e r . K o n t a k t S c r i p t K o m p l e t t "   r e a d o n l y = " F a l s e "   v i s i b l e = " T r u e "   r e q u i r e d = " F a l s e "   r e g e x = " "   v a l i d a t i o n m e s s a g e = " "   t o o l t i p = " "   t r a c k e d = " F a l s e " > < ! [ C D A T A [ K o n t a k t : + 
+ A n d r e a   L � b b e r s t e d t + 
+ A m t s c h e f i n + 
+ + 
+ S c h a f f h a u s e r s t r a s s e   7 8 + 
+ 8 0 9 0   Z � r i c h + 
+ T e l e f o n   + 4 1   4 3   2 5 9   2 4   5 0 + 
+ a n d r e a . l u e b b e r s t e d t @ s a . z h . c h + 
+ w w w . s o z i a l a m t . z h . c h ] ] > < / T e x t > + 
+                 < T e x t   i d = " C u s t o m E l e m e n t s . H e a d e r . R e f N r "   r o w = " 0 "   c o l u m n = " 0 "   c o l u m n s p a n = " 0 "   m u l t i l i n e = " F a l s e "   m u l t i l i n e r o w s = " 3 "   l o c k e d = " F a l s e "   l a b e l = " C u s t o m E l e m e n t s . H e a d e r . R e f N r "   r e a d o n l y = " F a l s e "   v i s i b l e = " T r u e "   r e q u i r e d = " F a l s e "   r e g e x = " "   v a l i d a t i o n m e s s a g e = " "   t o o l t i p = " "   t r a c k e d = " F a l s e " > < ! [ C D A T A [   ] ] > < / T e x t > + 
+                 < T e x t   i d = " C u s t o m E l e m e n t s . H e a d e r . T e x t F o l g e s e i t e n "   r o w = " 0 "   c o l u m n = " 0 "   c o l u m n s p a n = " 0 "   m u l t i l i n e = " F a l s e "   m u l t i l i n e r o w s = " 3 "   l o c k e d = " F a l s e "   l a b e l = " C u s t o m E l e m e n t s . H e a d e r . T e x t F o l g e s e i t e n "   r e a d o n l y = " F a l s e "   v i s i b l e = " T r u e "   r e q u i r e d = " F a l s e "   r e g e x = " "   v a l i d a t i o n m e s s a g e = " "   t o o l t i p = " "   t r a c k e d = " F a l s e " > < ! [ C D A T A [ K a n t o n a l e s   S o z i a l a m t ] ] > < / T e x t > + 
+                 < T e x t   i d = " C u s t o m E l e m e n t s . H e a d e r . T e x t F o l g e s e i t e n O u L e v 2 "   r o w = " 0 "   c o l u m n = " 0 "   c o l u m n s p a n = " 0 "   m u l t i l i n e = " F a l s e "   m u l t i l i n e r o w s = " 3 "   l o c k e d = " F a l s e "   l a b e l = " C u s t o m E l e m e n t s . H e a d e r . T e x t F o l g e s e i t e n O u L e v 2 "   r e a d o n l y = " F a l s e "   v i s i b l e = " T r u e "   r e q u i r e d = " F a l s e "   r e g e x = " "   v a l i d a t i o n m e s s a g e = " "   t o o l t i p = " "   t r a c k e d = " F a l s e " > < ! [ C D A T A [ S i c h e r h e i t s d i r e k t i o n ] ] > < / T e x t > + 
+                 < T e x t   i d = " C u s t o m E l e m e n t s . H e a d e r . T e x t F o l g e s e i t e n O u L e v 3 "   r o w = " 0 "   c o l u m n = " 0 "   c o l u m n s p a n = " 0 "   m u l t i l i n e = " F a l s e "   m u l t i l i n e r o w s = " 3 "   l o c k e d = " F a l s e "   l a b e l = " C u s t o m E l e m e n t s . H e a d e r . T e x t F o l g e s e i t e n O u L e v 3 "   r e a d o n l y = " F a l s e "   v i s i b l e = " T r u e "   r e q u i r e d = " F a l s e "   r e g e x = " "   v a l i d a t i o n m e s s a g e = " "   t o o l t i p = " "   t r a c k e d = " F a l s e " > < ! [ C D A T A [ K a n t o n a l e s   S o z i a l a m t ] ] > < / T e x t > + 
+                 < T e x t   i d = " C u s t o m E l e m e n t s . H e a d e r . V o r g e s e t z e r S c r i p t 1 "   r o w = " 0 "   c o l u m n = " 0 "   c o l u m n s p a n = " 0 "   m u l t i l i n e = " F a l s e "   m u l t i l i n e r o w s = " 3 "   l o c k e d = " F a l s e "   l a b e l = " C u s t o m E l e m e n t s . H e a d e r . V o r g e s e t z e r S c r i p t 1 "   r e a d o n l y = " F a l s e "   v i s i b l e = " T r u e "   r e q u i r e d = " F a l s e "   r e g e x = " "   v a l i d a t i o n m e s s a g e = " "   t o o l t i p = " "   t r a c k e d = " F a l s e " > < ! [ C D A T A [ A n d r e a   L � b b e r s t e d t ] ] > < / T e x t > + 
+                 < T e x t   i d = " C u s t o m E l e m e n t s . H e a d e r . V o r g e s e t z e r S c r i p t 2 "   r o w = " 0 "   c o l u m n = " 0 "   c o l u m n s p a n = " 0 "   m u l t i l i n e = " F a l s e "   m u l t i l i n e r o w s = " 3 "   l o c k e d = " F a l s e "   l a b e l = " C u s t o m E l e m e n t s . H e a d e r . V o r g e s e t z e r S c r i p t 2 "   r e a d o n l y = " F a l s e "   v i s i b l e = " T r u e "   r e q u i r e d = " F a l s e "   r e g e x = " "   v a l i d a t i o n m e s s a g e = " "   t o o l t i p = " "   t r a c k e d = " F a l s e " > < ! [ C D A T A [ A m t s c h e f i n ] ] > < / T e x t > + 
+                 < T e x t   i d = " C u s t o m E l e m e n t s . H e a d e r . D a t e R e f N r . L e f t "   r o w = " 0 "   c o l u m n = " 0 "   c o l u m n s p a n = " 0 "   m u l t i l i n e = " F a l s e "   m u l t i l i n e r o w s = " 3 "   l o c k e d = " F a l s e "   l a b e l = " C u s t o m E l e m e n t s . H e a d e r . D a t e R e f N r . L e f t "   r e a d o n l y = " F a l s e "   v i s i b l e = " T r u e "   r e q u i r e d = " F a l s e "   r e g e x = " "   v a l i d a t i o n m e s s a g e = " "   t o o l t i p = " "   t r a c k e d = " F a l s e " > < ! [ C D A T A [ D a t u m ] ] > < / T e x t > + 
+                 < T e x t   i d = " C u s t o m E l e m e n t s . H e a d e r . D a t e R e f N r . R i g h t "   r o w = " 0 "   c o l u m n = " 0 "   c o l u m n s p a n = " 0 "   m u l t i l i n e = " F a l s e "   m u l t i l i n e r o w s = " 3 "   l o c k e d = " F a l s e "   l a b e l = " C u s t o m E l e m e n t s . H e a d e r . D a t e R e f N r . R i g h t "   r e a d o n l y = " F a l s e "   v i s i b l e = " T r u e "   r e q u i r e d = " F a l s e "   r e g e x = " "   v a l i d a t i o n m e s s a g e = " "   t o o l t i p = " "   t r a c k e d = " F a l s e " > < ! [ C D A T A [ 1 8 .   J u l i   2 0 1 9 ] ] > < / T e x t > + 
+                 < T e x t   i d = " C u s t o m E l e m e n t s . H e a d e r . D a t e "   r o w = " 0 "   c o l u m n = " 0 "   c o l u m n s p a n = " 0 "   m u l t i l i n e = " F a l s e "   m u l t i l i n e r o w s = " 3 "   l o c k e d = " F a l s e "   l a b e l = " C u s t o m E l e m e n t s . H e a d e r . D a t e "   r e a d o n l y = " F a l s e "   v i s i b l e = " T r u e "   r e q u i r e d = " F a l s e "   r e g e x = " "   v a l i d a t i o n m e s s a g e = " "   t o o l t i p = " "   t r a c k e d = " F a l s e " > < ! [ C D A T A [ 1 8 .   J u l i   2 0 1 9 ] ] > < / T e x t > + 
+                 < T e x t   i d = " C u s t o m E l e m e n t s . H e a d e r . D a t e S t a m p L i n e "   r o w = " 0 "   c o l u m n = " 0 "   c o l u m n s p a n = " 0 "   m u l t i l i n e = " F a l s e "   m u l t i l i n e r o w s = " 3 "   l o c k e d = " F a l s e "   l a b e l = " C u s t o m E l e m e n t s . H e a d e r . D a t e S t a m p L i n e "   r e a d o n l y = " F a l s e "   v i s i b l e = " T r u e "   r e q u i r e d = " F a l s e "   r e g e x = " "   v a l i d a t i o n m e s s a g e = " "   t o o l t i p = " "   t r a c k e d = " F a l s e " > < ! [ C D A T A [   ] ] > < / T e x t > + 
+                 < T e x t   i d = " C u s t o m E l e m e n t s . F o o t e r . L i n e "   r o w = " 0 "   c o l u m n = " 0 "   c o l u m n s p a n = " 0 "   m u l t i l i n e = " F a l s e "   m u l t i l i n e r o w s = " 3 "   l o c k e d = " F a l s e "   l a b e l = " C u s t o m E l e m e n t s . F o o t e r . L i n e "   r e a d o n l y = " F a l s e "   v i s i b l e = " T r u e "   r e q u i r e d = " F a l s e "   r e g e x = " "   v a l i d a t i o n m e s s a g e = " "   t o o l t i p = " "   t r a c k e d = " F a l s e " > < ! [ C D A T A [   ] ] > < / T e x t > + 
+             < / S c r i p t i n g > + 
+         < / D a t a M o d e l > + 
+     < / C o n t e n t > + 
+ < / O n e O f f i x x D o c u m e n t P a r t > 
+</file>
+
+<file path=customXml/item6.xml><?xml version="1.0" encoding="utf-8"?>
+<OneOffixxFormattingPart xmlns:xsd="http://www.w3.org/2001/XMLSchema" xmlns:xsi="http://www.w3.org/2001/XMLSchema-instance" xmlns="http://schema.oneoffixx.com/OneOffixxFormattingPart/1">
+  <Configuration>
+    <DocumentFunction xmlns="">
+      <!-- #################################################################### -->
+      <!-- ## Unterschiede zum Root:                                         ## -->
+      <!-- ## maxListLevels auf 6 gesetzt                                    ## -->
+      <!-- ## CustomStyles: Category «EingerueckteAufzaehlungen» hintzgefügt ## -->
+      <!-- #################################################################### -->
+      <!-- Parametrierung der Überschriften -->
+      <Group name="Headings">
+        <Definition type="Heading" level="1" style="Überschrift 1"/>
+        <Definition type="Heading" level="2" style="Überschrift 2"/>
+        <Definition type="Heading" level="3" style="Überschrift 3"/>
+        <Definition type="Heading" level="4" style="Überschrift 4"/>
+      </Group>
+      <!-- Parametrierung der Tabulatoren -->
+      <Group name="Indents" maxListLevels="6"/>
+      <!-- Parametrierung der Listen, Aufzählungen und Nummerierungen -->
+      <Group name="NumberingStyles">
+        <Definition type="Numeric" tabPosition="1" style="Liste_Nummern_Arabisch"/>
+        <Definition type="Alphabetic" tabPosition="1" style="Liste_Nummern_Roemisch"/>
+        <Definition type="Line" tabPosition="1" style="Liste_Bindestrich"/>
+      </Group>
+      <!-- Parametrierung der Nummerierungs-Optionen -->
+      <Group name="NumberingBehaviors">
+        <Definition type="Increment" style="Liste_Nummern_Arabisch"/>
+        <Definition type="Decrement"/>
+        <!--<Definition type="RestartMain"/>
+          <Definition type="RestartSub"/>-->
+        <Definition type="ResetChapter" style="Überschrift 1"/>
+        <Definition type="ResetList" style="Liste_Nummern_Arabisch"/>
+      </Group>
+      <!-- Parametrierung der weiteren Formatierungs-Optionen -->
+      <Group name="Styles">
+        <Definition type="Standard" style="Grundtext"/>
+        <Definition type="Bold" style="Fett"/>
+        <Definition type="Italic" style=""/>
+        <Definition type="Underline" style=""/>
+      </Group>
+      <!-- Parametrierung der weiteren kundenspezifischen Formatierungs-Optionen -->
+      <Group name="CustomStyles">
+        <Category id="Formatierungen">
+          <Label lcid="2055">Formatierungen</Label>
+          <Definition type="Randtitel" style="Randtitel mit Textbox">
+            <Label lcid="2055">Randtitel</Label>
+          </Definition>
+          <Definition type="Lead" style="Lead">
+            <Label lcid="2055">Lead</Label>
+          </Definition>
+        </Category>
+        <Category id="Überschriften">
+          <Label lcid="2055">Überschriften</Label>
+          <Definition type="Heading" level="1" style="Überschrift 1 Gross">
+            <Label lcid="2055">Überschrift 1 Gross</Label>
+          </Definition>
+        </Category>
+        <Category id="Tabelle">
+          <Label lcid="2055">Tabelle</Label>
+          <Definition type="Table" style="Tabelle Standard linksbündig">
+            <Label lcid="2055">Tabelle Standard linksbündig</Label>
+          </Definition>
+          <Definition type="Table" style="Tabelle Standard rechtsbündig">
+            <Label lcid="2055">Tabelle Standard rechtsbündig</Label>
+          </Definition>
+          <Definition type="Table" style="Tabelle klein linksbündig">
+            <Label lcid="2055">Tabelle klein linksbündig</Label>
+          </Definition>
+          <Definition type="Table" style="Tabelle klein rechtsbündig">
+            <Label lcid="2055">Tabelle klein rechtsbündig</Label>
+          </Definition>
+          <Definition type="Table" style="Tabelle fett">
+            <Label lcid="2055">Tabelle fett</Label>
+          </Definition>
+        </Category>
+        <Category id="Inline-Bild">
+          <Label lcid="2055">Bild in Zeile anzeigen</Label>
+          <Definition type="Image" style="Grundtext_neutral">
+            <Label lcid="2055">Grundtext neutral</Label>
+          </Definition>
+        </Category>
+        <Category id="EingerueckteAufzaehlungen">
+          <Label lcid="2055">Eingerückte Aufzählungen für nummerierte Überschriften</Label>
+          <Definition type="Liste_Bindestrich_Ebene_4" style="Liste_Bindestrich_Ebene_4">
+            <Label lcid="2055">Bindestrich-Liste eingerückt</Label>
+          </Definition>
+          <Definition type="Liste_Nummern_Arabisch_Ebene_4" style="Liste_Nummern_Arabisch_Ebene_4">
+            <Label lcid="2055">arabische Nummerierung eingerückt</Label>
+          </Definition>
+          <Definition type="Liste_Nummern_Roemisch_Ebene_4" style="Liste_Nummern_Roemisch_Ebene_4">
+            <Label lcid="2055">römische Nummerierung eingerückt</Label>
+          </Definition>
+        </Category>
+      </Group>
+    </DocumentFunction>
+  </Configuration>
+</OneOffixxFormattingPart>
+</file>
+
+<file path=customXml/item7.xml><?xml version="1.0" encoding="utf-8"?>
+<OneOffixxImageDefinitionPart xmlns:xsd="http://www.w3.org/2001/XMLSchema" xmlns:xsi="http://www.w3.org/2001/XMLSchema-instance" xmlns="http://schema.oneoffixx.com/OneOffixxImageDefinitionPart/1">
+  <ImageDefinitions>
+    <ImageSizeDefinition>
+      <Id>2032969613</Id>
+      <Width>0</Width>
+      <Height>0</Height>
+      <XPath>//Image[@id='Profile.Org.HeaderLogoShort']</XPath>
+      <ImageHash>7fe544e2f398d2732a9ea51d50e24d16</ImageHash>
+    </ImageSizeDefinition>
+    <ImageSizeDefinition>
+      <Id>155732410</Id>
+      <Width>0</Width>
+      <Height>0</Height>
+      <XPath>//Image[@id='Profile.Org.Kanton']</XPath>
+      <ImageHash>1a0b7be4d8c69e4fe4dabdfa77453b38</ImageHash>
+    </ImageSizeDefinition>
+    <ImageSizeDefinition>
+      <Id>2120064574</Id>
+      <Width>0</Width>
+      <Height>0</Height>
+      <XPath>//Image[@id='Profile.Org.Kanton']</XPath>
+      <ImageHash>1a0b7be4d8c69e4fe4dabdfa77453b38</ImageHash>
+    </ImageSizeDefinition>
+    <ImageSizeDefinition>
+      <Id>1768692683</Id>
+      <Width>0</Width>
+      <Height>0</Height>
+      <XPath>//Image[@id='Profile.Org.HeaderLogoShort']</XPath>
+      <ImageHash>7fe544e2f398d2732a9ea51d50e24d16</ImageHash>
+    </ImageSizeDefinition>
+    <ImageSizeDefinition>
+      <Id>1768692683</Id>
+      <Width>0</Width>
+      <Height>0</Height>
+      <XPath>//Image[@id='Profile.Org.Kanton']</XPath>
+      <ImageHash>1a0b7be4d8c69e4fe4dabdfa77453b38</ImageHash>
+    </ImageSizeDefinition>
+    <ImageSizeDefinition>
+      <Id>391736964</Id>
+      <Width>0</Width>
+      <Height>0</Height>
+      <XPath>//Image[@id='Profile.Org.HeaderLogoShort']</XPath>
+      <ImageHash>7fe544e2f398d2732a9ea51d50e24d16</ImageHash>
+    </ImageSizeDefinition>
+  </ImageDefinitions>
+</OneOffixxImageDefinitionPart>
+</file>
+
+<file path=customXml/item8.xml><?xml version="1.0" encoding="utf-8"?>
+<b:Sources xmlns:b="http://schemas.openxmlformats.org/officeDocument/2006/bibliography" xmlns="http://schemas.openxmlformats.org/officeDocument/2006/bibliography" SelectedStyle="\APASixthEditionOfficeOnline.xsl" StyleName="APA" Version="6"/>
+</file>
+
 <file path=customXml/itemProps1.xml><?xml version="1.0" encoding="utf-8"?>
 <ds:datastoreItem xmlns:ds="http://schemas.openxmlformats.org/officeDocument/2006/customXml" ds:itemID="{06006623-EC36-4A07-B7A3-84663659079E}">
   <ds:schemaRefs>
@@ -17232,16 +17187,6 @@
 </file>
 
 <file path=customXml/itemProps2.xml><?xml version="1.0" encoding="utf-8"?>
-<ds:datastoreItem xmlns:ds="http://schemas.openxmlformats.org/officeDocument/2006/customXml" ds:itemID="{42C11AB0-332C-41C5-8D5A-0990D874DC64}">
-  <ds:schemaRefs>
-    <ds:schemaRef ds:uri="http://www.w3.org/2001/XMLSchema"/>
-    <ds:schemaRef ds:uri="http://schema.oneoffixx.com/OneOffixxDocumentPart/1"/>
-    <ds:schemaRef ds:uri="http://schema.oneoffixx.com/OneOffixxDocumentPart/1/Finalized"/>
-  </ds:schemaRefs>
-</ds:datastoreItem>
-</file>
-
-<file path=customXml/itemProps3.xml><?xml version="1.0" encoding="utf-8"?>
 <ds:datastoreItem xmlns:ds="http://schemas.openxmlformats.org/officeDocument/2006/customXml" ds:itemID="{9C57DEF7-7FBA-4328-8089-D42F8DF79974}">
   <ds:schemaRefs>
     <ds:schemaRef ds:uri="http://www.w3.org/2001/XMLSchema"/>
@@ -17267,51 +17212,7 @@
 </ds:datastoreItem>
 </file>
 
-<file path=customXml/itemProps4.xml><?xml version="1.0" encoding="utf-8"?>
-<ds:datastoreItem xmlns:ds="http://schemas.openxmlformats.org/officeDocument/2006/customXml" ds:itemID="{375FF36D-C3DE-4BD7-ABAE-B7AAFA960D11}">
-  <ds:schemaRefs>
-    <ds:schemaRef ds:uri="http://schemas.microsoft.com/office/infopath/2007/PartnerControls"/>
-    <ds:schemaRef ds:uri="98fe2ab8-7d83-4567-ba90-4f594ae3f4fd"/>
-    <ds:schemaRef ds:uri="http://purl.org/dc/elements/1.1/"/>
-    <ds:schemaRef ds:uri="http://schemas.microsoft.com/office/2006/metadata/properties"/>
-    <ds:schemaRef ds:uri="09640fe3-f50f-46c8-a6f7-a2176bb49e6a"/>
-    <ds:schemaRef ds:uri="http://purl.org/dc/terms/"/>
-    <ds:schemaRef ds:uri="http://schemas.microsoft.com/office/2006/documentManagement/types"/>
-    <ds:schemaRef ds:uri="http://purl.org/dc/dcmitype/"/>
-    <ds:schemaRef ds:uri="http://schemas.openxmlformats.org/package/2006/metadata/core-properties"/>
-    <ds:schemaRef ds:uri="http://www.w3.org/XML/1998/namespace"/>
-  </ds:schemaRefs>
-</ds:datastoreItem>
-</file>
-
-<file path=customXml/itemProps5.xml><?xml version="1.0" encoding="utf-8"?>
-<ds:datastoreItem xmlns:ds="http://schemas.openxmlformats.org/officeDocument/2006/customXml" ds:itemID="{6472253F-DBC3-4BE9-A569-6147ABA9731F}">
-  <ds:schemaRefs>
-    <ds:schemaRef ds:uri="http://www.w3.org/2001/XMLSchema"/>
-    <ds:schemaRef ds:uri="http://schema.oneoffixx.com/OneOffixxFormattingPart/1"/>
-    <ds:schemaRef ds:uri=""/>
-  </ds:schemaRefs>
-</ds:datastoreItem>
-</file>
-
-<file path=customXml/itemProps6.xml><?xml version="1.0" encoding="utf-8"?>
-<ds:datastoreItem xmlns:ds="http://schemas.openxmlformats.org/officeDocument/2006/customXml" ds:itemID="{95A6AB3B-C3C0-4762-8306-673E58FA0841}">
-  <ds:schemaRefs>
-    <ds:schemaRef ds:uri="http://schemas.openxmlformats.org/officeDocument/2006/bibliography"/>
-  </ds:schemaRefs>
-</ds:datastoreItem>
-</file>
-
-<file path=customXml/itemProps7.xml><?xml version="1.0" encoding="utf-8"?>
-<ds:datastoreItem xmlns:ds="http://schemas.openxmlformats.org/officeDocument/2006/customXml" ds:itemID="{8738D2AD-ECE0-42FB-A7D1-83DF8C10BAB6}">
-  <ds:schemaRefs>
-    <ds:schemaRef ds:uri="http://www.w3.org/2001/XMLSchema"/>
-    <ds:schemaRef ds:uri="http://schema.oneoffixx.com/OneOffixxImageDefinitionPart/1"/>
-  </ds:schemaRefs>
-</ds:datastoreItem>
-</file>
-
-<file path=customXml/itemProps8.xml><?xml version="1.0" encoding="utf-8"?>
+<file path=customXml/itemProps3.xml><?xml version="1.0" encoding="utf-8"?>
 <ds:datastoreItem xmlns:ds="http://schemas.openxmlformats.org/officeDocument/2006/customXml" ds:itemID="{D1BFB643-A37E-4B8C-A253-1DB7CEF94DE6}">
   <ds:schemaRefs>
     <ds:schemaRef ds:uri="http://schemas.microsoft.com/office/2006/metadata/contentType"/>
@@ -17330,6 +17231,54 @@
 </ds:datastoreItem>
 </file>
 
+<file path=customXml/itemProps4.xml><?xml version="1.0" encoding="utf-8"?>
+<ds:datastoreItem xmlns:ds="http://schemas.openxmlformats.org/officeDocument/2006/customXml" ds:itemID="{375FF36D-C3DE-4BD7-ABAE-B7AAFA960D11}">
+  <ds:schemaRefs>
+    <ds:schemaRef ds:uri="http://schemas.microsoft.com/office/2006/metadata/properties"/>
+    <ds:schemaRef ds:uri="http://schemas.microsoft.com/office/infopath/2007/PartnerControls"/>
+    <ds:schemaRef ds:uri="09640fe3-f50f-46c8-a6f7-a2176bb49e6a"/>
+    <ds:schemaRef ds:uri="98fe2ab8-7d83-4567-ba90-4f594ae3f4fd"/>
+  </ds:schemaRefs>
+</ds:datastoreItem>
+</file>
+
+<file path=customXml/itemProps5.xml><?xml version="1.0" encoding="utf-8"?>
+<ds:datastoreItem xmlns:ds="http://schemas.openxmlformats.org/officeDocument/2006/customXml" ds:itemID="{42C11AB0-332C-41C5-8D5A-0990D874DC64}">
+  <ds:schemaRefs>
+    <ds:schemaRef ds:uri="http://www.w3.org/2001/XMLSchema"/>
+    <ds:schemaRef ds:uri="http://schema.oneoffixx.com/OneOffixxDocumentPart/1"/>
+    <ds:schemaRef ds:uri="http://schema.oneoffixx.com/OneOffixxDocumentPart/1/Finalized"/>
+  </ds:schemaRefs>
+</ds:datastoreItem>
+</file>
+
+<file path=customXml/itemProps6.xml><?xml version="1.0" encoding="utf-8"?>
+<ds:datastoreItem xmlns:ds="http://schemas.openxmlformats.org/officeDocument/2006/customXml" ds:itemID="{6472253F-DBC3-4BE9-A569-6147ABA9731F}">
+  <ds:schemaRefs>
+    <ds:schemaRef ds:uri="http://www.w3.org/2001/XMLSchema"/>
+    <ds:schemaRef ds:uri="http://schema.oneoffixx.com/OneOffixxFormattingPart/1"/>
+    <ds:schemaRef ds:uri=""/>
+  </ds:schemaRefs>
+</ds:datastoreItem>
+</file>
+
+<file path=customXml/itemProps7.xml><?xml version="1.0" encoding="utf-8"?>
+<ds:datastoreItem xmlns:ds="http://schemas.openxmlformats.org/officeDocument/2006/customXml" ds:itemID="{8738D2AD-ECE0-42FB-A7D1-83DF8C10BAB6}">
+  <ds:schemaRefs>
+    <ds:schemaRef ds:uri="http://www.w3.org/2001/XMLSchema"/>
+    <ds:schemaRef ds:uri="http://schema.oneoffixx.com/OneOffixxImageDefinitionPart/1"/>
+  </ds:schemaRefs>
+</ds:datastoreItem>
+</file>
+
+<file path=customXml/itemProps8.xml><?xml version="1.0" encoding="utf-8"?>
+<ds:datastoreItem xmlns:ds="http://schemas.openxmlformats.org/officeDocument/2006/customXml" ds:itemID="{95A6AB3B-C3C0-4762-8306-673E58FA0841}">
+  <ds:schemaRefs>
+    <ds:schemaRef ds:uri="http://schemas.openxmlformats.org/officeDocument/2006/bibliography"/>
+  </ds:schemaRefs>
+</ds:datastoreItem>
+</file>
+
 <file path=docMetadata/LabelInfo.xml><?xml version="1.0" encoding="utf-8"?>
 <clbl:labelList xmlns:clbl="http://schemas.microsoft.com/office/2020/mipLabelMetadata">
   <clbl:label id="{a020d0ae-094a-4d44-b66c-ac3fe8e90c58}" enabled="0" method="" siteId="{a020d0ae-094a-4d44-b66c-ac3fe8e90c58}" removed="1"/>

</xml_diff>